<commit_message>
R2 deposit consistency: cite Zenodo concept DOI (10.5281/zenodo.19569978); main figures; final numbers
Co-Authored-By: Claude Opus 4.8 (1M context) <noreply@anthropic.com>
</commit_message>
<xml_diff>
--- a/05-manuscript/submission/manuscript_R2.docx
+++ b/05-manuscript/submission/manuscript_R2.docx
@@ -408,7 +408,7 @@
           <w:rPr>
             <w:rStyle w:val="Hyperlink"/>
           </w:rPr>
-          <w:t xml:space="preserve">10.5281/zenodo.19569979</w:t>
+          <w:t xml:space="preserve">10.5281/zenodo.19569978</w:t>
         </w:r>
       </w:hyperlink>
       <w:r>
@@ -1159,7 +1159,7 @@
         <w:t xml:space="preserve"> </w:t>
       </w:r>
       <w:r>
-        <w:t xml:space="preserve">check) and demote under-identified causal and welfare analyses to the appendix, reported as failed or assumption-dependent rather than as findings. Instrument, gold-standard codings, and analysis code are pre-registered (OSF DOI 10.17605/OSF.IO/ZMJY5) and archived (Zenodo DOI 10.5281/zenodo.19569979), following open-science reporting norms [9, 10].</w:t>
+        <w:t xml:space="preserve">check) and demote under-identified causal and welfare analyses to the appendix, reported as failed or assumption-dependent rather than as findings. Instrument, gold-standard codings, and analysis code are pre-registered (OSF DOI 10.17605/OSF.IO/ZMJY5) and archived (Zenodo DOI 10.5281/zenodo.19569978), following open-science reporting norms [9, 10].</w:t>
       </w:r>
     </w:p>
     <w:bookmarkEnd w:id="13"/>
@@ -4360,7 +4360,7 @@
         <w:t xml:space="preserve">master_2002_2024.csv</w:t>
       </w:r>
       <w:r>
-        <w:t xml:space="preserve">, holding both the naive and concrete text series alongside CIR and the turnover variables) and all code are archived at Zenodo (DOI 10.5281/zenodo.19569979) and pre-registered at OSF (DOI 10.17605/OSF.IO/ZMJY5).</w:t>
+        <w:t xml:space="preserve">, holding both the naive and concrete text series alongside CIR and the turnover variables) and all code are archived at Zenodo (DOI 10.5281/zenodo.19569978) and pre-registered at OSF (DOI 10.17605/OSF.IO/ZMJY5).</w:t>
       </w:r>
     </w:p>
     <w:bookmarkEnd w:id="30"/>
@@ -6140,7 +6140,7 @@
         <w:pStyle w:val="BodyText"/>
       </w:pPr>
       <w:r>
-        <w:t xml:space="preserve">Pre-registration: OSF DOI 10.17605/OSF.IO/ZMJY5. Replication archive: Zenodo DOI 10.5281/zenodo.19569979; GitHub: andyhsi2023-cq/visibility-bias-v2.</w:t>
+        <w:t xml:space="preserve">Pre-registration: OSF DOI 10.17605/OSF.IO/ZMJY5. Replication archive: Zenodo DOI 10.5281/zenodo.19569978; GitHub: andyhsi2023-cq/visibility-bias-v2.</w:t>
       </w:r>
     </w:p>
     <w:p>
@@ -6239,7 +6239,7 @@
           <w:rPr>
             <w:rStyle w:val="Hyperlink"/>
           </w:rPr>
-          <w:t xml:space="preserve">10.5281/zenodo.19569979</w:t>
+          <w:t xml:space="preserve">10.5281/zenodo.19569978</w:t>
         </w:r>
       </w:hyperlink>
       <w:r>
@@ -8092,7 +8092,7 @@
         <w:t xml:space="preserve">Replication</w:t>
       </w:r>
       <w:r>
-        <w:t xml:space="preserve">: Zenodo DOI 10.5281/zenodo.19569979</w:t>
+        <w:t xml:space="preserve">: Zenodo DOI 10.5281/zenodo.19569978</w:t>
       </w:r>
     </w:p>
     <w:p>
@@ -13090,7 +13090,7 @@
         <w:pStyle w:val="FirstParagraph"/>
       </w:pPr>
       <w:r>
-        <w:t xml:space="preserve">Full directory layout (Zenodo record 19569979):</w:t>
+        <w:t xml:space="preserve">Full directory layout (Zenodo record 19569978):</w:t>
       </w:r>
     </w:p>
     <w:p>

</xml_diff>

<commit_message>
Remove unverifiable Wu & Zhou (2018) cite (traced to a code comment); re-anchor lexicon to MOHURD categories. Zenodo v2 published open + GitHub live.
Co-Authored-By: Claude Opus 4.8 (1M context) <noreply@anthropic.com>
</commit_message>
<xml_diff>
--- a/05-manuscript/submission/manuscript_R2.docx
+++ b/05-manuscript/submission/manuscript_R2.docx
@@ -196,7 +196,7 @@
         <w:t xml:space="preserve">“face”</w:t>
       </w:r>
       <w:r>
-        <w:t xml:space="preserve">) fire pervasively outside infrastructure contexts. Restricting the lexicon to concrete visible-construction terms (roads, greening, parks, bridges vs. drainage, pipes, sewerage), aligned with the Wu–Zhou (2018) cosmetic-investment classification, raises visible precision to</w:t>
+        <w:t xml:space="preserve">) fire pervasively outside infrastructure contexts. Restricting the lexicon to concrete visible-construction terms (roads, greening, parks, bridges vs. drainage, pipes, sewerage), mirroring the cosmetic-versus-functional split of the MOHURD construction-investment categories, raises visible precision to</w:t>
       </w:r>
       <w:r>
         <w:t xml:space="preserve"> </w:t>
@@ -2883,7 +2883,7 @@
         <w:t xml:space="preserve"> </w:t>
       </w:r>
       <w:r>
-        <w:t xml:space="preserve">rather than abstract appearance words — aligned with the Wu &amp; Zhou (2018) cosmetic-investment classification. The concrete visible set comprises</w:t>
+        <w:t xml:space="preserve">rather than abstract appearance words — mirroring the cosmetic-versus-functional split of the MOHURD Urban Construction Statistical Yearbook investment categories (§3.7). The concrete visible set comprises</w:t>
       </w:r>
       <w:r>
         <w:t xml:space="preserve"> </w:t>
@@ -3930,7 +3930,7 @@
         <w:pStyle w:val="FirstParagraph"/>
       </w:pPr>
       <w:r>
-        <w:t xml:space="preserve">Where the ceiling binds, classification — not a longer dictionary — is the route to high precision; recent work finds LLMs increasingly match or surpass human and crowd annotation of political text [5, 21, 22]. We classify each sampled sentence with</w:t>
+        <w:t xml:space="preserve">Where the ceiling binds, classification — not a longer dictionary — is the route to high precision; recent work finds LLMs increasingly match or surpass human and crowd annotation of political text [5, 20, 21]. We classify each sampled sentence with</w:t>
       </w:r>
       <w:r>
         <w:t xml:space="preserve"> </w:t>
@@ -5866,7 +5866,7 @@
         <w:t xml:space="preserve"> </w:t>
       </w:r>
       <w:r>
-        <w:t xml:space="preserve">When high passage precision is required, a multi-family LLM ensemble is the practical route (0.84 here) — consistent with a fast-growing literature showing LLMs match or surpass human and crowd annotation of political text [5, 21, 22] — and inter-model agreement (Fleiss κ) is the natural reliability statistic to report alongside accuracy. The transparency cost is real, so the choice is a genuine trade-off: dictionaries for transparent, reproducible aggregate indices with attenuating error; LLM ensembles for precision-critical passage-level work.</w:t>
+        <w:t xml:space="preserve">When high passage precision is required, a multi-family LLM ensemble is the practical route (0.84 here) — consistent with a fast-growing literature showing LLMs match or surpass human and crowd annotation of political text [5, 20, 21] — and inter-model agreement (Fleiss κ) is the natural reliability statistic to report alongside accuracy. The transparency cost is real, so the choice is a genuine trade-off: dictionaries for transparent, reproducible aggregate indices with attenuating error; LLM ensembles for precision-critical passage-level work.</w:t>
       </w:r>
     </w:p>
     <w:bookmarkEnd w:id="39"/>
@@ -13854,51 +13854,6 @@
       </w:r>
       <w:r>
         <w:t xml:space="preserve"> </w:t>
-      </w:r>
-    </w:p>
-    <w:p>
-      <w:pPr>
-        <w:numPr>
-          <w:ilvl w:val="0"/>
-          <w:numId w:val="1010"/>
-        </w:numPr>
-      </w:pPr>
-      <w:r>
-        <w:t xml:space="preserve">Wu, [—], &amp; Zhou, [—]. (2018). [</w:t>
-      </w:r>
-      <w:r>
-        <w:rPr>
-          <w:b/>
-          <w:bCs/>
-        </w:rPr>
-        <w:t xml:space="preserve">ANDY TO SUPPLY</w:t>
-      </w:r>
-      <w:r>
-        <w:t xml:space="preserve"> </w:t>
-      </w:r>
-      <w:r>
-        <w:t xml:space="preserve">— the cosmetic-vs-functional urban-construction investment classification to which the concrete lexicon is aligned (</w:t>
-      </w:r>
-      <w:r>
-        <w:rPr>
-          <w:rFonts w:hint="eastAsia"/>
-        </w:rPr>
-        <w:t xml:space="preserve">“吴周2018投资分类”</w:t>
-      </w:r>
-      <w:r>
-        <w:t xml:space="preserve">, per</w:t>
-      </w:r>
-      <w:r>
-        <w:t xml:space="preserve"> </w:t>
-      </w:r>
-      <w:r>
-        <w:rPr>
-          <w:rStyle w:val="VerbatimChar"/>
-        </w:rPr>
-        <w:t xml:space="preserve">build_workreport_text.py</w:t>
-      </w:r>
-      <w:r>
-        <w:t xml:space="preserve">); cited in the abstract and §3.2.2. Full author initials, title, venue, vol/issue/pages, DOI required before submission. Not found in CrossRef — likely a Chinese-language (CNKI) source.]</w:t>
       </w:r>
     </w:p>
     <w:p>

</xml_diff>

<commit_message>
Scrub last Wu-Zhou traces (intro, Table 1, build-script comment) -> MOHURD anchor
Co-Authored-By: Claude Opus 4.8 (1M context) <noreply@anthropic.com>
</commit_message>
<xml_diff>
--- a/05-manuscript/submission/manuscript_R2.docx
+++ b/05-manuscript/submission/manuscript_R2.docx
@@ -703,7 +703,7 @@
         <w:t xml:space="preserve"> </w:t>
       </w:r>
       <w:r>
-        <w:t xml:space="preserve">Restricting the lexicon to concrete, salience-based construction terms aligned with an established cosmetic-investment classification [Wu &amp; Zhou 2018] raises visible precision to</w:t>
+        <w:t xml:space="preserve">Restricting the lexicon to concrete, salience-based construction terms (mirroring the cosmetic-versus-functional split of the MOHURD construction-investment categories) raises visible precision to</w:t>
       </w:r>
       <w:r>
         <w:t xml:space="preserve"> </w:t>
@@ -3519,7 +3519,7 @@
               <w:pStyle w:val="Compact"/>
             </w:pPr>
             <w:r>
-              <w:t xml:space="preserve">Concrete, salience-based (Wu–Zhou-aligned)</w:t>
+              <w:t xml:space="preserve">Concrete, salience-based (MOHURD-aligned)</w:t>
             </w:r>
           </w:p>
         </w:tc>

</xml_diff>

<commit_message>
R2 framing: retitle to Visibility-Bias-led, China-scoped; re-center intro; scope-soften lessons; pinyin+gloss for data terms (keep characters); drop gratuitous CJK; fix two stale limitations (intercoder done, procurement amounts). CJK gate + memory added.
Co-Authored-By: Claude Opus 4.8 (1M context) <noreply@anthropic.com>
</commit_message>
<xml_diff>
--- a/05-manuscript/submission/manuscript_R2.docx
+++ b/05-manuscript/submission/manuscript_R2.docx
@@ -2,13 +2,13 @@
 <file path=word/document.xml><?xml version="1.0" encoding="utf-8"?>
 <w:document xmlns:w="http://schemas.openxmlformats.org/wordprocessingml/2006/main" xmlns:m="http://schemas.openxmlformats.org/officeDocument/2006/math" xmlns:r="http://schemas.openxmlformats.org/officeDocument/2006/relationships" xmlns:o="urn:schemas-microsoft-com:office:office" xmlns:v="urn:schemas-microsoft-com:vml" xmlns:w10="urn:schemas-microsoft-com:office:word" xmlns:a="http://schemas.openxmlformats.org/drawingml/2006/main" xmlns:pic="http://schemas.openxmlformats.org/drawingml/2006/picture" xmlns:wp="http://schemas.openxmlformats.org/drawingml/2006/wordprocessingDrawing">
   <w:body>
-    <w:bookmarkStart w:id="9" w:name="X5eca605e51c602f90ee6745fe8621c9a58ae06a"/>
+    <w:bookmarkStart w:id="9" w:name="X278b2ba1d5de8fd4b843e2c7074c24353acc674"/>
     <w:p>
       <w:pPr>
         <w:pStyle w:val="Heading1"/>
       </w:pPr>
       <w:r>
-        <w:t xml:space="preserve">When Dictionaries Hit a Polysemy Ceiling: Validating a Measure of Visibility Bias with LLMs and Behavioral Evidence</w:t>
+        <w:t xml:space="preserve">Visibility Bias in Chinese Municipal Government Work Reports: Measurement and Behavioral Validation</w:t>
       </w:r>
     </w:p>
     <w:p>
@@ -20,45 +20,7 @@
           <w:i/>
           <w:iCs/>
         </w:rPr>
-        <w:t xml:space="preserve">Hongyang Xi </w:t>
-      </w:r>
-      <w:r>
-        <w:rPr>
-          <w:rFonts w:hint="eastAsia"/>
-          <w:i/>
-          <w:iCs/>
-        </w:rPr>
-        <w:t xml:space="preserve">(奚红洋)¹†*</w:t>
-      </w:r>
-      <w:r>
-        <w:rPr>
-          <w:i/>
-          <w:iCs/>
-        </w:rPr>
-        <w:t xml:space="preserve"> · Liu Can </w:t>
-      </w:r>
-      <w:r>
-        <w:rPr>
-          <w:rFonts w:hint="eastAsia"/>
-          <w:i/>
-          <w:iCs/>
-        </w:rPr>
-        <w:t xml:space="preserve">(刘灿)²†</w:t>
-      </w:r>
-      <w:r>
-        <w:rPr>
-          <w:i/>
-          <w:iCs/>
-        </w:rPr>
-        <w:t xml:space="preserve"> · Zhihui Li </w:t>
-      </w:r>
-      <w:r>
-        <w:rPr>
-          <w:rFonts w:hint="eastAsia"/>
-          <w:i/>
-          <w:iCs/>
-        </w:rPr>
-        <w:t xml:space="preserve">(李志辉)¹</w:t>
+        <w:t xml:space="preserve">Hongyang Xi¹†* · Liu Can²† · Zhihui Li¹</w:t>
       </w:r>
       <w:r>
         <w:t xml:space="preserve"> </w:t>
@@ -148,19 +110,51 @@
         <w:rPr>
           <w:rFonts w:hint="eastAsia"/>
         </w:rPr>
-        <w:t xml:space="preserve">形象,</w:t>
-      </w:r>
-      <w:r>
-        <w:t xml:space="preserve"> </w:t>
+        <w:t xml:space="preserve">形象</w:t>
+      </w:r>
+      <w:r>
+        <w:t xml:space="preserve"> </w:t>
+      </w:r>
+      <w:r>
+        <w:rPr>
+          <w:i/>
+          <w:iCs/>
+        </w:rPr>
+        <w:t xml:space="preserve">xíngxiàng</w:t>
+      </w:r>
+      <w:r>
+        <w:t xml:space="preserve"> </w:t>
+      </w:r>
+      <w:r>
+        <w:t xml:space="preserve">“image”</w:t>
+      </w:r>
+      <w:r>
+        <w:t xml:space="preserve">, </w:t>
       </w:r>
       <w:r>
         <w:rPr>
           <w:rFonts w:hint="eastAsia"/>
         </w:rPr>
-        <w:t xml:space="preserve">示范,</w:t>
-      </w:r>
-      <w:r>
-        <w:t xml:space="preserve"> </w:t>
+        <w:t xml:space="preserve">示范</w:t>
+      </w:r>
+      <w:r>
+        <w:t xml:space="preserve"> </w:t>
+      </w:r>
+      <w:r>
+        <w:rPr>
+          <w:i/>
+          <w:iCs/>
+        </w:rPr>
+        <w:t xml:space="preserve">shìfàn</w:t>
+      </w:r>
+      <w:r>
+        <w:t xml:space="preserve"> </w:t>
+      </w:r>
+      <w:r>
+        <w:t xml:space="preserve">“model/demonstration”</w:t>
+      </w:r>
+      <w:r>
+        <w:t xml:space="preserve">, </w:t>
       </w:r>
       <w:r>
         <w:rPr>
@@ -169,25 +163,14 @@
         <w:t xml:space="preserve">面子</w:t>
       </w:r>
       <w:r>
-        <w:t xml:space="preserve"> —</w:t>
-      </w:r>
-      <w:r>
-        <w:t xml:space="preserve"> </w:t>
-      </w:r>
-      <w:r>
-        <w:t xml:space="preserve">“image”</w:t>
-      </w:r>
-      <w:r>
-        <w:t xml:space="preserve">,</w:t>
-      </w:r>
-      <w:r>
-        <w:t xml:space="preserve"> </w:t>
-      </w:r>
-      <w:r>
-        <w:t xml:space="preserve">“model/demonstration”</w:t>
-      </w:r>
-      <w:r>
-        <w:t xml:space="preserve">,</w:t>
+        <w:t xml:space="preserve"> </w:t>
+      </w:r>
+      <w:r>
+        <w:rPr>
+          <w:i/>
+          <w:iCs/>
+        </w:rPr>
+        <w:t xml:space="preserve">miànzi</w:t>
       </w:r>
       <w:r>
         <w:t xml:space="preserve"> </w:t>
@@ -234,16 +217,38 @@
         <w:t xml:space="preserve">(道路</w:t>
       </w:r>
       <w:r>
-        <w:t xml:space="preserve"> in</w:t>
-      </w:r>
-      <w:r>
-        <w:t xml:space="preserve"> </w:t>
+        <w:t xml:space="preserve"> </w:t>
+      </w:r>
+      <w:r>
+        <w:rPr>
+          <w:i/>
+          <w:iCs/>
+        </w:rPr>
+        <w:t xml:space="preserve">dàolù</w:t>
+      </w:r>
+      <w:r>
+        <w:t xml:space="preserve"> </w:t>
+      </w:r>
+      <w:r>
+        <w:t xml:space="preserve">“road”</w:t>
+      </w:r>
+      <w:r>
+        <w:t xml:space="preserve"> </w:t>
+      </w:r>
+      <w:r>
+        <w:t xml:space="preserve">in </w:t>
       </w:r>
       <w:r>
         <w:rPr>
           <w:rFonts w:hint="eastAsia"/>
         </w:rPr>
-        <w:t xml:space="preserve">“新型工业化道路”</w:t>
+        <w:t xml:space="preserve">新型工业化道路</w:t>
+      </w:r>
+      <w:r>
+        <w:t xml:space="preserve"> </w:t>
+      </w:r>
+      <w:r>
+        <w:t xml:space="preserve">“the path of new-type industrialization”</w:t>
       </w:r>
       <w:r>
         <w:t xml:space="preserve">; </w:t>
@@ -252,19 +257,41 @@
         <w:rPr>
           <w:rFonts w:hint="eastAsia"/>
         </w:rPr>
-        <w:t xml:space="preserve">轨道</w:t>
-      </w:r>
-      <w:r>
-        <w:t xml:space="preserve"> in</w:t>
-      </w:r>
-      <w:r>
-        <w:t xml:space="preserve"> </w:t>
+        <w:t xml:space="preserve">轨道交通</w:t>
+      </w:r>
+      <w:r>
+        <w:t xml:space="preserve"> </w:t>
+      </w:r>
+      <w:r>
+        <w:rPr>
+          <w:i/>
+          <w:iCs/>
+        </w:rPr>
+        <w:t xml:space="preserve">guǐdào jiāotōng</w:t>
+      </w:r>
+      <w:r>
+        <w:t xml:space="preserve"> </w:t>
+      </w:r>
+      <w:r>
+        <w:t xml:space="preserve">“rail transit”</w:t>
+      </w:r>
+      <w:r>
+        <w:t xml:space="preserve"> </w:t>
+      </w:r>
+      <w:r>
+        <w:t xml:space="preserve">in </w:t>
       </w:r>
       <w:r>
         <w:rPr>
           <w:rFonts w:hint="eastAsia"/>
         </w:rPr>
-        <w:t xml:space="preserve">“轨道交通产业”</w:t>
+        <w:t xml:space="preserve">轨道交通产业</w:t>
+      </w:r>
+      <w:r>
+        <w:t xml:space="preserve"> </w:t>
+      </w:r>
+      <w:r>
+        <w:t xml:space="preserve">“the rail-transit industry”</w:t>
       </w:r>
       <w:r>
         <w:t xml:space="preserve">) cannot be pruned without destroying recall. For high passage-level precision we therefore turn to</w:t>
@@ -430,7 +457,7 @@
         <w:pStyle w:val="FirstParagraph"/>
       </w:pPr>
       <w:r>
-        <w:t xml:space="preserve">Dictionary methods remain among the most widely used tools for measuring political attention from text. They are transparent, cheap, reproducible, and require no training data, which makes them attractive for measuring</w:t>
+        <w:t xml:space="preserve">Local officials have reason to favor infrastructure their evaluators can see. In China’s municipal governments, where careers turn on how superior authorities assess performance, that incentive tilts toward</w:t>
       </w:r>
       <w:r>
         <w:t xml:space="preserve"> </w:t>
@@ -440,13 +467,13 @@
           <w:i/>
           <w:iCs/>
         </w:rPr>
-        <w:t xml:space="preserve">what bureaucratic agents emphasize</w:t>
-      </w:r>
-      <w:r>
-        <w:t xml:space="preserve"> </w:t>
-      </w:r>
-      <w:r>
-        <w:t xml:space="preserve">in corpora of formal documents — legislative speeches, agency reports, municipal plans [1, 2, 3, 4, 8]. Yet the very transparency of a keyword dictionary can mask how weakly it is validated. In applied work a lexicon is often defended by face validity and an aggregate correlation with some external series, while the prior question —</w:t>
+        <w:t xml:space="preserve">visible</w:t>
+      </w:r>
+      <w:r>
+        <w:t xml:space="preserve"> </w:t>
+      </w:r>
+      <w:r>
+        <w:t xml:space="preserve">construction — streetscapes, greening, squares, landmarks, metro — over functionally important but</w:t>
       </w:r>
       <w:r>
         <w:t xml:space="preserve"> </w:t>
@@ -456,13 +483,26 @@
           <w:i/>
           <w:iCs/>
         </w:rPr>
-        <w:t xml:space="preserve">does the dictionary actually classify the right passages?</w:t>
-      </w:r>
-      <w:r>
-        <w:t xml:space="preserve"> </w:t>
-      </w:r>
-      <w:r>
-        <w:t xml:space="preserve">— is rarely answered with passage-level human coding [6, 7, 18]. This paper takes that question seriously for one concrete measurement problem and follows the answer wherever it leads. The result is less a triumphant new instrument than an honest map of what a dictionary can and cannot do here, what to use instead when it cannot, and — most importantly — how to know whether any of these measures is capturing the construct at all.</w:t>
+        <w:t xml:space="preserve">concealed</w:t>
+      </w:r>
+      <w:r>
+        <w:t xml:space="preserve"> </w:t>
+      </w:r>
+      <w:r>
+        <w:t xml:space="preserve">works such as drainage, pipe networks, and sewerage. We call this tilt</w:t>
+      </w:r>
+      <w:r>
+        <w:t xml:space="preserve"> </w:t>
+      </w:r>
+      <w:r>
+        <w:rPr>
+          <w:b/>
+          <w:bCs/>
+        </w:rPr>
+        <w:t xml:space="preserve">visibility bias</w:t>
+      </w:r>
+      <w:r>
+        <w:t xml:space="preserve">, and we ask, for one country’s local governance, whether it can be measured from official text and whether it is behaviorally real; our window is the annual municipal government work report (GWR).</w:t>
       </w:r>
     </w:p>
     <w:p>
@@ -470,23 +510,7 @@
         <w:pStyle w:val="BodyText"/>
       </w:pPr>
       <w:r>
-        <w:t xml:space="preserve">Our case is</w:t>
-      </w:r>
-      <w:r>
-        <w:t xml:space="preserve"> </w:t>
-      </w:r>
-      <w:r>
-        <w:rPr>
-          <w:b/>
-          <w:bCs/>
-        </w:rPr>
-        <w:t xml:space="preserve">visibility bias</w:t>
-      </w:r>
-      <w:r>
-        <w:t xml:space="preserve"> </w:t>
-      </w:r>
-      <w:r>
-        <w:t xml:space="preserve">in Chinese municipal government work reports (GWRs): the preferential emphasis on</w:t>
+        <w:t xml:space="preserve">Measuring such a bias from text is the hard part. Dictionary methods remain among the most widely used tools for measuring political attention from text. They are transparent, cheap, reproducible, and require no training data, which makes them attractive for measuring</w:t>
       </w:r>
       <w:r>
         <w:t xml:space="preserve"> </w:t>
@@ -496,19 +520,13 @@
           <w:i/>
           <w:iCs/>
         </w:rPr>
-        <w:t xml:space="preserve">observationally salient</w:t>
-      </w:r>
-      <w:r>
-        <w:t xml:space="preserve"> </w:t>
-      </w:r>
-      <w:r>
-        <w:t xml:space="preserve">(</w:t>
-      </w:r>
-      <w:r>
-        <w:t xml:space="preserve">“visible”</w:t>
-      </w:r>
-      <w:r>
-        <w:t xml:space="preserve">) urban infrastructure — streetscapes, greening, squares, landmarks — over functionally important but</w:t>
+        <w:t xml:space="preserve">what bureaucratic agents emphasize</w:t>
+      </w:r>
+      <w:r>
+        <w:t xml:space="preserve"> </w:t>
+      </w:r>
+      <w:r>
+        <w:t xml:space="preserve">in corpora of formal documents — legislative speeches, agency reports, municipal plans [1, 2, 3, 4, 8]. Yet the very transparency of a keyword dictionary can mask how weakly it is validated. In applied work a lexicon is often defended by face validity and an aggregate correlation with some external series, while the prior question —</w:t>
       </w:r>
       <w:r>
         <w:t xml:space="preserve"> </w:t>
@@ -518,54 +536,37 @@
           <w:i/>
           <w:iCs/>
         </w:rPr>
-        <w:t xml:space="preserve">concealed</w:t>
-      </w:r>
-      <w:r>
-        <w:t xml:space="preserve"> </w:t>
-      </w:r>
-      <w:r>
-        <w:t xml:space="preserve">infrastructure — drainage, pipe networks, sewerage, heating. The substantive interest is an old one in political economy: when a principal evaluates an agent on what the principal can observe, the agent over-invests in the observable. The measurement interest is sharper.</w:t>
-      </w:r>
-      <w:r>
-        <w:t xml:space="preserve"> </w:t>
-      </w:r>
-      <w:r>
-        <w:t xml:space="preserve">“Visible”</w:t>
-      </w:r>
-      <w:r>
-        <w:t xml:space="preserve"> </w:t>
-      </w:r>
-      <w:r>
-        <w:t xml:space="preserve">is not a surface-appearance category but an</w:t>
-      </w:r>
-      <w:r>
-        <w:t xml:space="preserve"> </w:t>
-      </w:r>
-      <w:r>
-        <w:rPr>
-          <w:b/>
-          <w:bCs/>
-        </w:rPr>
-        <w:t xml:space="preserve">observability/salience</w:t>
-      </w:r>
-      <w:r>
-        <w:t xml:space="preserve"> </w:t>
-      </w:r>
-      <w:r>
-        <w:t xml:space="preserve">category, defined relative to the audience that evaluates the official (superiors, inspectors, media, citizens). The instructive boundary case is</w:t>
-      </w:r>
-      <w:r>
-        <w:t xml:space="preserve"> </w:t>
-      </w:r>
-      <w:r>
-        <w:rPr>
-          <w:b/>
-          <w:bCs/>
-        </w:rPr>
-        <w:t xml:space="preserve">metro and rail transit</w:t>
-      </w:r>
-      <w:r>
-        <w:t xml:space="preserve">: physically underground, yet daily-used, media-celebrated, and a prestige achievement an evaluating superior cannot miss — hence maximally</w:t>
+        <w:t xml:space="preserve">does the dictionary actually classify the right passages?</w:t>
+      </w:r>
+      <w:r>
+        <w:t xml:space="preserve"> </w:t>
+      </w:r>
+      <w:r>
+        <w:t xml:space="preserve">— is rarely answered with passage-level human coding [6, 7, 18]. This paper takes that question seriously for one concrete measurement problem and follows the answer wherever it leads. The result is less a triumphant new instrument than an honest map of what a dictionary can and cannot do here, what to use instead when it cannot, and — most importantly — how to know whether any of these measures is capturing the construct at all.</w:t>
+      </w:r>
+    </w:p>
+    <w:p>
+      <w:pPr>
+        <w:pStyle w:val="BodyText"/>
+      </w:pPr>
+      <w:r>
+        <w:t xml:space="preserve">What counts as</w:t>
+      </w:r>
+      <w:r>
+        <w:t xml:space="preserve"> </w:t>
+      </w:r>
+      <w:r>
+        <w:rPr>
+          <w:b/>
+          <w:bCs/>
+        </w:rPr>
+        <w:t xml:space="preserve">visible</w:t>
+      </w:r>
+      <w:r>
+        <w:t xml:space="preserve"> </w:t>
+      </w:r>
+      <w:r>
+        <w:t xml:space="preserve">is what the measurement turns on: the preferential emphasis on</w:t>
       </w:r>
       <w:r>
         <w:t xml:space="preserve"> </w:t>
@@ -575,185 +576,19 @@
           <w:i/>
           <w:iCs/>
         </w:rPr>
-        <w:t xml:space="preserve">salient</w:t>
-      </w:r>
-      <w:r>
-        <w:t xml:space="preserve"> </w:t>
-      </w:r>
-      <w:r>
-        <w:t xml:space="preserve">and coded visible. Concealed utilities are noticed mainly upon failure. A measure that respects this construct must key on concrete, salience-bearing referents (parks, squares, roads, metro, landmarks), not on abstract appearance words (</w:t>
-      </w:r>
-      <w:r>
-        <w:t xml:space="preserve">“image”</w:t>
-      </w:r>
-      <w:r>
-        <w:t xml:space="preserve">,</w:t>
-      </w:r>
-      <w:r>
-        <w:t xml:space="preserve"> </w:t>
-      </w:r>
-      <w:r>
-        <w:t xml:space="preserve">“model”</w:t>
-      </w:r>
-      <w:r>
-        <w:t xml:space="preserve">,</w:t>
-      </w:r>
-      <w:r>
-        <w:t xml:space="preserve"> </w:t>
-      </w:r>
-      <w:r>
-        <w:t xml:space="preserve">“showcase”</w:t>
-      </w:r>
-      <w:r>
-        <w:t xml:space="preserve">) — and getting that distinction wrong, we show, is exactly where naive dictionaries fail.</w:t>
-      </w:r>
-    </w:p>
-    <w:p>
-      <w:pPr>
-        <w:pStyle w:val="BodyText"/>
-      </w:pPr>
-      <w:r>
-        <w:t xml:space="preserve">We proceed along a measurement ladder and report each rung honestly.</w:t>
-      </w:r>
-      <w:r>
-        <w:t xml:space="preserve"> </w:t>
-      </w:r>
-      <w:r>
-        <w:rPr>
-          <w:b/>
-          <w:bCs/>
-        </w:rPr>
-        <w:t xml:space="preserve">(i)</w:t>
-      </w:r>
-      <w:r>
-        <w:t xml:space="preserve"> </w:t>
-      </w:r>
-      <w:r>
-        <w:t xml:space="preserve">A naive visibility dictionary — appearance/image terms plus concrete construction terms — fails: against human passage-level coding its visible-class precision is only</w:t>
-      </w:r>
-      <w:r>
-        <w:t xml:space="preserve"> </w:t>
-      </w:r>
-      <w:r>
-        <w:rPr>
-          <w:b/>
-          <w:bCs/>
-        </w:rPr>
-        <w:t xml:space="preserve">0.10</w:t>
-      </w:r>
-      <w:r>
-        <w:t xml:space="preserve">, because polysemous appearance words </w:t>
-      </w:r>
-      <w:r>
-        <w:rPr>
-          <w:rFonts w:hint="eastAsia"/>
-        </w:rPr>
-        <w:t xml:space="preserve">(形象</w:t>
-      </w:r>
-      <w:r>
-        <w:t xml:space="preserve"> </w:t>
-      </w:r>
-      <w:r>
-        <w:t xml:space="preserve">“image”</w:t>
-      </w:r>
-      <w:r>
-        <w:t xml:space="preserve">, </w:t>
-      </w:r>
-      <w:r>
-        <w:rPr>
-          <w:rFonts w:hint="eastAsia"/>
-        </w:rPr>
-        <w:t xml:space="preserve">示范</w:t>
-      </w:r>
-      <w:r>
-        <w:t xml:space="preserve"> </w:t>
-      </w:r>
-      <w:r>
-        <w:t xml:space="preserve">“model/demonstration”</w:t>
-      </w:r>
-      <w:r>
-        <w:t xml:space="preserve">, </w:t>
-      </w:r>
-      <w:r>
-        <w:rPr>
-          <w:rFonts w:hint="eastAsia"/>
-        </w:rPr>
-        <w:t xml:space="preserve">面子</w:t>
-      </w:r>
-      <w:r>
-        <w:t xml:space="preserve"> </w:t>
-      </w:r>
-      <w:r>
-        <w:t xml:space="preserve">“face”</w:t>
-      </w:r>
-      <w:r>
-        <w:t xml:space="preserve">) fire pervasively outside infrastructure contexts.</w:t>
-      </w:r>
-      <w:r>
-        <w:t xml:space="preserve"> </w:t>
-      </w:r>
-      <w:r>
-        <w:rPr>
-          <w:b/>
-          <w:bCs/>
-        </w:rPr>
-        <w:t xml:space="preserve">(ii)</w:t>
-      </w:r>
-      <w:r>
-        <w:t xml:space="preserve"> </w:t>
-      </w:r>
-      <w:r>
-        <w:t xml:space="preserve">Restricting the lexicon to concrete, salience-based construction terms (mirroring the cosmetic-versus-functional split of the MOHURD construction-investment categories) raises visible precision to</w:t>
-      </w:r>
-      <w:r>
-        <w:t xml:space="preserve"> </w:t>
-      </w:r>
-      <w:r>
-        <w:rPr>
-          <w:b/>
-          <w:bCs/>
-        </w:rPr>
-        <w:t xml:space="preserve">0.50, and to 0.60 after targeted refinement, at 0.79 recall</w:t>
-      </w:r>
-      <w:r>
-        <w:t xml:space="preserve"> </w:t>
-      </w:r>
-      <w:r>
-        <w:t xml:space="preserve">— a large gain that nonetheless meets a</w:t>
-      </w:r>
-      <w:r>
-        <w:t xml:space="preserve"> </w:t>
-      </w:r>
-      <w:r>
-        <w:rPr>
-          <w:b/>
-          <w:bCs/>
-        </w:rPr>
-        <w:t xml:space="preserve">polysemy ceiling</w:t>
-      </w:r>
-      <w:r>
-        <w:t xml:space="preserve">: residual metaphorical and categorical uses </w:t>
-      </w:r>
-      <w:r>
-        <w:rPr>
-          <w:rFonts w:hint="eastAsia"/>
-        </w:rPr>
-        <w:t xml:space="preserve">(道路</w:t>
-      </w:r>
-      <w:r>
-        <w:t xml:space="preserve"> in</w:t>
-      </w:r>
-      <w:r>
-        <w:t xml:space="preserve"> </w:t>
-      </w:r>
-      <w:r>
-        <w:rPr>
-          <w:rFonts w:hint="eastAsia"/>
-        </w:rPr>
-        <w:t xml:space="preserve">“新型工业化道路”</w:t>
-      </w:r>
-      <w:r>
-        <w:t xml:space="preserve">, the</w:t>
+        <w:t xml:space="preserve">observationally salient</w:t>
+      </w:r>
+      <w:r>
+        <w:t xml:space="preserve"> </w:t>
+      </w:r>
+      <w:r>
+        <w:t xml:space="preserve">(</w:t>
+      </w:r>
+      <w:r>
+        <w:t xml:space="preserve">“visible”</w:t>
+      </w:r>
+      <w:r>
+        <w:t xml:space="preserve">) urban infrastructure — streetscapes, greening, squares, landmarks — over functionally important but</w:t>
       </w:r>
       <w:r>
         <w:t xml:space="preserve"> </w:t>
@@ -763,34 +598,54 @@
           <w:i/>
           <w:iCs/>
         </w:rPr>
-        <w:t xml:space="preserve">path</w:t>
-      </w:r>
-      <w:r>
-        <w:t xml:space="preserve"> </w:t>
-      </w:r>
-      <w:r>
-        <w:t xml:space="preserve">of new-type industrialization; </w:t>
-      </w:r>
-      <w:r>
-        <w:rPr>
-          <w:rFonts w:hint="eastAsia"/>
-        </w:rPr>
-        <w:t xml:space="preserve">轨道交通</w:t>
-      </w:r>
-      <w:r>
-        <w:t xml:space="preserve"> in</w:t>
-      </w:r>
-      <w:r>
-        <w:t xml:space="preserve"> </w:t>
-      </w:r>
-      <w:r>
-        <w:rPr>
-          <w:rFonts w:hint="eastAsia"/>
-        </w:rPr>
-        <w:t xml:space="preserve">“轨道交通产业”</w:t>
-      </w:r>
-      <w:r>
-        <w:t xml:space="preserve">, the rail-transit</w:t>
+        <w:t xml:space="preserve">concealed</w:t>
+      </w:r>
+      <w:r>
+        <w:t xml:space="preserve"> </w:t>
+      </w:r>
+      <w:r>
+        <w:t xml:space="preserve">infrastructure — drainage, pipe networks, sewerage, heating. The substantive interest is an old one in political economy: when a principal evaluates an agent on what the principal can observe, the agent over-invests in the observable. The measurement interest is sharper.</w:t>
+      </w:r>
+      <w:r>
+        <w:t xml:space="preserve"> </w:t>
+      </w:r>
+      <w:r>
+        <w:t xml:space="preserve">“Visible”</w:t>
+      </w:r>
+      <w:r>
+        <w:t xml:space="preserve"> </w:t>
+      </w:r>
+      <w:r>
+        <w:t xml:space="preserve">is not a surface-appearance category but an</w:t>
+      </w:r>
+      <w:r>
+        <w:t xml:space="preserve"> </w:t>
+      </w:r>
+      <w:r>
+        <w:rPr>
+          <w:b/>
+          <w:bCs/>
+        </w:rPr>
+        <w:t xml:space="preserve">observability/salience</w:t>
+      </w:r>
+      <w:r>
+        <w:t xml:space="preserve"> </w:t>
+      </w:r>
+      <w:r>
+        <w:t xml:space="preserve">category, defined relative to the audience that evaluates the official (superiors, inspectors, media, citizens). The instructive boundary case is</w:t>
+      </w:r>
+      <w:r>
+        <w:t xml:space="preserve"> </w:t>
+      </w:r>
+      <w:r>
+        <w:rPr>
+          <w:b/>
+          <w:bCs/>
+        </w:rPr>
+        <w:t xml:space="preserve">metro and rail transit</w:t>
+      </w:r>
+      <w:r>
+        <w:t xml:space="preserve">: physically underground, yet daily-used, media-celebrated, and a prestige achievement an evaluating superior cannot miss — hence maximally</w:t>
       </w:r>
       <w:r>
         <w:t xml:space="preserve"> </w:t>
@@ -800,6 +655,281 @@
           <w:i/>
           <w:iCs/>
         </w:rPr>
+        <w:t xml:space="preserve">salient</w:t>
+      </w:r>
+      <w:r>
+        <w:t xml:space="preserve"> </w:t>
+      </w:r>
+      <w:r>
+        <w:t xml:space="preserve">and coded visible. Concealed utilities are noticed mainly upon failure. A measure that respects this construct must key on concrete, salience-bearing referents (parks, squares, roads, metro, landmarks), not on abstract appearance words (</w:t>
+      </w:r>
+      <w:r>
+        <w:t xml:space="preserve">“image”</w:t>
+      </w:r>
+      <w:r>
+        <w:t xml:space="preserve">,</w:t>
+      </w:r>
+      <w:r>
+        <w:t xml:space="preserve"> </w:t>
+      </w:r>
+      <w:r>
+        <w:t xml:space="preserve">“model”</w:t>
+      </w:r>
+      <w:r>
+        <w:t xml:space="preserve">,</w:t>
+      </w:r>
+      <w:r>
+        <w:t xml:space="preserve"> </w:t>
+      </w:r>
+      <w:r>
+        <w:t xml:space="preserve">“showcase”</w:t>
+      </w:r>
+      <w:r>
+        <w:t xml:space="preserve">) — and getting that distinction wrong, we show, is exactly where naive dictionaries fail.</w:t>
+      </w:r>
+    </w:p>
+    <w:p>
+      <w:pPr>
+        <w:pStyle w:val="BodyText"/>
+      </w:pPr>
+      <w:r>
+        <w:t xml:space="preserve">We proceed along a measurement ladder and report each rung honestly.</w:t>
+      </w:r>
+      <w:r>
+        <w:t xml:space="preserve"> </w:t>
+      </w:r>
+      <w:r>
+        <w:rPr>
+          <w:b/>
+          <w:bCs/>
+        </w:rPr>
+        <w:t xml:space="preserve">(i)</w:t>
+      </w:r>
+      <w:r>
+        <w:t xml:space="preserve"> </w:t>
+      </w:r>
+      <w:r>
+        <w:t xml:space="preserve">A naive visibility dictionary — appearance/image terms plus concrete construction terms — fails: against human passage-level coding its visible-class precision is only</w:t>
+      </w:r>
+      <w:r>
+        <w:t xml:space="preserve"> </w:t>
+      </w:r>
+      <w:r>
+        <w:rPr>
+          <w:b/>
+          <w:bCs/>
+        </w:rPr>
+        <w:t xml:space="preserve">0.10</w:t>
+      </w:r>
+      <w:r>
+        <w:t xml:space="preserve">, because polysemous appearance words </w:t>
+      </w:r>
+      <w:r>
+        <w:rPr>
+          <w:rFonts w:hint="eastAsia"/>
+        </w:rPr>
+        <w:t xml:space="preserve">(形象</w:t>
+      </w:r>
+      <w:r>
+        <w:t xml:space="preserve"> </w:t>
+      </w:r>
+      <w:r>
+        <w:rPr>
+          <w:i/>
+          <w:iCs/>
+        </w:rPr>
+        <w:t xml:space="preserve">xíngxiàng</w:t>
+      </w:r>
+      <w:r>
+        <w:t xml:space="preserve"> </w:t>
+      </w:r>
+      <w:r>
+        <w:t xml:space="preserve">“image”</w:t>
+      </w:r>
+      <w:r>
+        <w:t xml:space="preserve">, </w:t>
+      </w:r>
+      <w:r>
+        <w:rPr>
+          <w:rFonts w:hint="eastAsia"/>
+        </w:rPr>
+        <w:t xml:space="preserve">示范</w:t>
+      </w:r>
+      <w:r>
+        <w:t xml:space="preserve"> </w:t>
+      </w:r>
+      <w:r>
+        <w:rPr>
+          <w:i/>
+          <w:iCs/>
+        </w:rPr>
+        <w:t xml:space="preserve">shìfàn</w:t>
+      </w:r>
+      <w:r>
+        <w:t xml:space="preserve"> </w:t>
+      </w:r>
+      <w:r>
+        <w:t xml:space="preserve">“model/demonstration”</w:t>
+      </w:r>
+      <w:r>
+        <w:t xml:space="preserve">, </w:t>
+      </w:r>
+      <w:r>
+        <w:rPr>
+          <w:rFonts w:hint="eastAsia"/>
+        </w:rPr>
+        <w:t xml:space="preserve">面子</w:t>
+      </w:r>
+      <w:r>
+        <w:t xml:space="preserve"> </w:t>
+      </w:r>
+      <w:r>
+        <w:rPr>
+          <w:i/>
+          <w:iCs/>
+        </w:rPr>
+        <w:t xml:space="preserve">miànzi</w:t>
+      </w:r>
+      <w:r>
+        <w:t xml:space="preserve"> </w:t>
+      </w:r>
+      <w:r>
+        <w:t xml:space="preserve">“face”</w:t>
+      </w:r>
+      <w:r>
+        <w:t xml:space="preserve">) fire pervasively outside infrastructure contexts.</w:t>
+      </w:r>
+      <w:r>
+        <w:t xml:space="preserve"> </w:t>
+      </w:r>
+      <w:r>
+        <w:rPr>
+          <w:b/>
+          <w:bCs/>
+        </w:rPr>
+        <w:t xml:space="preserve">(ii)</w:t>
+      </w:r>
+      <w:r>
+        <w:t xml:space="preserve"> </w:t>
+      </w:r>
+      <w:r>
+        <w:t xml:space="preserve">Restricting the lexicon to concrete, salience-based construction terms (mirroring the cosmetic-versus-functional split of the MOHURD construction-investment categories) raises visible precision to</w:t>
+      </w:r>
+      <w:r>
+        <w:t xml:space="preserve"> </w:t>
+      </w:r>
+      <w:r>
+        <w:rPr>
+          <w:b/>
+          <w:bCs/>
+        </w:rPr>
+        <w:t xml:space="preserve">0.50, and to 0.60 after targeted refinement, at 0.79 recall</w:t>
+      </w:r>
+      <w:r>
+        <w:t xml:space="preserve"> </w:t>
+      </w:r>
+      <w:r>
+        <w:t xml:space="preserve">— a large gain that nonetheless meets a</w:t>
+      </w:r>
+      <w:r>
+        <w:t xml:space="preserve"> </w:t>
+      </w:r>
+      <w:r>
+        <w:rPr>
+          <w:b/>
+          <w:bCs/>
+        </w:rPr>
+        <w:t xml:space="preserve">polysemy ceiling</w:t>
+      </w:r>
+      <w:r>
+        <w:t xml:space="preserve">: residual metaphorical and categorical uses </w:t>
+      </w:r>
+      <w:r>
+        <w:rPr>
+          <w:rFonts w:hint="eastAsia"/>
+        </w:rPr>
+        <w:t xml:space="preserve">(道路</w:t>
+      </w:r>
+      <w:r>
+        <w:t xml:space="preserve"> </w:t>
+      </w:r>
+      <w:r>
+        <w:rPr>
+          <w:i/>
+          <w:iCs/>
+        </w:rPr>
+        <w:t xml:space="preserve">dàolù</w:t>
+      </w:r>
+      <w:r>
+        <w:t xml:space="preserve"> </w:t>
+      </w:r>
+      <w:r>
+        <w:t xml:space="preserve">in </w:t>
+      </w:r>
+      <w:r>
+        <w:rPr>
+          <w:rFonts w:hint="eastAsia"/>
+        </w:rPr>
+        <w:t xml:space="preserve">新型工业化道路,</w:t>
+      </w:r>
+      <w:r>
+        <w:t xml:space="preserve"> the</w:t>
+      </w:r>
+      <w:r>
+        <w:t xml:space="preserve"> </w:t>
+      </w:r>
+      <w:r>
+        <w:rPr>
+          <w:i/>
+          <w:iCs/>
+        </w:rPr>
+        <w:t xml:space="preserve">path</w:t>
+      </w:r>
+      <w:r>
+        <w:t xml:space="preserve"> </w:t>
+      </w:r>
+      <w:r>
+        <w:t xml:space="preserve">of new-type industrialization; </w:t>
+      </w:r>
+      <w:r>
+        <w:rPr>
+          <w:rFonts w:hint="eastAsia"/>
+        </w:rPr>
+        <w:t xml:space="preserve">轨道交通</w:t>
+      </w:r>
+      <w:r>
+        <w:t xml:space="preserve"> </w:t>
+      </w:r>
+      <w:r>
+        <w:rPr>
+          <w:i/>
+          <w:iCs/>
+        </w:rPr>
+        <w:t xml:space="preserve">guǐdào jiāotōng</w:t>
+      </w:r>
+      <w:r>
+        <w:t xml:space="preserve"> </w:t>
+      </w:r>
+      <w:r>
+        <w:t xml:space="preserve">in </w:t>
+      </w:r>
+      <w:r>
+        <w:rPr>
+          <w:rFonts w:hint="eastAsia"/>
+        </w:rPr>
+        <w:t xml:space="preserve">轨道交通产业,</w:t>
+      </w:r>
+      <w:r>
+        <w:t xml:space="preserve"> the rail-transit</w:t>
+      </w:r>
+      <w:r>
+        <w:t xml:space="preserve"> </w:t>
+      </w:r>
+      <w:r>
+        <w:rPr>
+          <w:i/>
+          <w:iCs/>
+        </w:rPr>
         <w:t xml:space="preserve">industry</w:t>
       </w:r>
       <w:r>
@@ -851,7 +981,7 @@
         <w:t xml:space="preserve"> </w:t>
       </w:r>
       <w:r>
-        <w:t xml:space="preserve">— comfortably above the dictionary ceiling. The lesson generalizes beyond our case: for compositional constructs carried by polysemous everyday words, dictionary precision is bounded by the language, not by the analyst’s diligence, and supervised or LLM classification is the appropriate high-precision route.</w:t>
+        <w:t xml:space="preserve">— comfortably above the dictionary ceiling. The pattern is likely not unique to this corpus: for compositional constructs carried by polysemous everyday words, dictionary precision may be bounded by the language rather than the analyst’s diligence — though we establish this only for Chinese GWR text and offer it as a hypothesis to test elsewhere.</w:t>
       </w:r>
     </w:p>
     <w:p>
@@ -2188,16 +2318,7 @@
         <w:t xml:space="preserve"> </w:t>
       </w:r>
       <w:r>
-        <w:t xml:space="preserve">A municipal GWR is drafted by the city government’s research office </w:t>
-      </w:r>
-      <w:r>
-        <w:rPr>
-          <w:rFonts w:hint="eastAsia"/>
-        </w:rPr>
-        <w:t xml:space="preserve">(政府研究室)</w:t>
-      </w:r>
-      <w:r>
-        <w:t xml:space="preserve"> under the mayor’s direct supervision, revised through successive leadership readings, and formally delivered by the mayor to the annual session of the municipal People’s Congress, which reviews and votes to adopt it. It is therefore the government’s official, on-the-record statement of the year’s work and the coming year’s commitments — neither a personal essay nor a press release.</w:t>
+        <w:t xml:space="preserve">A municipal GWR is drafted by the city government’s research office under the mayor’s direct supervision, revised through successive leadership readings, and formally delivered by the mayor to the annual session of the municipal People’s Congress, which reviews and votes to adopt it. It is therefore the government’s official, on-the-record statement of the year’s work and the coming year’s commitments — neither a personal essay nor a press release.</w:t>
       </w:r>
     </w:p>
     <w:p>
@@ -2215,25 +2336,7 @@
         <w:t xml:space="preserve"> </w:t>
       </w:r>
       <w:r>
-        <w:t xml:space="preserve">Under the target-responsibility system </w:t>
-      </w:r>
-      <w:r>
-        <w:rPr>
-          <w:rFonts w:hint="eastAsia"/>
-        </w:rPr>
-        <w:t xml:space="preserve">(目标责任制)</w:t>
-      </w:r>
-      <w:r>
-        <w:t xml:space="preserve"> and performance-assessment </w:t>
-      </w:r>
-      <w:r>
-        <w:rPr>
-          <w:rFonts w:hint="eastAsia"/>
-        </w:rPr>
-        <w:t xml:space="preserve">(绩效考核)</w:t>
-      </w:r>
-      <w:r>
-        <w:t xml:space="preserve"> regime, the commitments enumerated in the GWR feed the quantified targets against which the prefecture’s leadership is subsequently assessed by the superior provincial Party authority. The report is an</w:t>
+        <w:t xml:space="preserve">Under the target-responsibility system and performance-assessment regime, the commitments enumerated in the GWR feed the quantified targets against which the prefecture’s leadership is subsequently assessed by the superior provincial Party authority. The report is an</w:t>
       </w:r>
       <w:r>
         <w:t xml:space="preserve"> </w:t>
@@ -3772,7 +3875,20 @@
         <w:t xml:space="preserve">道路</w:t>
       </w:r>
       <w:r>
-        <w:t xml:space="preserve"> (</w:t>
+        <w:t xml:space="preserve"> </w:t>
+      </w:r>
+      <w:r>
+        <w:rPr>
+          <w:i/>
+          <w:iCs/>
+        </w:rPr>
+        <w:t xml:space="preserve">dàolù</w:t>
+      </w:r>
+      <w:r>
+        <w:t xml:space="preserve"> </w:t>
+      </w:r>
+      <w:r>
+        <w:t xml:space="preserve">(</w:t>
       </w:r>
       <w:r>
         <w:t xml:space="preserve">“road”</w:t>
@@ -3827,7 +3943,20 @@
         <w:t xml:space="preserve">轨道交通</w:t>
       </w:r>
       <w:r>
-        <w:t xml:space="preserve"> (</w:t>
+        <w:t xml:space="preserve"> </w:t>
+      </w:r>
+      <w:r>
+        <w:rPr>
+          <w:i/>
+          <w:iCs/>
+        </w:rPr>
+        <w:t xml:space="preserve">guǐdào jiāotōng</w:t>
+      </w:r>
+      <w:r>
+        <w:t xml:space="preserve"> </w:t>
+      </w:r>
+      <w:r>
+        <w:t xml:space="preserve">(</w:t>
       </w:r>
       <w:r>
         <w:t xml:space="preserve">“rail transit”</w:t>
@@ -3879,7 +4008,20 @@
         <w:t xml:space="preserve">园林</w:t>
       </w:r>
       <w:r>
-        <w:t xml:space="preserve"> (</w:t>
+        <w:t xml:space="preserve"> </w:t>
+      </w:r>
+      <w:r>
+        <w:rPr>
+          <w:i/>
+          <w:iCs/>
+        </w:rPr>
+        <w:t xml:space="preserve">yuánlín</w:t>
+      </w:r>
+      <w:r>
+        <w:t xml:space="preserve"> </w:t>
+      </w:r>
+      <w:r>
+        <w:t xml:space="preserve">(</w:t>
       </w:r>
       <w:r>
         <w:t xml:space="preserve">“garden/landscaping”</w:t>
@@ -3891,7 +4033,20 @@
         <w:rPr>
           <w:rFonts w:hint="eastAsia"/>
         </w:rPr>
-        <w:t xml:space="preserve">国家园林城市.</w:t>
+        <w:t xml:space="preserve">国家园林城市</w:t>
+      </w:r>
+      <w:r>
+        <w:t xml:space="preserve"> </w:t>
+      </w:r>
+      <w:r>
+        <w:rPr>
+          <w:i/>
+          <w:iCs/>
+        </w:rPr>
+        <w:t xml:space="preserve">guójiā yuánlín chéngshì</w:t>
+      </w:r>
+      <w:r>
+        <w:t xml:space="preserve">.</w:t>
       </w:r>
     </w:p>
     <w:p>
@@ -5731,7 +5886,7 @@
         <w:pStyle w:val="FirstParagraph"/>
       </w:pPr>
       <w:r>
-        <w:t xml:space="preserve">The case yields three lessons that travel beyond Chinese government text.</w:t>
+        <w:t xml:space="preserve">Within this single-country case (Chinese municipal GWRs), three lessons emerge that may transfer — offered to be tested elsewhere, not assumed.</w:t>
       </w:r>
     </w:p>
     <w:p>
@@ -5900,29 +6055,13 @@
           <w:b/>
           <w:bCs/>
         </w:rPr>
-        <w:t xml:space="preserve">Human intercoder agreement is pending a second coder.</w:t>
-      </w:r>
-      <w:r>
-        <w:t xml:space="preserve"> </w:t>
-      </w:r>
-      <w:r>
-        <w:t xml:space="preserve">Our current agreement statistic is human↔ensemble (Cohen κ = 0.66); the pre-registered</w:t>
-      </w:r>
-      <w:r>
-        <w:t xml:space="preserve"> </w:t>
-      </w:r>
-      <w:r>
-        <w:rPr>
-          <w:i/>
-          <w:iCs/>
-        </w:rPr>
-        <w:t xml:space="preserve">human</w:t>
-      </w:r>
-      <w:r>
-        <w:t xml:space="preserve"> </w:t>
-      </w:r>
-      <w:r>
-        <w:t xml:space="preserve">intercoder κ requires a second independent coder, now being recruited, and the final precision/recall figures may shift modestly under full human double-coding.</w:t>
+        <w:t xml:space="preserve">Intercoder agreement is substantial but not perfect.</w:t>
+      </w:r>
+      <w:r>
+        <w:t xml:space="preserve"> </w:t>
+      </w:r>
+      <w:r>
+        <w:t xml:space="preserve">Two independent human coders reach Cohen κ = 0.70 on the 120-sentence gold set; residual disagreement concentrates on the visible-versus-mixed boundary — itself a manifestation of the polysemy the paper documents — so passage-level precision/recall carry a few points of coder-judgment uncertainty.</w:t>
       </w:r>
     </w:p>
     <w:p>
@@ -5938,13 +6077,41 @@
           <w:b/>
           <w:bCs/>
         </w:rPr>
-        <w:t xml:space="preserve">The procurement check is provincial and count-based.</w:t>
-      </w:r>
-      <w:r>
-        <w:t xml:space="preserve"> </w:t>
-      </w:r>
-      <w:r>
-        <w:t xml:space="preserve">It covers Zhejiang (2019–2024) and exposes project counts, not amounts; counts are confounded by project packaging. It corroborates frequency only; magnitude rests on the accounting CIR.</w:t>
+        <w:t xml:space="preserve">The procurement check is provincial.</w:t>
+      </w:r>
+      <w:r>
+        <w:t xml:space="preserve"> </w:t>
+      </w:r>
+      <w:r>
+        <w:t xml:space="preserve">It covers Zhejiang only; project frequency</w:t>
+      </w:r>
+      <w:r>
+        <w:t xml:space="preserve"> </w:t>
+      </w:r>
+      <w:r>
+        <w:rPr>
+          <w:i/>
+          <w:iCs/>
+        </w:rPr>
+        <w:t xml:space="preserve">and</w:t>
+      </w:r>
+      <w:r>
+        <w:t xml:space="preserve"> </w:t>
+      </w:r>
+      <w:r>
+        <w:t xml:space="preserve">investment amount both corroborate the tilt, but a</w:t>
+      </w:r>
+      <w:r>
+        <w:t xml:space="preserve"> </w:t>
+      </w:r>
+      <w:r>
+        <w:t xml:space="preserve">“project”</w:t>
+      </w:r>
+      <w:r>
+        <w:t xml:space="preserve"> </w:t>
+      </w:r>
+      <w:r>
+        <w:t xml:space="preserve">is proxied by the deduplicated award record, so the count comparison remains sensitive to how works are packaged. National generalization is untested.</w:t>
       </w:r>
     </w:p>
     <w:p>
@@ -6026,16 +6193,7 @@
         <w:t xml:space="preserve"> </w:t>
       </w:r>
       <w:r>
-        <w:t xml:space="preserve">The Wikipedia null bounds the measure to governance rhetoric; an appropriate policy-rhetoric third-party validation (e.g., Xinhua local-policy news, CNKI </w:t>
-      </w:r>
-      <w:r>
-        <w:rPr>
-          <w:rFonts w:hint="eastAsia"/>
-        </w:rPr>
-        <w:t xml:space="preserve">重要报纸</w:t>
-      </w:r>
-      <w:r>
-        <w:t xml:space="preserve"> coverage) remains future work.</w:t>
+        <w:t xml:space="preserve">The Wikipedia null bounds the measure to governance rhetoric; an appropriate policy-rhetoric third-party validation (e.g., Xinhua local-policy news, CNKI key-newspaper coverage) remains future work.</w:t>
       </w:r>
     </w:p>
     <w:bookmarkEnd w:id="40"/>
@@ -6066,7 +6224,7 @@
         <w:t xml:space="preserve">report the ceiling</w:t>
       </w:r>
       <w:r>
-        <w:t xml:space="preserve">, escalate to LLM classification where needed, and anchor validity behaviorally against an accounting outcome under an exogenous shock — is portable to any setting where bureaucratic agents produce structured, consequential annual documents (EU National Reform Programmes; Indian state budget speeches; Mexican municipal</w:t>
+        <w:t xml:space="preserve">, escalate to LLM classification where needed, and anchor validity behaviorally against an accounting outcome under an exogenous shock — could plausibly transfer to other settings where bureaucratic agents produce structured, consequential annual documents (e.g., EU National Reform Programmes; Indian state budget speeches; Mexican municipal</w:t>
       </w:r>
       <w:r>
         <w:t xml:space="preserve"> </w:t>
@@ -6082,7 +6240,7 @@
         <w:t xml:space="preserve"> </w:t>
       </w:r>
       <w:r>
-        <w:t xml:space="preserve">documents). What is</w:t>
+        <w:t xml:space="preserve">documents), though we have not tested it outside China. What is</w:t>
       </w:r>
       <w:r>
         <w:t xml:space="preserve"> </w:t>
@@ -6132,7 +6290,7 @@
         <w:pStyle w:val="BodyText"/>
       </w:pPr>
       <w:r>
-        <w:t xml:space="preserve">Two general points outlast the case. First, polysemy imposes a precision ceiling on dictionary measures of everyday-word constructs that curation cannot break, and that ceiling should be reported, not hidden. Second, for measures of strategic attention the decisive validity test is behavioral co-movement under an exogenous shock — not internal reliability, and not passage precision alone. We invite extension along three lines: a policy-rhetoric third-party corpus to strengthen external validity; additional exogenous incentive shocks to widen the criterion-validity base; and application of the validate-report-the-ceiling-then-escalate protocol to bureaucratic text in other institutional settings.</w:t>
+        <w:t xml:space="preserve">Two points may outlast this one-country case and invite testing elsewhere. First, polysemy imposes a precision ceiling on dictionary measures of everyday-word constructs that curation cannot break, and that ceiling should be reported, not hidden. Second, for measures of strategic attention the decisive validity test is behavioral co-movement under an exogenous shock — not internal reliability, and not passage precision alone. We invite extension along three lines: a policy-rhetoric third-party corpus to strengthen external validity; additional exogenous incentive shocks to widen the criterion-validity base; and application of the validate-report-the-ceiling-then-escalate protocol to bureaucratic text in other institutional settings.</w:t>
       </w:r>
     </w:p>
     <w:p>
@@ -6715,16 +6873,19 @@
         <w:t xml:space="preserve">Executed</w:t>
       </w:r>
       <w:r>
-        <w:t xml:space="preserve">: Expanded treatment panel to include Rounds 6–9 (2016–2017, including </w:t>
-      </w:r>
-      <w:r>
-        <w:rPr>
-          <w:rFonts w:hint="eastAsia"/>
-        </w:rPr>
-        <w:t xml:space="preserve">回头看</w:t>
-      </w:r>
-      <w:r>
-        <w:t xml:space="preserve"> re-inspections covering 23 provinces that had been treated in Rounds 1–5). Total 62 province-round records. Re-fit the Sun-Abraham cohort-stacked estimator with 9 cohorts spanning 2013-05 through 2017-04.</w:t>
+        <w:t xml:space="preserve">: Expanded treatment panel to include Rounds 6–9 (2016–2017, including</w:t>
+      </w:r>
+      <w:r>
+        <w:t xml:space="preserve"> </w:t>
+      </w:r>
+      <w:r>
+        <w:t xml:space="preserve">“look-back”</w:t>
+      </w:r>
+      <w:r>
+        <w:t xml:space="preserve"> </w:t>
+      </w:r>
+      <w:r>
+        <w:t xml:space="preserve">re-inspections covering 23 provinces that had been treated in Rounds 1–5). Total 62 province-round records. Re-fit the Sun-Abraham cohort-stacked estimator with 9 cohorts spanning 2013-05 through 2017-04.</w:t>
       </w:r>
     </w:p>
     <w:p>
@@ -6930,43 +7091,7 @@
         <w:t xml:space="preserve">Executed</w:t>
       </w:r>
       <w:r>
-        <w:t xml:space="preserve">: Substituted Chinese Wikipedia (zh.wikipedia.org) as publicly-accessible third-party source, using MediaWiki API. 282 of 286 target cities fetched (4 misses: </w:t>
-      </w:r>
-      <w:r>
-        <w:rPr>
-          <w:rFonts w:hint="eastAsia"/>
-        </w:rPr>
-        <w:t xml:space="preserve">吉安,</w:t>
-      </w:r>
-      <w:r>
-        <w:t xml:space="preserve"> </w:t>
-      </w:r>
-      <w:r>
-        <w:rPr>
-          <w:rFonts w:hint="eastAsia"/>
-        </w:rPr>
-        <w:t xml:space="preserve">松原,</w:t>
-      </w:r>
-      <w:r>
-        <w:t xml:space="preserve"> </w:t>
-      </w:r>
-      <w:r>
-        <w:rPr>
-          <w:rFonts w:hint="eastAsia"/>
-        </w:rPr>
-        <w:t xml:space="preserve">梅州,</w:t>
-      </w:r>
-      <w:r>
-        <w:t xml:space="preserve"> </w:t>
-      </w:r>
-      <w:r>
-        <w:rPr>
-          <w:rFonts w:hint="eastAsia"/>
-        </w:rPr>
-        <w:t xml:space="preserve">白山).</w:t>
-      </w:r>
-      <w:r>
-        <w:t xml:space="preserve"> Mean article length 8,447 chars. Same V_ORIG + F_ORIG lexicon applied.</w:t>
+        <w:t xml:space="preserve">: Substituted Chinese Wikipedia (zh.wikipedia.org) as publicly-accessible third-party source, using MediaWiki API. 282 of 286 target cities fetched (4 misses: Ji’an, Songyuan, Meizhou, Baishan). Mean article length 8,447 chars. Same V_ORIG + F_ORIG lexicon applied.</w:t>
       </w:r>
     </w:p>
     <w:p>
@@ -7049,16 +7174,7 @@
         <w:t xml:space="preserve">Reason for substitute source</w:t>
       </w:r>
       <w:r>
-        <w:t xml:space="preserve">: Xinhua news and CNKI </w:t>
-      </w:r>
-      <w:r>
-        <w:rPr>
-          <w:rFonts w:hint="eastAsia"/>
-        </w:rPr>
-        <w:t xml:space="preserve">重要报纸</w:t>
-      </w:r>
-      <w:r>
-        <w:t xml:space="preserve"> archives require CARSI-authenticated institutional access not available in the α-full session. Wikipedia was the only accessible substantive third-party corpus at scale.</w:t>
+        <w:t xml:space="preserve">: Xinhua news and CNKI key-newspaper archives require CARSI-authenticated institutional access not available in the α-full session. Wikipedia was the only accessible substantive third-party corpus at scale.</w:t>
       </w:r>
     </w:p>
     <w:p>
@@ -7089,16 +7205,7 @@
         <w:t xml:space="preserve"> </w:t>
       </w:r>
       <w:r>
-        <w:t xml:space="preserve">text — Xinhua local-policy news or CNKI </w:t>
-      </w:r>
-      <w:r>
-        <w:rPr>
-          <w:rFonts w:hint="eastAsia"/>
-        </w:rPr>
-        <w:t xml:space="preserve">重要报纸</w:t>
-      </w:r>
-      <w:r>
-        <w:t xml:space="preserve"> government reporting — whose construction is deferred to future work (see §5.3). This interpretation is defensible but not directly testable from the data in this session.</w:t>
+        <w:t xml:space="preserve">text — Xinhua local-policy news or CNKI key-newspaper government reporting — whose construction is deferred to future work (see §5.3). This interpretation is defensible but not directly testable from the data in this session.</w:t>
       </w:r>
     </w:p>
     <w:p>
@@ -8051,7 +8158,7 @@
           <w:i/>
           <w:iCs/>
         </w:rPr>
-        <w:t xml:space="preserve">When Dictionaries Hit a Polysemy Ceiling: Validating a Measure of Visibility Bias with LLMs and Behavioral Evidence</w:t>
+        <w:t xml:space="preserve">Visibility Bias in Chinese Municipal Government Work Reports: Measurement and Behavioral Validation</w:t>
       </w:r>
     </w:p>
     <w:p>
@@ -12402,13 +12509,14 @@
     <w:tbl>
       <w:tblPr>
         <w:tblStyle w:val="Table"/>
-        <w:tblW w:type="auto" w:w="0"/>
+        <w:tblW w:type="pct" w:w="5000"/>
+        <w:tblLayout w:type="fixed"/>
         <w:tblLook w:firstRow="1" w:lastRow="0" w:firstColumn="0" w:lastColumn="0" w:noHBand="0" w:noVBand="0" w:val="0020"/>
       </w:tblPr>
       <w:tblGrid>
-        <w:gridCol w:w="2640"/>
-        <w:gridCol w:w="2640"/>
-        <w:gridCol w:w="2640"/>
+        <w:gridCol w:w="2376"/>
+        <w:gridCol w:w="3168"/>
+        <w:gridCol w:w="2376"/>
       </w:tblGrid>
       <w:tr>
         <w:trPr>
@@ -12463,7 +12571,20 @@
               <w:t xml:space="preserve">示范</w:t>
             </w:r>
             <w:r>
-              <w:t xml:space="preserve"> (model/demonstration)</w:t>
+              <w:t xml:space="preserve"> </w:t>
+            </w:r>
+            <w:r>
+              <w:rPr>
+                <w:i/>
+                <w:iCs/>
+              </w:rPr>
+              <w:t xml:space="preserve">shìfàn</w:t>
+            </w:r>
+            <w:r>
+              <w:t xml:space="preserve"> </w:t>
+            </w:r>
+            <w:r>
+              <w:t xml:space="preserve">(model/demonstration)</w:t>
             </w:r>
           </w:p>
         </w:tc>
@@ -12526,7 +12647,20 @@
               <w:t xml:space="preserve">文明城市</w:t>
             </w:r>
             <w:r>
-              <w:t xml:space="preserve"> (civilized city)</w:t>
+              <w:t xml:space="preserve"> </w:t>
+            </w:r>
+            <w:r>
+              <w:rPr>
+                <w:i/>
+                <w:iCs/>
+              </w:rPr>
+              <w:t xml:space="preserve">wénmíng chéngshì</w:t>
+            </w:r>
+            <w:r>
+              <w:t xml:space="preserve"> </w:t>
+            </w:r>
+            <w:r>
+              <w:t xml:space="preserve">(civilized city)</w:t>
             </w:r>
           </w:p>
         </w:tc>
@@ -12568,7 +12702,20 @@
               <w:t xml:space="preserve">展示</w:t>
             </w:r>
             <w:r>
-              <w:t xml:space="preserve"> (display/showcase)</w:t>
+              <w:t xml:space="preserve"> </w:t>
+            </w:r>
+            <w:r>
+              <w:rPr>
+                <w:i/>
+                <w:iCs/>
+              </w:rPr>
+              <w:t xml:space="preserve">zhǎnshì</w:t>
+            </w:r>
+            <w:r>
+              <w:t xml:space="preserve"> </w:t>
+            </w:r>
+            <w:r>
+              <w:t xml:space="preserve">(display/showcase)</w:t>
             </w:r>
           </w:p>
         </w:tc>
@@ -12610,7 +12757,20 @@
               <w:t xml:space="preserve">美丽</w:t>
             </w:r>
             <w:r>
-              <w:t xml:space="preserve"> (beautiful)</w:t>
+              <w:t xml:space="preserve"> </w:t>
+            </w:r>
+            <w:r>
+              <w:rPr>
+                <w:i/>
+                <w:iCs/>
+              </w:rPr>
+              <w:t xml:space="preserve">měilì</w:t>
+            </w:r>
+            <w:r>
+              <w:t xml:space="preserve"> </w:t>
+            </w:r>
+            <w:r>
+              <w:t xml:space="preserve">(beautiful)</w:t>
             </w:r>
           </w:p>
         </w:tc>
@@ -12658,7 +12818,20 @@
               <w:t xml:space="preserve">形象</w:t>
             </w:r>
             <w:r>
-              <w:t xml:space="preserve"> (image)</w:t>
+              <w:t xml:space="preserve"> </w:t>
+            </w:r>
+            <w:r>
+              <w:rPr>
+                <w:i/>
+                <w:iCs/>
+              </w:rPr>
+              <w:t xml:space="preserve">xíngxiàng</w:t>
+            </w:r>
+            <w:r>
+              <w:t xml:space="preserve"> </w:t>
+            </w:r>
+            <w:r>
+              <w:t xml:space="preserve">(image)</w:t>
             </w:r>
           </w:p>
         </w:tc>

</xml_diff>

<commit_message>
Pre-submission audit fixes: repair 2 broken cross-refs (3.5; App A.2), unify procurement years, drop ref TODO-comments, fill title-page counts, minor precision (0.010, 60-61); quarantine stale R1 renders to _R1-archive
Co-Authored-By: Claude Opus 4.8 (1M context) <noreply@anthropic.com>
</commit_message>
<xml_diff>
--- a/05-manuscript/submission/manuscript_R2.docx
+++ b/05-manuscript/submission/manuscript_R2.docx
@@ -2849,7 +2849,7 @@
           <w:b/>
           <w:bCs/>
         </w:rPr>
-        <w:t xml:space="preserve">61 of 84</w:t>
+        <w:t xml:space="preserve">60–61 of 84</w:t>
       </w:r>
       <w:r>
         <w:t xml:space="preserve"> </w:t>
@@ -4500,7 +4500,7 @@
           <w:b/>
           <w:bCs/>
         </w:rPr>
-        <w:t xml:space="preserve">Zhejiang public-procurement records (2019–2024)</w:t>
+        <w:t xml:space="preserve">Zhejiang public-procurement records (predominantly 2019–2026)</w:t>
       </w:r>
       <w:r>
         <w:t xml:space="preserve"> </w:t>
@@ -5169,7 +5169,7 @@
                 <w:b/>
                 <w:bCs/>
               </w:rPr>
-              <w:t xml:space="preserve">+0.0103</w:t>
+              <w:t xml:space="preserve">+0.010</w:t>
             </w:r>
             <w:r>
               <w:t xml:space="preserve"> </w:t>
@@ -7220,7 +7220,7 @@
         <w:t xml:space="preserve">Honesty claim</w:t>
       </w:r>
       <w:r>
-        <w:t xml:space="preserve">: The failure is reported transparently in §3.2.5-3.2.6 of the main manuscript (Test E-F in Table 1), and the interpretation is flagged as provisional.</w:t>
+        <w:t xml:space="preserve">: The failure is reported transparently in §3.5 of the main manuscript (the failed Wikipedia external validation, E-F), and the interpretation is flagged as provisional.</w:t>
       </w:r>
     </w:p>
     <w:bookmarkEnd w:id="50"/>
@@ -11334,36 +11334,7 @@
         <w:pStyle w:val="FirstParagraph"/>
       </w:pPr>
       <w:r>
-        <w:t xml:space="preserve">Equation</w:t>
-      </w:r>
-      <w:r>
-        <w:t xml:space="preserve"> </w:t>
-      </w:r>
-      <m:oMath>
-        <m:r>
-          <m:rPr>
-            <m:sty m:val="p"/>
-          </m:rPr>
-          <m:t>(</m:t>
-        </m:r>
-        <m:r>
-          <m:rPr>
-            <m:sty m:val="p"/>
-          </m:rPr>
-          <m:t>⋆</m:t>
-        </m:r>
-        <m:r>
-          <m:rPr>
-            <m:sty m:val="p"/>
-          </m:rPr>
-          <m:t>)</m:t>
-        </m:r>
-      </m:oMath>
-      <w:r>
-        <w:t xml:space="preserve"> </w:t>
-      </w:r>
-      <w:r>
-        <w:t xml:space="preserve">from §2.4 predicts that the visibility-bias distortion increases in</w:t>
+        <w:t xml:space="preserve">The cadre-attention first-order condition (Online Appendix A.2) predicts that the visibility-bias distortion increases in</w:t>
       </w:r>
       <w:r>
         <w:t xml:space="preserve"> </w:t>
@@ -13998,9 +13969,6 @@
       <w:r>
         <w:t xml:space="preserve">(3), 267-297. https://doi.org/10.1093/pan/mps028</w:t>
       </w:r>
-      <w:r>
-        <w:t xml:space="preserve"> </w:t>
-      </w:r>
     </w:p>
     <w:p>
       <w:pPr>
@@ -14024,9 +13992,6 @@
       </w:r>
       <w:r>
         <w:t xml:space="preserve">(1), 59-80. https://doi.org/10.1017/pan.2021.37</w:t>
-      </w:r>
-      <w:r>
-        <w:t xml:space="preserve"> </w:t>
       </w:r>
     </w:p>
     <w:p>

</xml_diff>

<commit_message>
Polish + de-AI pass (humanize prose across all sections; preserve all numbers/citations/tables verified); add 2002-2024 physical-stock robustness note to 3.2.7; abstract 250w
Co-Authored-By: Claude Opus 4.8 (1M context) <noreply@anthropic.com>
</commit_message>
<xml_diff>
--- a/05-manuscript/submission/manuscript_R2.docx
+++ b/05-manuscript/submission/manuscript_R2.docx
@@ -22,6 +22,26 @@
         </w:rPr>
         <w:t xml:space="preserve">Hongyang Xi¹†* · Liu Can²† · Zhihui Li¹</w:t>
       </w:r>
+      <w:r>
+        <w:t xml:space="preserve"> </w:t>
+      </w:r>
+      <w:r>
+        <w:rPr>
+          <w:i/>
+          <w:iCs/>
+        </w:rPr>
+        <w:t xml:space="preserve">¹ Chongqing Survey Institute Co., Ltd., Chongqing, China · ² Urban and Rural Planning, Guangzhou College of Applied Science and Technology, Guangzhou, China</w:t>
+      </w:r>
+      <w:r>
+        <w:t xml:space="preserve"> </w:t>
+      </w:r>
+      <w:r>
+        <w:rPr>
+          <w:i/>
+          <w:iCs/>
+        </w:rPr>
+        <w:t xml:space="preserve">† co-first authors (equal contribution) · * corresponding author: 26708155@alu.cqu.edu.cn</w:t>
+      </w:r>
     </w:p>
     <w:p>
       <w:r>
@@ -77,36 +97,7 @@
         <w:t xml:space="preserve"> </w:t>
       </w:r>
       <w:r>
-        <w:t xml:space="preserve">infrastructure language in bureaucratic documents, applied to 6,294 Chinese municipal government work reports (282 prefectures, 2002–2024). VAI is motivated by a cadre-attention model; we separate what it measures — visible-versus-functional language — from the stronger claim of strategic</w:t>
-      </w:r>
-      <w:r>
-        <w:t xml:space="preserve"> </w:t>
-      </w:r>
-      <w:r>
-        <w:rPr>
-          <w:b/>
-          <w:bCs/>
-        </w:rPr>
-        <w:t xml:space="preserve">visibility bias</w:t>
-      </w:r>
-      <w:r>
-        <w:t xml:space="preserve">. We validate VAI at the passage level against human coding (two coders, Cohen κ = 0.70) and report its limits: a naive appearance-word dictionary reaches only</w:t>
-      </w:r>
-      <w:r>
-        <w:t xml:space="preserve"> </w:t>
-      </w:r>
-      <w:r>
-        <w:rPr>
-          <w:b/>
-          <w:bCs/>
-        </w:rPr>
-        <w:t xml:space="preserve">0.10</w:t>
-      </w:r>
-      <w:r>
-        <w:t xml:space="preserve"> </w:t>
-      </w:r>
-      <w:r>
-        <w:t xml:space="preserve">precision, as polysemous image terms </w:t>
+        <w:t xml:space="preserve">infrastructure language in bureaucratic documents, applied to 6,294 Chinese municipal government work reports (282 prefectures, 2002–2024). VAI is motivated by a cadre-attention model. We separate what it measures, visible-versus-functional language, from the stronger claim of strategic visibility bias. We validate VAI at the passage level against human coding (two coders, Cohen κ = 0.70) and report its limits plainly. A naive appearance-word dictionary reaches only 0.10 precision, because polysemous image terms </w:t>
       </w:r>
       <w:r>
         <w:rPr>
@@ -156,84 +147,7 @@
         <w:t xml:space="preserve">“model”</w:t>
       </w:r>
       <w:r>
-        <w:t xml:space="preserve">) fire outside infrastructure; a concrete, salience-based lexicon reaches</w:t>
-      </w:r>
-      <w:r>
-        <w:t xml:space="preserve"> </w:t>
-      </w:r>
-      <w:r>
-        <w:rPr>
-          <w:b/>
-          <w:bCs/>
-        </w:rPr>
-        <w:t xml:space="preserve">0.50–0.60</w:t>
-      </w:r>
-      <w:r>
-        <w:t xml:space="preserve"> </w:t>
-      </w:r>
-      <w:r>
-        <w:t xml:space="preserve">but meets a</w:t>
-      </w:r>
-      <w:r>
-        <w:t xml:space="preserve"> </w:t>
-      </w:r>
-      <w:r>
-        <w:rPr>
-          <w:b/>
-          <w:bCs/>
-        </w:rPr>
-        <w:t xml:space="preserve">polysemy ceiling</w:t>
-      </w:r>
-      <w:r>
-        <w:t xml:space="preserve">; and an</w:t>
-      </w:r>
-      <w:r>
-        <w:t xml:space="preserve"> </w:t>
-      </w:r>
-      <w:r>
-        <w:rPr>
-          <w:b/>
-          <w:bCs/>
-        </w:rPr>
-        <w:t xml:space="preserve">LLM ensemble</w:t>
-      </w:r>
-      <w:r>
-        <w:t xml:space="preserve"> </w:t>
-      </w:r>
-      <w:r>
-        <w:t xml:space="preserve">clears it (0.84 accuracy; inter-model Fleiss κ = 0.835). Decisively, we add a behavioral</w:t>
-      </w:r>
-      <w:r>
-        <w:t xml:space="preserve"> </w:t>
-      </w:r>
-      <w:r>
-        <w:rPr>
-          <w:b/>
-          <w:bCs/>
-        </w:rPr>
-        <w:t xml:space="preserve">criterion-validity</w:t>
-      </w:r>
-      <w:r>
-        <w:t xml:space="preserve"> </w:t>
-      </w:r>
-      <w:r>
-        <w:t xml:space="preserve">test: under quasi-exogenous, retirement-driven secretary turnover, the concrete VAI co-moves with</w:t>
-      </w:r>
-      <w:r>
-        <w:t xml:space="preserve"> </w:t>
-      </w:r>
-      <w:r>
-        <w:rPr>
-          <w:i/>
-          <w:iCs/>
-        </w:rPr>
-        <w:t xml:space="preserve">real</w:t>
-      </w:r>
-      <w:r>
-        <w:t xml:space="preserve"> </w:t>
-      </w:r>
-      <w:r>
-        <w:t xml:space="preserve">cosmetic investment (+0.010, p = 0.01; clean pre-trends) while the naive measure does not (+0.002) — evidence that the valid measure tracks strategic attention, not genre. Descriptively, within-city VAI tracks the Cosmetic Investment Ratio (β = +0.111), and an independent procurement corpus (≈2.96M Zhejiang records) corroborates the tilt (visible projects ≈2-to-1 over functional, in 97 of 108 localities). A failed third-party Wikipedia test (r = −0.15), an inspection event study, a CFPS micro-foundation, and a welfare calibration are reported transparently and demoted. The contribution is methodological: a pre-registered, passage-validated, behaviorally-anchored instrument — with an honest map of where the dictionary stops and an LLM alternative begins.</w:t>
+        <w:t xml:space="preserve">) fire outside infrastructure. A concrete, salience-based lexicon reaches 0.50–0.60 but meets a polysemy ceiling, above which only an LLM ensemble attains high precision (0.84 accuracy; inter-model Fleiss κ = 0.835). We then add a behavioral criterion-validity test. Under quasi-exogenous, retirement-driven secretary turnover, the concrete VAI co-moves with real cosmetic investment (+0.010, p = 0.01; clean pre-trends) while the naive measure does not (+0.002); the valid measure tracks strategic attention, not genre. Descriptively, within-city VAI tracks the Cosmetic Investment Ratio (β = +0.111), and an independent procurement corpus (≈2.96M Zhejiang records) corroborates the tilt, with visible projects running about 2-to-1 over functional in 97 of 108 localities. A failed third-party Wikipedia test (r = −0.15), an inspection event study, a CFPS micro-foundation, and a welfare calibration are reported transparently and demoted. The contribution is methodological: a pre-registered, passage-validated, behaviorally-anchored instrument, with an honest map of where the dictionary stops and an LLM alternative begins.</w:t>
       </w:r>
     </w:p>
     <w:p>
@@ -322,7 +236,7 @@
         <w:pStyle w:val="FirstParagraph"/>
       </w:pPr>
       <w:r>
-        <w:t xml:space="preserve">Measuring bureaucratic attention from text is a central challenge in political methodology. Political agents produce corpora of formal documents — legislative speeches, agency reports, municipal plans — whose lexical structure reveals</w:t>
+        <w:t xml:space="preserve">Measuring bureaucratic attention from text is a central challenge in political methodology. Political agents produce corpora of formal documents (legislative speeches, agency reports, municipal plans) whose lexical structure reveals</w:t>
       </w:r>
       <w:r>
         <w:t xml:space="preserve"> </w:t>
@@ -351,7 +265,7 @@
         <w:t xml:space="preserve">what matters to them</w:t>
       </w:r>
       <w:r>
-        <w:t xml:space="preserve">. Methodological advances over the past decade have moved from manual content analysis [1] to supervised topic models [2, 3], semi-supervised scaling [4], and large-language-model-assisted classification [5]. Yet most existing instruments are (i) monolingual (English-dominated), (ii) aimed at</w:t>
+        <w:t xml:space="preserve">. Methodological advances over the past decade have moved from manual content analysis [1] to supervised topic models [2, 3], semi-supervised scaling [4], and large-language-model-assisted classification [5]. Yet most existing instruments are monolingual (English-dominated), aim at</w:t>
       </w:r>
       <w:r>
         <w:t xml:space="preserve"> </w:t>
@@ -383,7 +297,7 @@
         <w:t xml:space="preserve"> </w:t>
       </w:r>
       <w:r>
-        <w:t xml:space="preserve">attention, and (iii) rarely pre-registered or subjected to the explicit construct-validity scrutiny standard in psychometrics [6, 7].</w:t>
+        <w:t xml:space="preserve">attention, and are rarely pre-registered or subjected to the explicit construct-validity scrutiny standard in psychometrics [6, 7].</w:t>
       </w:r>
     </w:p>
     <w:p>
@@ -391,7 +305,92 @@
         <w:pStyle w:val="BodyText"/>
       </w:pPr>
       <w:r>
-        <w:t xml:space="preserve">This paper contributes a pre-registered text-measurement instrument for a specific form of compositional policy attention: the rhetorical share of</w:t>
+        <w:t xml:space="preserve">This paper contributes a pre-registered text-measurement instrument for a specific form of compositional policy attention: the rhetorical share of visible versus functional infrastructure language in the Chinese municipal government work report (GWR). We are deliberate about the interpretive ladder. The Visibility Attention Index (VAI) measures</w:t>
+      </w:r>
+      <w:r>
+        <w:t xml:space="preserve"> </w:t>
+      </w:r>
+      <w:r>
+        <w:rPr>
+          <w:i/>
+          <w:iCs/>
+        </w:rPr>
+        <w:t xml:space="preserve">language</w:t>
+      </w:r>
+      <w:r>
+        <w:t xml:space="preserve">. The hypothesis that this language reflects strategic visibility bias, namely preferential attention to observationally-salient categories over less-salient but functionally-equivalent ones, is what</w:t>
+      </w:r>
+      <w:r>
+        <w:t xml:space="preserve"> </w:t>
+      </w:r>
+      <w:r>
+        <w:rPr>
+          <w:i/>
+          <w:iCs/>
+        </w:rPr>
+        <w:t xml:space="preserve">motivates</w:t>
+      </w:r>
+      <w:r>
+        <w:t xml:space="preserve"> </w:t>
+      </w:r>
+      <w:r>
+        <w:t xml:space="preserve">the instrument. Whether a city’s visible-infrastructure language reflects strategic signaling, genuine construction, central campaigns, fiscal capacity, or template convention is a question the measure enables. In this revision we go one step further than language alone and test, behaviorally, whether the valid measure moves with real money under an exogenous incentive shock (§3.2.7). The setting makes the strategic interpretation institutionally plausible. Prefecture officials prepare annual work reports within the target-responsibility evaluation system, addressed primarily to superior authorities whose observability over functional categories is limited, a consequentiality we document rather than assert (§3.1.0).</w:t>
+      </w:r>
+    </w:p>
+    <w:p>
+      <w:pPr>
+        <w:pStyle w:val="BodyText"/>
+      </w:pPr>
+      <w:r>
+        <w:t xml:space="preserve">We proceed in three moves.</w:t>
+      </w:r>
+    </w:p>
+    <w:p>
+      <w:pPr>
+        <w:pStyle w:val="BodyText"/>
+      </w:pPr>
+      <w:r>
+        <w:t xml:space="preserve">First, we formalize the compositional-attention problem as a cadre-attention model with an observability-asymmetry assumption (§2). An official allocates a fixed budget between visible and functional categories; the supervisor observes both with Gaussian noise, but the noise on functional categories is strictly larger (a finished boulevard is photographable; a replaced sewer main is not). The model yields the substantive motivation for the instrument and specifies what a</w:t>
+      </w:r>
+      <w:r>
+        <w:t xml:space="preserve"> </w:t>
+      </w:r>
+      <w:r>
+        <w:rPr>
+          <w:i/>
+          <w:iCs/>
+        </w:rPr>
+        <w:t xml:space="preserve">valid</w:t>
+      </w:r>
+      <w:r>
+        <w:t xml:space="preserve"> </w:t>
+      </w:r>
+      <w:r>
+        <w:t xml:space="preserve">measure of compositional attention should look like.</w:t>
+      </w:r>
+    </w:p>
+    <w:p>
+      <w:pPr>
+        <w:pStyle w:val="BodyText"/>
+      </w:pPr>
+      <w:r>
+        <w:t xml:space="preserve">Second, we construct VAI and validate it. In this revision we lead with the validation the original draft lacked and report each rung honestly (§3.2). (i) Direct passage-level validation against human coding (two independent coders, intercoder κ = 0.70) shows that a</w:t>
+      </w:r>
+      <w:r>
+        <w:t xml:space="preserve"> </w:t>
+      </w:r>
+      <w:r>
+        <w:rPr>
+          <w:i/>
+          <w:iCs/>
+        </w:rPr>
+        <w:t xml:space="preserve">naive</w:t>
+      </w:r>
+      <w:r>
+        <w:t xml:space="preserve"> </w:t>
+      </w:r>
+      <w:r>
+        <w:t xml:space="preserve">appearance-word dictionary fails: visible-class precision is only</w:t>
       </w:r>
       <w:r>
         <w:t xml:space="preserve"> </w:t>
@@ -401,13 +400,60 @@
           <w:b/>
           <w:bCs/>
         </w:rPr>
-        <w:t xml:space="preserve">visible</w:t>
-      </w:r>
-      <w:r>
-        <w:t xml:space="preserve"> </w:t>
-      </w:r>
-      <w:r>
-        <w:t xml:space="preserve">versus</w:t>
+        <w:t xml:space="preserve">0.10</w:t>
+      </w:r>
+      <w:r>
+        <w:t xml:space="preserve">, because polysemous image terms </w:t>
+      </w:r>
+      <w:r>
+        <w:rPr>
+          <w:rFonts w:hint="eastAsia"/>
+        </w:rPr>
+        <w:t xml:space="preserve">(形象</w:t>
+      </w:r>
+      <w:r>
+        <w:t xml:space="preserve"> </w:t>
+      </w:r>
+      <w:r>
+        <w:rPr>
+          <w:i/>
+          <w:iCs/>
+        </w:rPr>
+        <w:t xml:space="preserve">xíngxiàng</w:t>
+      </w:r>
+      <w:r>
+        <w:t xml:space="preserve"> </w:t>
+      </w:r>
+      <w:r>
+        <w:t xml:space="preserve">“image”</w:t>
+      </w:r>
+      <w:r>
+        <w:t xml:space="preserve">; </w:t>
+      </w:r>
+      <w:r>
+        <w:rPr>
+          <w:rFonts w:hint="eastAsia"/>
+        </w:rPr>
+        <w:t xml:space="preserve">示范</w:t>
+      </w:r>
+      <w:r>
+        <w:t xml:space="preserve"> </w:t>
+      </w:r>
+      <w:r>
+        <w:rPr>
+          <w:i/>
+          <w:iCs/>
+        </w:rPr>
+        <w:t xml:space="preserve">shìfàn</w:t>
+      </w:r>
+      <w:r>
+        <w:t xml:space="preserve"> </w:t>
+      </w:r>
+      <w:r>
+        <w:t xml:space="preserve">“model/demonstration”</w:t>
+      </w:r>
+      <w:r>
+        <w:t xml:space="preserve">) fire pervasively outside infrastructure. (ii) A concrete, salience-based lexicon, the VAI lexicon we recommend, raises precision to</w:t>
       </w:r>
       <w:r>
         <w:t xml:space="preserve"> </w:t>
@@ -417,13 +463,16 @@
           <w:b/>
           <w:bCs/>
         </w:rPr>
-        <w:t xml:space="preserve">functional</w:t>
-      </w:r>
-      <w:r>
-        <w:t xml:space="preserve"> </w:t>
-      </w:r>
-      <w:r>
-        <w:t xml:space="preserve">infrastructure language in the Chinese municipal government work report (GWR). We are deliberate about the interpretive ladder. The Visibility Attention Index (VAI) measures</w:t>
+        <w:t xml:space="preserve">0.50, and 0.60 after targeted refinement, at 0.79 recall</w:t>
+      </w:r>
+      <w:r>
+        <w:t xml:space="preserve">, but meets a polysemy ceiling near 0.60–0.64 that curation cannot break </w:t>
+      </w:r>
+      <w:r>
+        <w:rPr>
+          <w:rFonts w:hint="eastAsia"/>
+        </w:rPr>
+        <w:t xml:space="preserve">(道路</w:t>
       </w:r>
       <w:r>
         <w:t xml:space="preserve"> </w:t>
@@ -433,10 +482,35 @@
           <w:i/>
           <w:iCs/>
         </w:rPr>
-        <w:t xml:space="preserve">language</w:t>
-      </w:r>
-      <w:r>
-        <w:t xml:space="preserve">; the hypothesis that this language reflects strategic</w:t>
+        <w:t xml:space="preserve">dàolù</w:t>
+      </w:r>
+      <w:r>
+        <w:t xml:space="preserve"> </w:t>
+      </w:r>
+      <w:r>
+        <w:t xml:space="preserve">“road”</w:t>
+      </w:r>
+      <w:r>
+        <w:t xml:space="preserve"> </w:t>
+      </w:r>
+      <w:r>
+        <w:t xml:space="preserve">also names the</w:t>
+      </w:r>
+      <w:r>
+        <w:t xml:space="preserve"> </w:t>
+      </w:r>
+      <w:r>
+        <w:rPr>
+          <w:i/>
+          <w:iCs/>
+        </w:rPr>
+        <w:t xml:space="preserve">path</w:t>
+      </w:r>
+      <w:r>
+        <w:t xml:space="preserve"> </w:t>
+      </w:r>
+      <w:r>
+        <w:t xml:space="preserve">of industrialization). (iii) For users who need higher passage precision, an LLM-ensemble classifier attains</w:t>
       </w:r>
       <w:r>
         <w:t xml:space="preserve"> </w:t>
@@ -446,13 +520,13 @@
           <w:b/>
           <w:bCs/>
         </w:rPr>
-        <w:t xml:space="preserve">visibility bias</w:t>
-      </w:r>
-      <w:r>
-        <w:t xml:space="preserve"> </w:t>
-      </w:r>
-      <w:r>
-        <w:t xml:space="preserve">— preferential attention to observationally-salient categories over less-salient but functionally-equivalent ones — is what</w:t>
+        <w:t xml:space="preserve">0.84 accuracy</w:t>
+      </w:r>
+      <w:r>
+        <w:t xml:space="preserve"> </w:t>
+      </w:r>
+      <w:r>
+        <w:t xml:space="preserve">(inter-model Fleiss κ = 0.835), above the dictionary ceiling. (iv) A behavioral criterion-validity test (§3.2.7): under quasi-exogenous, retirement-driven secretary turnover, the concrete VAI co-moves with</w:t>
       </w:r>
       <w:r>
         <w:t xml:space="preserve"> </w:t>
@@ -462,52 +536,23 @@
           <w:i/>
           <w:iCs/>
         </w:rPr>
-        <w:t xml:space="preserve">motivates</w:t>
-      </w:r>
-      <w:r>
-        <w:t xml:space="preserve"> </w:t>
-      </w:r>
-      <w:r>
-        <w:t xml:space="preserve">the instrument. Whether a city’s visible-infrastructure language reflects strategic signaling, genuine construction, central campaigns, fiscal capacity, or template convention is a question the measure enables; in this revision we go one decisive step further than language alone and test, behaviorally, whether the valid measure moves with real money under an exogenous incentive shock (§3.2.7). The setting makes the strategic interpretation institutionally plausible: prefecture officials prepare annual work reports within the target-responsibility evaluation system, addressed primarily to superior authorities whose observability over functional categories is limited — a consequentiality we document rather than assert (§3.1.0).</w:t>
-      </w:r>
-    </w:p>
-    <w:p>
-      <w:pPr>
-        <w:pStyle w:val="BodyText"/>
-      </w:pPr>
-      <w:r>
-        <w:t xml:space="preserve">We proceed in three moves.</w:t>
-      </w:r>
-    </w:p>
-    <w:p>
-      <w:pPr>
-        <w:pStyle w:val="BodyText"/>
-      </w:pPr>
-      <w:r>
-        <w:rPr>
-          <w:b/>
-          <w:bCs/>
-        </w:rPr>
-        <w:t xml:space="preserve">First</w:t>
-      </w:r>
-      <w:r>
-        <w:t xml:space="preserve">, we formalize the compositional-attention problem as a cadre-attention model with an observability-asymmetry assumption (§2). An official allocates a fixed budget between visible and functional categories; the supervisor observes both with Gaussian noise, but the noise on functional categories is strictly larger (a finished boulevard is photographable; a replaced sewer main is not). The model yields the substantive motivation for the instrument and specifies what a</w:t>
-      </w:r>
-      <w:r>
-        <w:t xml:space="preserve"> </w:t>
+        <w:t xml:space="preserve">real</w:t>
+      </w:r>
+      <w:r>
+        <w:t xml:space="preserve"> </w:t>
+      </w:r>
+      <w:r>
+        <w:t xml:space="preserve">accounting-based cosmetic investment (+0.010, p = 0.01; clean pre-trends), whereas the naive measure does not (+0.002, p = 0.54). Co-movement with money under an exogenous shock is what separates a strategic-attention measure from a genre artifact. We complement these with reliability and external checks, each labelled for what it shows: an independent-lexicon replication (</w:t>
       </w:r>
       <w:r>
         <w:rPr>
           <w:i/>
           <w:iCs/>
         </w:rPr>
-        <w:t xml:space="preserve">valid</w:t>
-      </w:r>
-      <w:r>
-        <w:t xml:space="preserve"> </w:t>
-      </w:r>
-      <w:r>
-        <w:t xml:space="preserve">measure of compositional attention should look like.</w:t>
+        <w:t xml:space="preserve">reliability</w:t>
+      </w:r>
+      <w:r>
+        <w:t xml:space="preserve">, r = 0.93), the MOHURD cross-source correlation (modest external anchor, r = 0.24), a within-document review-vs-plan differential (suggestive; may reflect genre), and a pre-registered third-party Wikipedia test that fails (r = −0.15) and is reported plainly as bounding the instrument’s domain.</w:t>
       </w:r>
     </w:p>
     <w:p>
@@ -515,319 +560,7 @@
         <w:pStyle w:val="BodyText"/>
       </w:pPr>
       <w:r>
-        <w:rPr>
-          <w:b/>
-          <w:bCs/>
-        </w:rPr>
-        <w:t xml:space="preserve">Second</w:t>
-      </w:r>
-      <w:r>
-        <w:t xml:space="preserve">, we construct VAI and validate it — and, in this revision, we lead with the validation the original draft lacked and report each rung honestly (§3.2). (i)</w:t>
-      </w:r>
-      <w:r>
-        <w:t xml:space="preserve"> </w:t>
-      </w:r>
-      <w:r>
-        <w:rPr>
-          <w:b/>
-          <w:bCs/>
-        </w:rPr>
-        <w:t xml:space="preserve">Direct passage-level validation</w:t>
-      </w:r>
-      <w:r>
-        <w:t xml:space="preserve"> </w:t>
-      </w:r>
-      <w:r>
-        <w:t xml:space="preserve">against human coding (two independent coders, intercoder κ = 0.70) shows that a</w:t>
-      </w:r>
-      <w:r>
-        <w:t xml:space="preserve"> </w:t>
-      </w:r>
-      <w:r>
-        <w:rPr>
-          <w:i/>
-          <w:iCs/>
-        </w:rPr>
-        <w:t xml:space="preserve">naive</w:t>
-      </w:r>
-      <w:r>
-        <w:t xml:space="preserve"> </w:t>
-      </w:r>
-      <w:r>
-        <w:t xml:space="preserve">appearance-word dictionary fails: visible-class precision is only</w:t>
-      </w:r>
-      <w:r>
-        <w:t xml:space="preserve"> </w:t>
-      </w:r>
-      <w:r>
-        <w:rPr>
-          <w:b/>
-          <w:bCs/>
-        </w:rPr>
-        <w:t xml:space="preserve">0.10</w:t>
-      </w:r>
-      <w:r>
-        <w:t xml:space="preserve">, because polysemous image terms </w:t>
-      </w:r>
-      <w:r>
-        <w:rPr>
-          <w:rFonts w:hint="eastAsia"/>
-        </w:rPr>
-        <w:t xml:space="preserve">(形象</w:t>
-      </w:r>
-      <w:r>
-        <w:t xml:space="preserve"> </w:t>
-      </w:r>
-      <w:r>
-        <w:rPr>
-          <w:i/>
-          <w:iCs/>
-        </w:rPr>
-        <w:t xml:space="preserve">xíngxiàng</w:t>
-      </w:r>
-      <w:r>
-        <w:t xml:space="preserve"> </w:t>
-      </w:r>
-      <w:r>
-        <w:t xml:space="preserve">“image”</w:t>
-      </w:r>
-      <w:r>
-        <w:t xml:space="preserve">; </w:t>
-      </w:r>
-      <w:r>
-        <w:rPr>
-          <w:rFonts w:hint="eastAsia"/>
-        </w:rPr>
-        <w:t xml:space="preserve">示范</w:t>
-      </w:r>
-      <w:r>
-        <w:t xml:space="preserve"> </w:t>
-      </w:r>
-      <w:r>
-        <w:rPr>
-          <w:i/>
-          <w:iCs/>
-        </w:rPr>
-        <w:t xml:space="preserve">shìfàn</w:t>
-      </w:r>
-      <w:r>
-        <w:t xml:space="preserve"> </w:t>
-      </w:r>
-      <w:r>
-        <w:t xml:space="preserve">“model/demonstration”</w:t>
-      </w:r>
-      <w:r>
-        <w:t xml:space="preserve">) fire pervasively outside infrastructure. (ii) A</w:t>
-      </w:r>
-      <w:r>
-        <w:t xml:space="preserve"> </w:t>
-      </w:r>
-      <w:r>
-        <w:rPr>
-          <w:b/>
-          <w:bCs/>
-        </w:rPr>
-        <w:t xml:space="preserve">concrete, salience-based lexicon</w:t>
-      </w:r>
-      <w:r>
-        <w:t xml:space="preserve"> </w:t>
-      </w:r>
-      <w:r>
-        <w:t xml:space="preserve">— the VAI lexicon we recommend — raises precision to</w:t>
-      </w:r>
-      <w:r>
-        <w:t xml:space="preserve"> </w:t>
-      </w:r>
-      <w:r>
-        <w:rPr>
-          <w:b/>
-          <w:bCs/>
-        </w:rPr>
-        <w:t xml:space="preserve">0.50, and 0.60 after targeted refinement, at 0.79 recall</w:t>
-      </w:r>
-      <w:r>
-        <w:t xml:space="preserve">, but meets a</w:t>
-      </w:r>
-      <w:r>
-        <w:t xml:space="preserve"> </w:t>
-      </w:r>
-      <w:r>
-        <w:rPr>
-          <w:b/>
-          <w:bCs/>
-        </w:rPr>
-        <w:t xml:space="preserve">polysemy ceiling</w:t>
-      </w:r>
-      <w:r>
-        <w:t xml:space="preserve"> </w:t>
-      </w:r>
-      <w:r>
-        <w:t xml:space="preserve">near 0.60–0.64 that curation cannot break </w:t>
-      </w:r>
-      <w:r>
-        <w:rPr>
-          <w:rFonts w:hint="eastAsia"/>
-        </w:rPr>
-        <w:t xml:space="preserve">(道路</w:t>
-      </w:r>
-      <w:r>
-        <w:t xml:space="preserve"> </w:t>
-      </w:r>
-      <w:r>
-        <w:rPr>
-          <w:i/>
-          <w:iCs/>
-        </w:rPr>
-        <w:t xml:space="preserve">dàolù</w:t>
-      </w:r>
-      <w:r>
-        <w:t xml:space="preserve"> </w:t>
-      </w:r>
-      <w:r>
-        <w:t xml:space="preserve">“road”</w:t>
-      </w:r>
-      <w:r>
-        <w:t xml:space="preserve"> </w:t>
-      </w:r>
-      <w:r>
-        <w:t xml:space="preserve">also names the</w:t>
-      </w:r>
-      <w:r>
-        <w:t xml:space="preserve"> </w:t>
-      </w:r>
-      <w:r>
-        <w:rPr>
-          <w:i/>
-          <w:iCs/>
-        </w:rPr>
-        <w:t xml:space="preserve">path</w:t>
-      </w:r>
-      <w:r>
-        <w:t xml:space="preserve"> </w:t>
-      </w:r>
-      <w:r>
-        <w:t xml:space="preserve">of industrialization). (iii) For users who need higher passage precision, an</w:t>
-      </w:r>
-      <w:r>
-        <w:t xml:space="preserve"> </w:t>
-      </w:r>
-      <w:r>
-        <w:rPr>
-          <w:b/>
-          <w:bCs/>
-        </w:rPr>
-        <w:t xml:space="preserve">LLM-ensemble classifier</w:t>
-      </w:r>
-      <w:r>
-        <w:t xml:space="preserve"> </w:t>
-      </w:r>
-      <w:r>
-        <w:t xml:space="preserve">attains</w:t>
-      </w:r>
-      <w:r>
-        <w:t xml:space="preserve"> </w:t>
-      </w:r>
-      <w:r>
-        <w:rPr>
-          <w:b/>
-          <w:bCs/>
-        </w:rPr>
-        <w:t xml:space="preserve">0.84 accuracy</w:t>
-      </w:r>
-      <w:r>
-        <w:t xml:space="preserve"> </w:t>
-      </w:r>
-      <w:r>
-        <w:t xml:space="preserve">(inter-model Fleiss κ = 0.835), above the dictionary ceiling. (iv) Decisively, a</w:t>
-      </w:r>
-      <w:r>
-        <w:t xml:space="preserve"> </w:t>
-      </w:r>
-      <w:r>
-        <w:rPr>
-          <w:b/>
-          <w:bCs/>
-        </w:rPr>
-        <w:t xml:space="preserve">behavioral criterion-validity test</w:t>
-      </w:r>
-      <w:r>
-        <w:t xml:space="preserve"> </w:t>
-      </w:r>
-      <w:r>
-        <w:t xml:space="preserve">(§3.2.7): under quasi-exogenous, retirement-driven secretary turnover, the concrete VAI co-moves with</w:t>
-      </w:r>
-      <w:r>
-        <w:t xml:space="preserve"> </w:t>
-      </w:r>
-      <w:r>
-        <w:rPr>
-          <w:i/>
-          <w:iCs/>
-        </w:rPr>
-        <w:t xml:space="preserve">real</w:t>
-      </w:r>
-      <w:r>
-        <w:t xml:space="preserve"> </w:t>
-      </w:r>
-      <w:r>
-        <w:t xml:space="preserve">accounting-based cosmetic investment (+0.010, p = 0.01; clean pre-trends), whereas the naive measure does not (+0.002, p = 0.54). Co-movement with money under an exogenous shock is what separates a strategic-attention measure from a genre artifact. We complement these with reliability and external checks, each labelled for what it shows: an independent-lexicon replication (</w:t>
-      </w:r>
-      <w:r>
-        <w:rPr>
-          <w:i/>
-          <w:iCs/>
-        </w:rPr>
-        <w:t xml:space="preserve">reliability</w:t>
-      </w:r>
-      <w:r>
-        <w:t xml:space="preserve">, r = 0.93), the MOHURD cross-source correlation (modest external anchor, r = 0.24), a within-document review-vs-plan differential (suggestive; may reflect genre), and a pre-registered third-party Wikipedia test that</w:t>
-      </w:r>
-      <w:r>
-        <w:t xml:space="preserve"> </w:t>
-      </w:r>
-      <w:r>
-        <w:rPr>
-          <w:b/>
-          <w:bCs/>
-        </w:rPr>
-        <w:t xml:space="preserve">fails</w:t>
-      </w:r>
-      <w:r>
-        <w:t xml:space="preserve"> </w:t>
-      </w:r>
-      <w:r>
-        <w:t xml:space="preserve">(r = −0.15) and is reported plainly as bounding the instrument’s domain.</w:t>
-      </w:r>
-    </w:p>
-    <w:p>
-      <w:pPr>
-        <w:pStyle w:val="BodyText"/>
-      </w:pPr>
-      <w:r>
-        <w:rPr>
-          <w:b/>
-          <w:bCs/>
-        </w:rPr>
-        <w:t xml:space="preserve">Third</w:t>
-      </w:r>
-      <w:r>
-        <w:t xml:space="preserve">, we present descriptive applications of VAI (§4): a within-city association between VAI and the accounting-based Cosmetic Investment Ratio (β = +0.111, p = 0.002), reported as compositional substitution rather than a causal effect; and — new in this revision — an</w:t>
-      </w:r>
-      <w:r>
-        <w:t xml:space="preserve"> </w:t>
-      </w:r>
-      <w:r>
-        <w:rPr>
-          <w:b/>
-          <w:bCs/>
-        </w:rPr>
-        <w:t xml:space="preserve">independent public-procurement corpus</w:t>
-      </w:r>
-      <w:r>
-        <w:t xml:space="preserve"> </w:t>
-      </w:r>
-      <w:r>
-        <w:t xml:space="preserve">(≈2.96M Zhejiang bidding records) in which visible-type construction projects outnumber functional ones ≈2-to-1 (in 97 of 108 localities), corroborating the compositional tilt in an entirely separate, large-scale data source. Three exercises a previous draft foregrounded are demoted to the appendix and reported transparently as failed or assumption-dependent: a central-inspection event study that does not survive heterogeneity-robust estimation, a CFPS micro-foundation test that detects no effect above |d| = 0.011, and a structural welfare calibration too assumption-dependent to headline.</w:t>
+        <w:t xml:space="preserve">Third, we present descriptive applications of VAI (§4). One is a within-city association between VAI and the accounting-based Cosmetic Investment Ratio (β = +0.111, p = 0.002), reported as compositional substitution rather than a causal effect. The other, new in this revision, is an independent public-procurement corpus (≈2.96M Zhejiang bidding records) in which visible-type construction projects outnumber functional ones ≈2-to-1 (in 97 of 108 localities), corroborating the compositional tilt in an entirely separate, large-scale data source. Three exercises a previous draft foregrounded are demoted to the appendix and reported transparently as failed or assumption-dependent: a central-inspection event study that does not survive heterogeneity-robust estimation, a CFPS micro-foundation test that detects no effect above |d| = 0.011, and a structural welfare calibration too assumption-dependent to headline.</w:t>
       </w:r>
     </w:p>
     <w:bookmarkStart w:id="13" w:name="contribution"/>
@@ -926,7 +659,7 @@
         <w:t xml:space="preserve"> </w:t>
       </w:r>
       <w:r>
-        <w:t xml:space="preserve">from text — expressed priorities in legislative communication, agenda-setting, audience-targeting, and cross-domain priority classification [2, 3, 4, 8, 18, 19]. VAI is a domain-specific instance: an interpretable, expert-coded measure of</w:t>
+        <w:t xml:space="preserve">from text, including expressed priorities in legislative communication, agenda-setting, audience-targeting, and cross-domain priority classification [2, 3, 4, 8, 18, 19]. VAI is a domain-specific instance: an interpretable, expert-coded measure of</w:t>
       </w:r>
       <w:r>
         <w:t xml:space="preserve"> </w:t>
@@ -963,7 +696,7 @@
         <w:t xml:space="preserve"> </w:t>
       </w:r>
       <w:r>
-        <w:t xml:space="preserve">Rather than defend a dictionary by face validity and an aggregate correlation, we report its passage-level precision ceiling, supply an LLM route past it, and — most importantly — show that the</w:t>
+        <w:t xml:space="preserve">Rather than defend a dictionary by face validity and an aggregate correlation, we report its passage-level precision ceiling and supply an LLM route past it. The central result is that the</w:t>
       </w:r>
       <w:r>
         <w:t xml:space="preserve"> </w:t>
@@ -1000,7 +733,7 @@
         <w:t xml:space="preserve"> </w:t>
       </w:r>
       <w:r>
-        <w:t xml:space="preserve">We pre-register the instrument and its validity tests at OSF (DOI 10.17605/OSF.IO/ZMJY5) and report all null and failed results — a failed third-party validation, a non-robust causal event study, a null micro-foundation test — transparently [9, 10].</w:t>
+        <w:t xml:space="preserve">We pre-register the instrument and its validity tests at OSF (DOI 10.17605/OSF.IO/ZMJY5) and report all null and failed results transparently [9, 10]. These include a failed third-party validation, a non-robust causal event study, and a null micro-foundation test.</w:t>
       </w:r>
     </w:p>
     <w:p>
@@ -1026,7 +759,7 @@
         <w:pStyle w:val="FirstParagraph"/>
       </w:pPr>
       <w:r>
-        <w:t xml:space="preserve">Section 2 develops the cadre-attention model as motivation. Section 3 describes VAI construction (§3.1) and its validation (§3.2), led by the passage-level human validation and the behavioral criterion-validity test. Section 4 presents the descriptive application (VAI vs accounting-based investment composition), the independent procurement corroboration, and — demoted to supporting material — the exercises that do not support causal or welfare claims. Section 5 discusses scope, portability, and limitations; Section 6 concludes. Five deviations from the pre-registration are logged in Appendix D with reasons and effect-on-sign-and-significance; the replication archive is at Zenodo (DOI 10.5281/zenodo.19569978) and pre-registration at OSF (DOI 10.17605/OSF.IO/ZMJY5).</w:t>
+        <w:t xml:space="preserve">Section 2 develops the cadre-attention model as motivation. Section 3 describes VAI construction (§3.1) and its validation (§3.2), led by the passage-level human validation and the behavioral criterion-validity test. Section 4 presents the descriptive application (VAI vs accounting-based investment composition), the independent procurement corroboration, and, demoted to supporting material, the exercises that do not support causal or welfare claims. Section 5 discusses scope, portability, and limitations; Section 6 concludes. Five deviations from the pre-registration are logged in Appendix D with reasons and effect-on-sign-and-significance; the replication archive is at Zenodo (DOI 10.5281/zenodo.19569978) and pre-registration at OSF (DOI 10.17605/OSF.IO/ZMJY5).</w:t>
       </w:r>
     </w:p>
     <w:bookmarkEnd w:id="14"/>
@@ -1045,7 +778,7 @@
         <w:pStyle w:val="FirstParagraph"/>
       </w:pPr>
       <w:r>
-        <w:t xml:space="preserve">This section states, in light form, why we expect compositional text-rhetoric to carry information about visibility bias, and what that implies for validation. The point of the section is to</w:t>
+        <w:t xml:space="preserve">This section states, in light form, why we expect compositional text-rhetoric to carry information about visibility bias, and what that implies for validation. Its purpose is to</w:t>
       </w:r>
       <w:r>
         <w:t xml:space="preserve"> </w:t>
@@ -1058,7 +791,10 @@
         <w:t xml:space="preserve">motivate the measurement problem and define the construct</w:t>
       </w:r>
       <w:r>
-        <w:t xml:space="preserve">, not to identify structural parameters. A fuller formal treatment — an official’s allocation problem under precision-weighted evaluation, with closed-form comparative statics — is in Online Appendix A; nothing in the paper’s evidence depends on it, and we no longer headline the welfare expression it yields (§4.4, §5).</w:t>
+        <w:t xml:space="preserve"> </w:t>
+      </w:r>
+      <w:r>
+        <w:t xml:space="preserve">rather than to identify structural parameters. A fuller formal treatment, an official’s allocation problem under precision-weighted evaluation with closed-form comparative statics, is in Online Appendix A. Nothing in the paper’s evidence depends on it, and we no longer headline the welfare expression it yields (§4.4, §5).</w:t>
       </w:r>
     </w:p>
     <w:bookmarkStart w:id="16" w:name="Xef2cef74730964ad5a82ccbc169335cf38f717b"/>
@@ -1097,7 +833,7 @@
         <w:t xml:space="preserve"> </w:t>
       </w:r>
       <w:r>
-        <w:t xml:space="preserve">their output is to the audience that evaluates the official — primarily the superior (provincial) authority controlling promotion, secondarily inspectors, media, and citizens. We define</w:t>
+        <w:t xml:space="preserve">their output is to the audience that evaluates the official. That audience is primarily the superior (provincial) authority controlling promotion, and secondarily inspectors, media, and citizens. We define</w:t>
       </w:r>
       <w:r>
         <w:t xml:space="preserve"> </w:t>
@@ -1113,7 +849,7 @@
         <w:t xml:space="preserve"> </w:t>
       </w:r>
       <w:r>
-        <w:t xml:space="preserve">capital by observability/salience to that audience, not by physical surface:</w:t>
+        <w:t xml:space="preserve">capital by observability and salience to that audience rather than by physical surface:</w:t>
       </w:r>
     </w:p>
     <w:p>
@@ -1132,7 +868,7 @@
         <w:t xml:space="preserve">Visible</w:t>
       </w:r>
       <w:r>
-        <w:t xml:space="preserve">: output that the evaluating audience readily perceives and attributes to the incumbent — streetscapes, greening, squares, parks, lighting, landmarks, and</w:t>
+        <w:t xml:space="preserve">: output that the evaluating audience readily perceives and attributes to the incumbent: streetscapes, greening, squares, parks, lighting, landmarks, and</w:t>
       </w:r>
       <w:r>
         <w:t xml:space="preserve"> </w:t>
@@ -1145,7 +881,7 @@
         <w:t xml:space="preserve">metro/rail transit</w:t>
       </w:r>
       <w:r>
-        <w:t xml:space="preserve">. Metro is the diagnostic boundary case: its tunnels are underground, yet it is daily-used, media-celebrated, and an unmistakable prestige achievement, so it is maximally salient and coded visible.</w:t>
+        <w:t xml:space="preserve">. Metro is the diagnostic boundary case. Its tunnels are underground, yet it is daily-used, media-celebrated, and an unmistakable prestige achievement, so it is maximally salient and coded visible.</w:t>
       </w:r>
     </w:p>
     <w:p>
@@ -1164,7 +900,7 @@
         <w:t xml:space="preserve">Functional</w:t>
       </w:r>
       <w:r>
-        <w:t xml:space="preserve">: output that is concealed in normal operation and noticed mainly upon failure — drainage, water and gas pipe networks, sewerage, heating, structural safety.</w:t>
+        <w:t xml:space="preserve">: output that is concealed in normal operation and noticed mainly upon failure: drainage, water and gas pipe networks, sewerage, heating, and structural safety.</w:t>
       </w:r>
     </w:p>
     <w:p>
@@ -1172,20 +908,7 @@
         <w:pStyle w:val="FirstParagraph"/>
       </w:pPr>
       <w:r>
-        <w:t xml:space="preserve">The substantive premise is an</w:t>
-      </w:r>
-      <w:r>
-        <w:t xml:space="preserve"> </w:t>
-      </w:r>
-      <w:r>
-        <w:rPr>
-          <w:b/>
-          <w:bCs/>
-        </w:rPr>
-        <w:t xml:space="preserve">observability asymmetry</w:t>
-      </w:r>
-      <w:r>
-        <w:t xml:space="preserve">: the evaluating audience perceives visible categories with less noise than functional ones (</w:t>
+        <w:t xml:space="preserve">The substantive premise is an observability asymmetry. The evaluating audience perceives visible categories with less noise than functional ones (</w:t>
       </w:r>
       <m:oMath>
         <m:sSubSup>
@@ -1230,7 +953,7 @@
         </m:sSubSup>
       </m:oMath>
       <w:r>
-        <w:t xml:space="preserve">). Three independent proxies for the asymmetry — inspection frequency, media-reporting intensity, and the visibility of failures in the accident record — are consistent with it (Online Appendix C.4). The key conceptual move is that</w:t>
+        <w:t xml:space="preserve">). Three independent proxies for the asymmetry, namely inspection frequency, media-reporting intensity, and the visibility of failures in the accident record, are consistent with it (Online Appendix C.4). The conceptual move that matters here is that</w:t>
       </w:r>
       <w:r>
         <w:t xml:space="preserve"> </w:t>
@@ -1276,7 +999,7 @@
         <w:pStyle w:val="FirstParagraph"/>
       </w:pPr>
       <w:r>
-        <w:t xml:space="preserve">When evaluation is weighted toward what is observable, an official maximizing a mix of social and career returns tilts attention toward salient categories — and toward</w:t>
+        <w:t xml:space="preserve">When evaluation is weighted toward what is observable, an official maximizing a mix of social and career returns tilts attention toward salient categories, and toward</w:t>
       </w:r>
       <w:r>
         <w:t xml:space="preserve"> </w:t>
@@ -1292,7 +1015,7 @@
         <w:t xml:space="preserve"> </w:t>
       </w:r>
       <w:r>
-        <w:t xml:space="preserve">salient categories — because attention to the legible margin yields more perceived performance per yuan. Two implications follow for measurement, and they structure the rest of the paper:</w:t>
+        <w:t xml:space="preserve">salient categories, because attention to the legible margin yields more perceived performance per yuan. Two implications follow for measurement, and they structure the rest of the paper:</w:t>
       </w:r>
     </w:p>
     <w:p>
@@ -1303,17 +1026,7 @@
         </w:numPr>
       </w:pPr>
       <w:r>
-        <w:rPr>
-          <w:b/>
-          <w:bCs/>
-        </w:rPr>
-        <w:t xml:space="preserve">A valid text measure of compositional attention should track real visible-investment composition.</w:t>
-      </w:r>
-      <w:r>
-        <w:t xml:space="preserve"> </w:t>
-      </w:r>
-      <w:r>
-        <w:t xml:space="preserve">This is the basis for cross-source and, crucially, behavioral validation: the right measure should co-move with accounting-based cosmetic investment, and should do so under exogenous shifts in career incentives (§4).</w:t>
+        <w:t xml:space="preserve">A valid text measure of compositional attention should track real visible-investment composition. This is the basis for cross-source and, equally, behavioral validation: the right measure should co-move with accounting-based cosmetic investment, and should do so under exogenous shifts in career incentives (§4).</w:t>
       </w:r>
     </w:p>
     <w:p>
@@ -1324,17 +1037,7 @@
         </w:numPr>
       </w:pPr>
       <w:r>
-        <w:rPr>
-          <w:b/>
-          <w:bCs/>
-        </w:rPr>
-        <w:t xml:space="preserve">The signal lives in concrete, salience-bearing referents.</w:t>
-      </w:r>
-      <w:r>
-        <w:t xml:space="preserve"> </w:t>
-      </w:r>
-      <w:r>
-        <w:t xml:space="preserve">Because the construct is about</w:t>
+        <w:t xml:space="preserve">The signal lives in concrete, salience-bearing referents. Because the construct is about</w:t>
       </w:r>
       <w:r>
         <w:t xml:space="preserve"> </w:t>
@@ -1374,7 +1077,7 @@
         <w:t xml:space="preserve">“showcase”</w:t>
       </w:r>
       <w:r>
-        <w:t xml:space="preserve">). The latter are polysemous and decoupled from infrastructure, which §3 shows is the proximate cause of naive-dictionary failure.</w:t>
+        <w:t xml:space="preserve">). Those abstract words are polysemous and decoupled from infrastructure, which §3 shows is the proximate cause of naive-dictionary failure.</w:t>
       </w:r>
     </w:p>
     <w:bookmarkEnd w:id="17"/>
@@ -1392,7 +1095,7 @@
         <w:pStyle w:val="FirstParagraph"/>
       </w:pPr>
       <w:r>
-        <w:t xml:space="preserve">The model is a source of</w:t>
+        <w:t xml:space="preserve">The model yields</w:t>
       </w:r>
       <w:r>
         <w:t xml:space="preserve"> </w:t>
@@ -1405,7 +1108,7 @@
         <w:t xml:space="preserve">predictions about what a valid measure should look like and do</w:t>
       </w:r>
       <w:r>
-        <w:t xml:space="preserve">, not a source of causal identification of incentive parameters. We do not claim to estimate</w:t>
+        <w:t xml:space="preserve">. It is not a vehicle for causal identification of incentive parameters. We do not claim to estimate</w:t>
       </w:r>
       <w:r>
         <w:t xml:space="preserve"> </w:t>
@@ -1458,7 +1161,7 @@
         <w:t xml:space="preserve"> </w:t>
       </w:r>
       <w:r>
-        <w:t xml:space="preserve">or a welfare loss as a result; the structural welfare calibration that an earlier draft headlined is demoted to an assumption-dependent illustration (§4.4, Online Appendix A/C.7). A reader interested only in the measurement contribution can proceed directly to §3; the observability-asymmetry premise is invoked again only to interpret the behavioral co-movement in §4.</w:t>
+        <w:t xml:space="preserve">or a welfare loss as a result; the structural welfare calibration that an earlier draft headlined is demoted to an assumption-dependent illustration (§4.4, Online Appendix A/C.7). A reader interested only in the measurement contribution can proceed directly to §3. We invoke the observability-asymmetry premise again only to interpret the behavioral co-movement in §4.</w:t>
       </w:r>
     </w:p>
     <w:bookmarkEnd w:id="18"/>
@@ -1899,10 +1602,7 @@
         <w:t xml:space="preserve">compositional</w:t>
       </w:r>
       <w:r>
-        <w:t xml:space="preserve"> </w:t>
-      </w:r>
-      <w:r>
-        <w:t xml:space="preserve">— the share of attention across two substantively-paired asset classes within one policy domain — rather than position on an ideological continuum. Second, and the focus of this revision, we subject the instrument to two tests applied work usually omits: direct passage-level human validation</w:t>
+        <w:t xml:space="preserve">, the share of attention across two substantively-paired asset classes within one policy domain, rather than a position on an ideological continuum. Second, and the focus of this revision, we subject the instrument to two tests applied work usually omits: direct passage-level human validation</w:t>
       </w:r>
       <w:r>
         <w:t xml:space="preserve"> </w:t>
@@ -1949,66 +1649,124 @@
         <w:t xml:space="preserve"> </w:t>
       </w:r>
       <w:r>
-        <w:t xml:space="preserve">(GWRs) delivered at prefecture-level People’s Congresses. These reports — typically 20,000–60,000 Chinese characters — are the single most important institutional text a municipal government produces each year. Our corpus covers</w:t>
-      </w:r>
-      <w:r>
-        <w:t xml:space="preserve"> </w:t>
-      </w:r>
+        <w:t xml:space="preserve">(GWRs) delivered at prefecture-level People’s Congresses. These reports, typically 20,000–60,000 Chinese characters, are the single most important institutional text a municipal government produces each year. Our corpus covers 6,294 GWRs from 282 prefecture-level cities, 2002–2024, compiled from provincial government portals and the zhengfugongzuobaogao.com repository, each stored as a UTF-8 file indexed by standardized city name and year.</w:t>
+      </w:r>
+    </w:p>
+    <w:bookmarkStart w:id="21" w:name="Xb8588efde53b34b680f1d31b3beb2b1964c6a27"/>
+    <w:p>
+      <w:pPr>
+        <w:pStyle w:val="Heading3"/>
+      </w:pPr>
+      <w:r>
+        <w:t xml:space="preserve">3.1.0 Institutional role and consequentiality of government work reports</w:t>
+      </w:r>
+    </w:p>
+    <w:p>
+      <w:pPr>
+        <w:pStyle w:val="FirstParagraph"/>
+      </w:pPr>
+      <w:r>
+        <w:t xml:space="preserve">The paper’s premise is that GWRs are</w:t>
+      </w:r>
+      <w:r>
+        <w:t xml:space="preserve"> </w:t>
+      </w:r>
+      <w:r>
+        <w:rPr>
+          <w:i/>
+          <w:iCs/>
+        </w:rPr>
+        <w:t xml:space="preserve">consequential</w:t>
+      </w:r>
+      <w:r>
+        <w:t xml:space="preserve"> </w:t>
+      </w:r>
+      <w:r>
+        <w:t xml:space="preserve">texts whose composition reflects what officials choose to make salient. We document, rather than assert, the institutional basis.</w:t>
+      </w:r>
+    </w:p>
+    <w:p>
+      <w:pPr>
+        <w:pStyle w:val="BodyText"/>
+      </w:pPr>
       <w:r>
         <w:rPr>
           <w:b/>
           <w:bCs/>
         </w:rPr>
-        <w:t xml:space="preserve">6,294 GWRs</w:t>
-      </w:r>
-      <w:r>
-        <w:t xml:space="preserve"> </w:t>
-      </w:r>
-      <w:r>
-        <w:t xml:space="preserve">from</w:t>
-      </w:r>
-      <w:r>
-        <w:t xml:space="preserve"> </w:t>
-      </w:r>
+        <w:t xml:space="preserve">Drafting and approval.</w:t>
+      </w:r>
+      <w:r>
+        <w:t xml:space="preserve"> </w:t>
+      </w:r>
+      <w:r>
+        <w:t xml:space="preserve">A municipal GWR is drafted by the city government’s research office under the mayor’s direct supervision, revised through successive leadership readings, and formally delivered by the mayor to the annual session of the municipal People’s Congress, which reviews and votes to adopt it. It is therefore the government’s official, on-the-record statement of the year’s work and the coming year’s commitments, neither a personal essay nor a press release.</w:t>
+      </w:r>
+    </w:p>
+    <w:p>
+      <w:pPr>
+        <w:pStyle w:val="BodyText"/>
+      </w:pPr>
       <w:r>
         <w:rPr>
           <w:b/>
           <w:bCs/>
         </w:rPr>
-        <w:t xml:space="preserve">282 prefecture-level cities</w:t>
-      </w:r>
-      <w:r>
-        <w:t xml:space="preserve">,</w:t>
-      </w:r>
-      <w:r>
-        <w:t xml:space="preserve"> </w:t>
-      </w:r>
+        <w:t xml:space="preserve">Link to cadre evaluation.</w:t>
+      </w:r>
+      <w:r>
+        <w:t xml:space="preserve"> </w:t>
+      </w:r>
+      <w:r>
+        <w:t xml:space="preserve">Under the target-responsibility system and performance-assessment regime, the commitments enumerated in the GWR feed the quantified targets against which the prefecture’s leadership is subsequently assessed by the superior provincial Party authority. The report is an</w:t>
+      </w:r>
+      <w:r>
+        <w:t xml:space="preserve"> </w:t>
+      </w:r>
+      <w:r>
+        <w:rPr>
+          <w:i/>
+          <w:iCs/>
+        </w:rPr>
+        <w:t xml:space="preserve">input to</w:t>
+      </w:r>
+      <w:r>
+        <w:t xml:space="preserve"> </w:t>
+      </w:r>
+      <w:r>
+        <w:t xml:space="preserve">the promotion-relevant evaluation process, not merely a record of it.</w:t>
+      </w:r>
+    </w:p>
+    <w:p>
+      <w:pPr>
+        <w:pStyle w:val="BodyText"/>
+      </w:pPr>
       <w:r>
         <w:rPr>
           <w:b/>
           <w:bCs/>
         </w:rPr>
-        <w:t xml:space="preserve">2002–2024</w:t>
-      </w:r>
-      <w:r>
-        <w:t xml:space="preserve">, compiled from provincial government portals and the zhengfugongzuobaogao.com repository, each stored as a UTF-8 file indexed by standardized city name and year.</w:t>
-      </w:r>
-    </w:p>
-    <w:bookmarkStart w:id="21" w:name="Xb8588efde53b34b680f1d31b3beb2b1964c6a27"/>
-    <w:p>
-      <w:pPr>
-        <w:pStyle w:val="Heading3"/>
-      </w:pPr>
-      <w:r>
-        <w:t xml:space="preserve">3.1.0 Institutional role and consequentiality of government work reports</w:t>
-      </w:r>
-    </w:p>
-    <w:p>
-      <w:pPr>
-        <w:pStyle w:val="FirstParagraph"/>
-      </w:pPr>
-      <w:r>
-        <w:t xml:space="preserve">The paper’s premise is that GWRs are</w:t>
+        <w:t xml:space="preserve">Audiences and</w:t>
+      </w:r>
+      <w:r>
+        <w:rPr>
+          <w:b/>
+          <w:bCs/>
+        </w:rPr>
+        <w:t xml:space="preserve"> </w:t>
+      </w:r>
+      <w:r>
+        <w:rPr>
+          <w:b/>
+          <w:bCs/>
+        </w:rPr>
+        <w:t xml:space="preserve">“visible to whom.”</w:t>
+      </w:r>
+      <w:r>
+        <w:t xml:space="preserve"> </w:t>
+      </w:r>
+      <w:r>
+        <w:t xml:space="preserve">The GWR’s audiences include the promotion-controlling superior, the NPC delegates who vote on it, and the public and media to whom it is released. The audience relevant to our construct is the</w:t>
       </w:r>
       <w:r>
         <w:t xml:space="preserve"> </w:t>
@@ -2018,49 +1776,40 @@
           <w:i/>
           <w:iCs/>
         </w:rPr>
-        <w:t xml:space="preserve">consequential</w:t>
-      </w:r>
-      <w:r>
-        <w:t xml:space="preserve"> </w:t>
-      </w:r>
-      <w:r>
-        <w:t xml:space="preserve">texts whose composition reflects what officials choose to make salient. We document, rather than assert, the institutional basis.</w:t>
-      </w:r>
-    </w:p>
-    <w:p>
-      <w:pPr>
-        <w:pStyle w:val="BodyText"/>
-      </w:pPr>
-      <w:r>
-        <w:rPr>
-          <w:b/>
-          <w:bCs/>
-        </w:rPr>
-        <w:t xml:space="preserve">Drafting and approval.</w:t>
-      </w:r>
-      <w:r>
-        <w:t xml:space="preserve"> </w:t>
-      </w:r>
-      <w:r>
-        <w:t xml:space="preserve">A municipal GWR is drafted by the city government’s research office under the mayor’s direct supervision, revised through successive leadership readings, and formally delivered by the mayor to the annual session of the municipal People’s Congress, which reviews and votes to adopt it. It is therefore the government’s official, on-the-record statement of the year’s work and the coming year’s commitments — neither a personal essay nor a press release.</w:t>
-      </w:r>
-    </w:p>
-    <w:p>
-      <w:pPr>
-        <w:pStyle w:val="BodyText"/>
-      </w:pPr>
-      <w:r>
-        <w:rPr>
-          <w:b/>
-          <w:bCs/>
-        </w:rPr>
-        <w:t xml:space="preserve">Link to cadre evaluation.</w:t>
-      </w:r>
-      <w:r>
-        <w:t xml:space="preserve"> </w:t>
-      </w:r>
-      <w:r>
-        <w:t xml:space="preserve">Under the target-responsibility system and performance-assessment regime, the commitments enumerated in the GWR feed the quantified targets against which the prefecture’s leadership is subsequently assessed by the superior provincial Party authority. The report is an</w:t>
+        <w:t xml:space="preserve">superior</w:t>
+      </w:r>
+      <w:r>
+        <w:t xml:space="preserve">. The salience criterion is defined relative to this upward principal, which is the channel through which the observability asymmetry of §2.1 operates. The lateral citizen channel is reported as a bounded null (§4.4) rather than asserted as the mechanism.</w:t>
+      </w:r>
+    </w:p>
+    <w:bookmarkEnd w:id="21"/>
+    <w:bookmarkStart w:id="22" w:name="lexicon-construction"/>
+    <w:p>
+      <w:pPr>
+        <w:pStyle w:val="Heading3"/>
+      </w:pPr>
+      <w:r>
+        <w:t xml:space="preserve">3.1.1 Lexicon construction</w:t>
+      </w:r>
+    </w:p>
+    <w:p>
+      <w:pPr>
+        <w:pStyle w:val="FirstParagraph"/>
+      </w:pPr>
+      <w:r>
+        <w:t xml:space="preserve">The lexicon was built through an iterative expert-coding protocol, seeded from a reading of 50 randomly-sampled reports with terms retained at &gt;85% inter-coder agreement across two coders. A natural first (</w:t>
+      </w:r>
+      <w:r>
+        <w:t xml:space="preserve">“naive”</w:t>
+      </w:r>
+      <w:r>
+        <w:t xml:space="preserve">) lexicon paired 42 visible terms, appearance/image words </w:t>
+      </w:r>
+      <w:r>
+        <w:rPr>
+          <w:rFonts w:hint="eastAsia"/>
+        </w:rPr>
+        <w:t xml:space="preserve">(形象</w:t>
       </w:r>
       <w:r>
         <w:t xml:space="preserve"> </w:t>
@@ -2070,45 +1819,22 @@
           <w:i/>
           <w:iCs/>
         </w:rPr>
-        <w:t xml:space="preserve">input to</w:t>
-      </w:r>
-      <w:r>
-        <w:t xml:space="preserve"> </w:t>
-      </w:r>
-      <w:r>
-        <w:t xml:space="preserve">the promotion-relevant evaluation process, not merely a record of it.</w:t>
-      </w:r>
-    </w:p>
-    <w:p>
-      <w:pPr>
-        <w:pStyle w:val="BodyText"/>
-      </w:pPr>
-      <w:r>
-        <w:rPr>
-          <w:b/>
-          <w:bCs/>
-        </w:rPr>
-        <w:t xml:space="preserve">Audiences and</w:t>
-      </w:r>
-      <w:r>
-        <w:rPr>
-          <w:b/>
-          <w:bCs/>
-        </w:rPr>
-        <w:t xml:space="preserve"> </w:t>
-      </w:r>
-      <w:r>
-        <w:rPr>
-          <w:b/>
-          <w:bCs/>
-        </w:rPr>
-        <w:t xml:space="preserve">“visible to whom.”</w:t>
-      </w:r>
-      <w:r>
-        <w:t xml:space="preserve"> </w:t>
-      </w:r>
-      <w:r>
-        <w:t xml:space="preserve">The GWR’s audiences include the promotion-controlling superior, the NPC delegates who vote on it, and the public and media to whom it is released. The audience relevant to our construct is the</w:t>
+        <w:t xml:space="preserve">xíngxiàng</w:t>
+      </w:r>
+      <w:r>
+        <w:t xml:space="preserve"> </w:t>
+      </w:r>
+      <w:r>
+        <w:t xml:space="preserve">“image”</w:t>
+      </w:r>
+      <w:r>
+        <w:t xml:space="preserve">, </w:t>
+      </w:r>
+      <w:r>
+        <w:rPr>
+          <w:rFonts w:hint="eastAsia"/>
+        </w:rPr>
+        <w:t xml:space="preserve">示范</w:t>
       </w:r>
       <w:r>
         <w:t xml:space="preserve"> </w:t>
@@ -2118,56 +1844,22 @@
           <w:i/>
           <w:iCs/>
         </w:rPr>
-        <w:t xml:space="preserve">superior</w:t>
-      </w:r>
-      <w:r>
-        <w:t xml:space="preserve">: the salience criterion is defined relative to this upward principal, which is precisely the channel through which the observability asymmetry of §2.1 operates. The lateral citizen channel is reported as a bounded null (§4.4), not asserted as the mechanism.</w:t>
-      </w:r>
-    </w:p>
-    <w:bookmarkEnd w:id="21"/>
-    <w:bookmarkStart w:id="22" w:name="lexicon-construction"/>
-    <w:p>
-      <w:pPr>
-        <w:pStyle w:val="Heading3"/>
-      </w:pPr>
-      <w:r>
-        <w:t xml:space="preserve">3.1.1 Lexicon construction</w:t>
-      </w:r>
-    </w:p>
-    <w:p>
-      <w:pPr>
-        <w:pStyle w:val="FirstParagraph"/>
-      </w:pPr>
-      <w:r>
-        <w:t xml:space="preserve">The lexicon was built through an iterative expert-coding protocol, seeded from a reading of 50 randomly-sampled reports with terms retained at &gt;85% inter-coder agreement across two coders. A natural first (</w:t>
-      </w:r>
-      <w:r>
-        <w:t xml:space="preserve">“naive”</w:t>
-      </w:r>
-      <w:r>
-        <w:t xml:space="preserve">) lexicon paired</w:t>
-      </w:r>
-      <w:r>
-        <w:t xml:space="preserve"> </w:t>
-      </w:r>
-      <w:r>
-        <w:rPr>
-          <w:b/>
-          <w:bCs/>
-        </w:rPr>
-        <w:t xml:space="preserve">42 visible terms</w:t>
-      </w:r>
-      <w:r>
-        <w:t xml:space="preserve"> </w:t>
-      </w:r>
-      <w:r>
-        <w:t xml:space="preserve">— appearance/image words </w:t>
+        <w:t xml:space="preserve">shìfàn</w:t>
+      </w:r>
+      <w:r>
+        <w:t xml:space="preserve"> </w:t>
+      </w:r>
+      <w:r>
+        <w:t xml:space="preserve">“model”</w:t>
+      </w:r>
+      <w:r>
+        <w:t xml:space="preserve">, </w:t>
       </w:r>
       <w:r>
         <w:rPr>
           <w:rFonts w:hint="eastAsia"/>
         </w:rPr>
-        <w:t xml:space="preserve">(形象</w:t>
+        <w:t xml:space="preserve">面子</w:t>
       </w:r>
       <w:r>
         <w:t xml:space="preserve"> </w:t>
@@ -2177,13 +1869,13 @@
           <w:i/>
           <w:iCs/>
         </w:rPr>
-        <w:t xml:space="preserve">xíngxiàng</w:t>
-      </w:r>
-      <w:r>
-        <w:t xml:space="preserve"> </w:t>
-      </w:r>
-      <w:r>
-        <w:t xml:space="preserve">“image”</w:t>
+        <w:t xml:space="preserve">miànzi</w:t>
+      </w:r>
+      <w:r>
+        <w:t xml:space="preserve"> </w:t>
+      </w:r>
+      <w:r>
+        <w:t xml:space="preserve">“face”</w:t>
       </w:r>
       <w:r>
         <w:t xml:space="preserve">, </w:t>
@@ -2192,7 +1884,7 @@
         <w:rPr>
           <w:rFonts w:hint="eastAsia"/>
         </w:rPr>
-        <w:t xml:space="preserve">示范</w:t>
+        <w:t xml:space="preserve">展示</w:t>
       </w:r>
       <w:r>
         <w:t xml:space="preserve"> </w:t>
@@ -2202,22 +1894,16 @@
           <w:i/>
           <w:iCs/>
         </w:rPr>
-        <w:t xml:space="preserve">shìfàn</w:t>
-      </w:r>
-      <w:r>
-        <w:t xml:space="preserve"> </w:t>
-      </w:r>
-      <w:r>
-        <w:t xml:space="preserve">“model”</w:t>
-      </w:r>
-      <w:r>
-        <w:t xml:space="preserve">, </w:t>
-      </w:r>
-      <w:r>
-        <w:rPr>
-          <w:rFonts w:hint="eastAsia"/>
-        </w:rPr>
-        <w:t xml:space="preserve">面子</w:t>
+        <w:t xml:space="preserve">zhǎnshì</w:t>
+      </w:r>
+      <w:r>
+        <w:t xml:space="preserve"> </w:t>
+      </w:r>
+      <w:r>
+        <w:t xml:space="preserve">“display”</w:t>
+      </w:r>
+      <w:r>
+        <w:t xml:space="preserve">) together with concrete construction terms, against 38 functional terms. As the passage-level validation in §3.2.0 shows, this naive lexicon fails: the abstract appearance words are polysemous and fire pervasively outside infrastructure. We therefore refine VAI to a concrete, salience-based lexicon keyed on</w:t>
       </w:r>
       <w:r>
         <w:t xml:space="preserve"> </w:t>
@@ -2227,273 +1913,148 @@
           <w:i/>
           <w:iCs/>
         </w:rPr>
-        <w:t xml:space="preserve">miànzi</w:t>
-      </w:r>
-      <w:r>
-        <w:t xml:space="preserve"> </w:t>
-      </w:r>
-      <w:r>
-        <w:t xml:space="preserve">“face”</w:t>
-      </w:r>
-      <w:r>
-        <w:t xml:space="preserve">, </w:t>
+        <w:t xml:space="preserve">observability-bearing referents</w:t>
+      </w:r>
+      <w:r>
+        <w:t xml:space="preserve"> </w:t>
+      </w:r>
+      <w:r>
+        <w:t xml:space="preserve">rather than appearance words, mirroring the cosmetic-versus-functional split of the MOHURD construction-investment categories (§3.3). The refined version pairs 20 concrete visible terms </w:t>
       </w:r>
       <w:r>
         <w:rPr>
           <w:rFonts w:hint="eastAsia"/>
         </w:rPr>
-        <w:t xml:space="preserve">展示</w:t>
-      </w:r>
-      <w:r>
-        <w:t xml:space="preserve"> </w:t>
-      </w:r>
-      <w:r>
-        <w:rPr>
-          <w:i/>
-          <w:iCs/>
-        </w:rPr>
-        <w:t xml:space="preserve">zhǎnshì</w:t>
-      </w:r>
-      <w:r>
-        <w:t xml:space="preserve"> </w:t>
-      </w:r>
-      <w:r>
-        <w:t xml:space="preserve">“display”</w:t>
-      </w:r>
-      <w:r>
-        <w:t xml:space="preserve">) together with concrete construction terms — against</w:t>
-      </w:r>
-      <w:r>
-        <w:t xml:space="preserve"> </w:t>
-      </w:r>
-      <w:r>
-        <w:rPr>
-          <w:b/>
-          <w:bCs/>
-        </w:rPr>
-        <w:t xml:space="preserve">38 functional terms</w:t>
-      </w:r>
-      <w:r>
-        <w:t xml:space="preserve">. As the passage-level validation in §3.2.0 shows, this naive lexicon</w:t>
-      </w:r>
-      <w:r>
-        <w:t xml:space="preserve"> </w:t>
-      </w:r>
-      <w:r>
-        <w:rPr>
-          <w:b/>
-          <w:bCs/>
-        </w:rPr>
-        <w:t xml:space="preserve">fails</w:t>
-      </w:r>
-      <w:r>
-        <w:t xml:space="preserve">: the abstract appearance words are polysemous and fire pervasively outside infrastructure. We therefore refine VAI to a</w:t>
-      </w:r>
-      <w:r>
-        <w:t xml:space="preserve"> </w:t>
-      </w:r>
-      <w:r>
-        <w:rPr>
-          <w:b/>
-          <w:bCs/>
-        </w:rPr>
-        <w:t xml:space="preserve">concrete, salience-based lexicon</w:t>
-      </w:r>
-      <w:r>
-        <w:t xml:space="preserve"> </w:t>
-      </w:r>
-      <w:r>
-        <w:t xml:space="preserve">keyed on</w:t>
-      </w:r>
-      <w:r>
-        <w:t xml:space="preserve"> </w:t>
-      </w:r>
-      <w:r>
-        <w:rPr>
-          <w:i/>
-          <w:iCs/>
-        </w:rPr>
-        <w:t xml:space="preserve">observability-bearing referents</w:t>
-      </w:r>
-      <w:r>
-        <w:t xml:space="preserve"> </w:t>
-      </w:r>
-      <w:r>
-        <w:t xml:space="preserve">rather than appearance words, mirroring the cosmetic-versus-functional split of the MOHURD construction-investment categories (§3.3):</w:t>
-      </w:r>
-      <w:r>
-        <w:t xml:space="preserve"> </w:t>
-      </w:r>
-      <w:r>
-        <w:rPr>
-          <w:b/>
-          <w:bCs/>
-        </w:rPr>
-        <w:t xml:space="preserve">20 concrete visible terms</w:t>
-      </w:r>
-      <w:r>
-        <w:t xml:space="preserve"> </w:t>
+        <w:t xml:space="preserve">(绿化</w:t>
+      </w:r>
+      <w:r>
+        <w:t xml:space="preserve"> greening, </w:t>
       </w:r>
       <w:r>
         <w:rPr>
           <w:rFonts w:hint="eastAsia"/>
         </w:rPr>
-        <w:t xml:space="preserve">(绿化</w:t>
-      </w:r>
-      <w:r>
-        <w:t xml:space="preserve"> greening, </w:t>
+        <w:t xml:space="preserve">公园</w:t>
+      </w:r>
+      <w:r>
+        <w:t xml:space="preserve"> park, </w:t>
       </w:r>
       <w:r>
         <w:rPr>
           <w:rFonts w:hint="eastAsia"/>
         </w:rPr>
-        <w:t xml:space="preserve">公园</w:t>
-      </w:r>
-      <w:r>
-        <w:t xml:space="preserve"> park, </w:t>
+        <w:t xml:space="preserve">广场</w:t>
+      </w:r>
+      <w:r>
+        <w:t xml:space="preserve"> square, </w:t>
       </w:r>
       <w:r>
         <w:rPr>
           <w:rFonts w:hint="eastAsia"/>
         </w:rPr>
-        <w:t xml:space="preserve">广场</w:t>
-      </w:r>
-      <w:r>
-        <w:t xml:space="preserve"> square, </w:t>
+        <w:t xml:space="preserve">道路/路网</w:t>
+      </w:r>
+      <w:r>
+        <w:t xml:space="preserve"> roads, </w:t>
       </w:r>
       <w:r>
         <w:rPr>
           <w:rFonts w:hint="eastAsia"/>
         </w:rPr>
-        <w:t xml:space="preserve">道路/路网</w:t>
-      </w:r>
-      <w:r>
-        <w:t xml:space="preserve"> roads, </w:t>
+        <w:t xml:space="preserve">桥梁</w:t>
+      </w:r>
+      <w:r>
+        <w:t xml:space="preserve"> bridge, </w:t>
       </w:r>
       <w:r>
         <w:rPr>
           <w:rFonts w:hint="eastAsia"/>
         </w:rPr>
-        <w:t xml:space="preserve">桥梁</w:t>
-      </w:r>
-      <w:r>
-        <w:t xml:space="preserve"> bridge, </w:t>
+        <w:t xml:space="preserve">景观</w:t>
+      </w:r>
+      <w:r>
+        <w:t xml:space="preserve"> landscape, </w:t>
       </w:r>
       <w:r>
         <w:rPr>
           <w:rFonts w:hint="eastAsia"/>
         </w:rPr>
-        <w:t xml:space="preserve">景观</w:t>
-      </w:r>
-      <w:r>
-        <w:t xml:space="preserve"> landscape, </w:t>
+        <w:t xml:space="preserve">亮化</w:t>
+      </w:r>
+      <w:r>
+        <w:t xml:space="preserve"> lighting, </w:t>
       </w:r>
       <w:r>
         <w:rPr>
           <w:rFonts w:hint="eastAsia"/>
         </w:rPr>
-        <w:t xml:space="preserve">亮化</w:t>
-      </w:r>
-      <w:r>
-        <w:t xml:space="preserve"> lighting, </w:t>
+        <w:t xml:space="preserve">地铁/轨道交通</w:t>
+      </w:r>
+      <w:r>
+        <w:t xml:space="preserve"> metro/rail, </w:t>
       </w:r>
       <w:r>
         <w:rPr>
           <w:rFonts w:hint="eastAsia"/>
         </w:rPr>
-        <w:t xml:space="preserve">地铁/轨道交通</w:t>
-      </w:r>
-      <w:r>
-        <w:t xml:space="preserve"> metro/rail, </w:t>
+        <w:t xml:space="preserve">大道</w:t>
+      </w:r>
+      <w:r>
+        <w:t xml:space="preserve"> boulevard, …) with 16 concealed-utility functional terms </w:t>
       </w:r>
       <w:r>
         <w:rPr>
           <w:rFonts w:hint="eastAsia"/>
         </w:rPr>
-        <w:t xml:space="preserve">大道</w:t>
-      </w:r>
-      <w:r>
-        <w:t xml:space="preserve"> boulevard, …) and</w:t>
-      </w:r>
-      <w:r>
-        <w:t xml:space="preserve"> </w:t>
-      </w:r>
-      <w:r>
-        <w:rPr>
-          <w:b/>
-          <w:bCs/>
-        </w:rPr>
-        <w:t xml:space="preserve">16 concealed-utility functional terms</w:t>
-      </w:r>
-      <w:r>
-        <w:t xml:space="preserve"> </w:t>
+        <w:t xml:space="preserve">(排水</w:t>
+      </w:r>
+      <w:r>
+        <w:t xml:space="preserve"> drainage, </w:t>
       </w:r>
       <w:r>
         <w:rPr>
           <w:rFonts w:hint="eastAsia"/>
         </w:rPr>
-        <w:t xml:space="preserve">(排水</w:t>
-      </w:r>
-      <w:r>
-        <w:t xml:space="preserve"> drainage, </w:t>
+        <w:t xml:space="preserve">管网</w:t>
+      </w:r>
+      <w:r>
+        <w:t xml:space="preserve"> pipe network, </w:t>
       </w:r>
       <w:r>
         <w:rPr>
           <w:rFonts w:hint="eastAsia"/>
         </w:rPr>
-        <w:t xml:space="preserve">管网</w:t>
-      </w:r>
-      <w:r>
-        <w:t xml:space="preserve"> pipe network, </w:t>
+        <w:t xml:space="preserve">污水</w:t>
+      </w:r>
+      <w:r>
+        <w:t xml:space="preserve"> sewerage, </w:t>
       </w:r>
       <w:r>
         <w:rPr>
           <w:rFonts w:hint="eastAsia"/>
         </w:rPr>
-        <w:t xml:space="preserve">污水</w:t>
-      </w:r>
-      <w:r>
-        <w:t xml:space="preserve"> sewerage, </w:t>
+        <w:t xml:space="preserve">供水</w:t>
+      </w:r>
+      <w:r>
+        <w:t xml:space="preserve"> water supply, </w:t>
       </w:r>
       <w:r>
         <w:rPr>
           <w:rFonts w:hint="eastAsia"/>
         </w:rPr>
-        <w:t xml:space="preserve">供水</w:t>
-      </w:r>
-      <w:r>
-        <w:t xml:space="preserve"> water supply, </w:t>
+        <w:t xml:space="preserve">防洪</w:t>
+      </w:r>
+      <w:r>
+        <w:t xml:space="preserve"> flood control, </w:t>
       </w:r>
       <w:r>
         <w:rPr>
           <w:rFonts w:hint="eastAsia"/>
         </w:rPr>
-        <w:t xml:space="preserve">防洪</w:t>
-      </w:r>
-      <w:r>
-        <w:t xml:space="preserve"> flood control, </w:t>
-      </w:r>
-      <w:r>
-        <w:rPr>
-          <w:rFonts w:hint="eastAsia"/>
-        </w:rPr>
         <w:t xml:space="preserve">地下管廊</w:t>
       </w:r>
       <w:r>
-        <w:t xml:space="preserve"> underground utility tunnel, …). The boundary case is</w:t>
-      </w:r>
-      <w:r>
-        <w:t xml:space="preserve"> </w:t>
-      </w:r>
-      <w:r>
-        <w:rPr>
-          <w:b/>
-          <w:bCs/>
-        </w:rPr>
-        <w:t xml:space="preserve">metro/rail</w:t>
-      </w:r>
-      <w:r>
-        <w:t xml:space="preserve">: physically underground yet daily-used, media-celebrated, and unmissable to an evaluating superior — hence maximally</w:t>
+        <w:t xml:space="preserve"> underground utility tunnel, …). The boundary case is metro/rail. It is physically underground yet daily-used, media-celebrated, and unmissable to an evaluating superior, hence maximally</w:t>
       </w:r>
       <w:r>
         <w:t xml:space="preserve"> </w:t>
@@ -2827,7 +2388,7 @@
         <w:pStyle w:val="FirstParagraph"/>
       </w:pPr>
       <w:r>
-        <w:t xml:space="preserve">For the concrete VAI: mean ≈ 0.60, with the majority of total variation</w:t>
+        <w:t xml:space="preserve">For the concrete VAI, mean ≈ 0.60, with the majority of total variation</w:t>
       </w:r>
       <w:r>
         <w:t xml:space="preserve"> </w:t>
@@ -2843,7 +2404,7 @@
         <w:t xml:space="preserve"> </w:t>
       </w:r>
       <w:r>
-        <w:t xml:space="preserve">city over time, justifying city and year fixed effects in §4. The within-city time-variation is what the behavioral test in §3.2.7 exploits.</w:t>
+        <w:t xml:space="preserve">city over time, which justifies the city and year fixed effects in §4. The within-city time-variation is what the behavioral test in §3.2.7 exploits.</w:t>
       </w:r>
     </w:p>
     <w:bookmarkEnd w:id="24"/>
@@ -2862,23 +2423,7 @@
         <w:pStyle w:val="FirstParagraph"/>
       </w:pPr>
       <w:r>
-        <w:t xml:space="preserve">Whether a text measure captures the construct — the visible-versus-functional composition of infrastructure language — rather than an artifact of lexicon selection or genre is the central question. We lead with the most direct evidence, a passage-level comparison against human coding (§3.2.0), then report a pre-registered battery of indirect checks (E-A–E-F, §3.2.1–§3.2.6), and finally the decisive</w:t>
-      </w:r>
-      <w:r>
-        <w:t xml:space="preserve"> </w:t>
-      </w:r>
-      <w:r>
-        <w:rPr>
-          <w:b/>
-          <w:bCs/>
-        </w:rPr>
-        <w:t xml:space="preserve">behavioral criterion-validity</w:t>
-      </w:r>
-      <w:r>
-        <w:t xml:space="preserve"> </w:t>
-      </w:r>
-      <w:r>
-        <w:t xml:space="preserve">test (§3.2.7).</w:t>
+        <w:t xml:space="preserve">The central question is whether a text measure captures the construct, the visible-versus-functional composition of infrastructure language, rather than an artifact of lexicon selection or genre. We lead with the most direct evidence, a passage-level comparison against human coding (§3.2.0). We then report a pre-registered battery of indirect checks (E-A–E-F, §3.2.1–§3.2.6), and finally the decisive behavioral criterion-validity test (§3.2.7).</w:t>
       </w:r>
     </w:p>
     <w:bookmarkStart w:id="26" w:name="Xcc528046c9e424b2d7bc6cdb5ce078825985c18"/>
@@ -2895,78 +2440,7 @@
         <w:pStyle w:val="FirstParagraph"/>
       </w:pPr>
       <w:r>
-        <w:t xml:space="preserve">We draw a stratified random sample of sentences (by dictionary hit-type, city tier, era) and have them independently coded as</w:t>
-      </w:r>
-      <w:r>
-        <w:t xml:space="preserve"> </w:t>
-      </w:r>
-      <w:r>
-        <w:rPr>
-          <w:b/>
-          <w:bCs/>
-        </w:rPr>
-        <w:t xml:space="preserve">visible / functional / mixed / irrelevant</w:t>
-      </w:r>
-      <w:r>
-        <w:t xml:space="preserve">. A</w:t>
-      </w:r>
-      <w:r>
-        <w:t xml:space="preserve"> </w:t>
-      </w:r>
-      <w:r>
-        <w:rPr>
-          <w:b/>
-          <w:bCs/>
-        </w:rPr>
-        <w:t xml:space="preserve">human gold standard of 120 sentences</w:t>
-      </w:r>
-      <w:r>
-        <w:t xml:space="preserve">, independently</w:t>
-      </w:r>
-      <w:r>
-        <w:t xml:space="preserve"> </w:t>
-      </w:r>
-      <w:r>
-        <w:rPr>
-          <w:b/>
-          <w:bCs/>
-        </w:rPr>
-        <w:t xml:space="preserve">double-coded</w:t>
-      </w:r>
-      <w:r>
-        <w:t xml:space="preserve"> </w:t>
-      </w:r>
-      <w:r>
-        <w:t xml:space="preserve">by two coders (dictionary and model labels hidden), anchors the analysis (intercoder</w:t>
-      </w:r>
-      <w:r>
-        <w:t xml:space="preserve"> </w:t>
-      </w:r>
-      <w:r>
-        <w:rPr>
-          <w:b/>
-          <w:bCs/>
-        </w:rPr>
-        <w:t xml:space="preserve">Cohen κ = 0.70</w:t>
-      </w:r>
-      <w:r>
-        <w:t xml:space="preserve">, substantial; Online Appendix C.8). Against the human labels we report a full confusion matrix, per-class precision/recall, verbatim error exemplars, and an error taxonomy. The findings define a</w:t>
-      </w:r>
-      <w:r>
-        <w:t xml:space="preserve"> </w:t>
-      </w:r>
-      <w:r>
-        <w:rPr>
-          <w:b/>
-          <w:bCs/>
-        </w:rPr>
-        <w:t xml:space="preserve">precision ladder</w:t>
-      </w:r>
-      <w:r>
-        <w:t xml:space="preserve"> </w:t>
-      </w:r>
-      <w:r>
-        <w:t xml:space="preserve">(Table 1, Panel A):</w:t>
+        <w:t xml:space="preserve">We draw a stratified random sample of sentences (by dictionary hit-type, city tier, era) and have them independently coded as visible, functional, mixed, or irrelevant. A human gold standard of 120 sentences, independently double-coded by two coders (dictionary and model labels hidden), anchors the analysis (intercoder Cohen κ = 0.70, substantial; Online Appendix C.8). Against the human labels we report a full confusion matrix, per-class precision/recall, verbatim error exemplars, and an error taxonomy. The findings define a precision ladder (Table 1, Panel A):</w:t>
       </w:r>
     </w:p>
     <w:p>
@@ -2988,23 +2462,7 @@
         <w:t xml:space="preserve"> </w:t>
       </w:r>
       <w:r>
-        <w:t xml:space="preserve">Visible-class precision against human coding is only</w:t>
-      </w:r>
-      <w:r>
-        <w:t xml:space="preserve"> </w:t>
-      </w:r>
-      <w:r>
-        <w:rPr>
-          <w:b/>
-          <w:bCs/>
-        </w:rPr>
-        <w:t xml:space="preserve">0.10</w:t>
-      </w:r>
-      <w:r>
-        <w:t xml:space="preserve"> </w:t>
-      </w:r>
-      <w:r>
-        <w:t xml:space="preserve">(recall 0.43). The diagnosis is single-cause: one polysemous term — </w:t>
+        <w:t xml:space="preserve">Visible-class precision against human coding is only 0.10 (recall 0.43). The diagnosis is single-cause: one polysemous term, </w:t>
       </w:r>
       <w:r>
         <w:rPr>
@@ -3023,26 +2481,7 @@
         <w:t xml:space="preserve">shìfàn</w:t>
       </w:r>
       <w:r>
-        <w:t xml:space="preserve"> </w:t>
-      </w:r>
-      <w:r>
-        <w:t xml:space="preserve">— alone produces</w:t>
-      </w:r>
-      <w:r>
-        <w:t xml:space="preserve"> </w:t>
-      </w:r>
-      <w:r>
-        <w:rPr>
-          <w:b/>
-          <w:bCs/>
-        </w:rPr>
-        <w:t xml:space="preserve">60–61 of 84</w:t>
-      </w:r>
-      <w:r>
-        <w:t xml:space="preserve"> </w:t>
-      </w:r>
-      <w:r>
-        <w:t xml:space="preserve">visible-class false positives </w:t>
+        <w:t xml:space="preserve">, alone produces 60–61 of 84 visible-class false positives </w:t>
       </w:r>
       <w:r>
         <w:rPr>
@@ -3145,65 +2584,7 @@
         <w:t xml:space="preserve"> </w:t>
       </w:r>
       <w:r>
-        <w:t xml:space="preserve">Restricting to concrete, salience-based terms raises visible precision to</w:t>
-      </w:r>
-      <w:r>
-        <w:t xml:space="preserve"> </w:t>
-      </w:r>
-      <w:r>
-        <w:rPr>
-          <w:b/>
-          <w:bCs/>
-        </w:rPr>
-        <w:t xml:space="preserve">0.50</w:t>
-      </w:r>
-      <w:r>
-        <w:t xml:space="preserve">, and to</w:t>
-      </w:r>
-      <w:r>
-        <w:t xml:space="preserve"> </w:t>
-      </w:r>
-      <w:r>
-        <w:rPr>
-          <w:b/>
-          <w:bCs/>
-        </w:rPr>
-        <w:t xml:space="preserve">0.60</w:t>
-      </w:r>
-      <w:r>
-        <w:t xml:space="preserve"> </w:t>
-      </w:r>
-      <w:r>
-        <w:t xml:space="preserve">after targeted refinement, at</w:t>
-      </w:r>
-      <w:r>
-        <w:t xml:space="preserve"> </w:t>
-      </w:r>
-      <w:r>
-        <w:rPr>
-          <w:b/>
-          <w:bCs/>
-        </w:rPr>
-        <w:t xml:space="preserve">0.79</w:t>
-      </w:r>
-      <w:r>
-        <w:t xml:space="preserve"> </w:t>
-      </w:r>
-      <w:r>
-        <w:t xml:space="preserve">recall. Curation cannot push past</w:t>
-      </w:r>
-      <w:r>
-        <w:t xml:space="preserve"> </w:t>
-      </w:r>
-      <w:r>
-        <w:rPr>
-          <w:b/>
-          <w:bCs/>
-        </w:rPr>
-        <w:t xml:space="preserve">~0.60–0.64</w:t>
-      </w:r>
-      <w:r>
-        <w:t xml:space="preserve">: residual uses are genuinely metaphorical or categorical </w:t>
+        <w:t xml:space="preserve">Restricting to concrete, salience-based terms raises visible precision to 0.50, and to 0.60 after targeted refinement, at 0.79 recall. Curation cannot push past ~0.60–0.64. Residual uses are genuinely metaphorical or categorical </w:t>
       </w:r>
       <w:r>
         <w:rPr>
@@ -3231,7 +2612,7 @@
         <w:t xml:space="preserve"> </w:t>
       </w:r>
       <w:r>
-        <w:t xml:space="preserve">also in </w:t>
+        <w:t xml:space="preserve">also appears in </w:t>
       </w:r>
       <w:r>
         <w:rPr>
@@ -3312,20 +2693,7 @@
         <w:t xml:space="preserve">”</w:t>
       </w:r>
       <w:r>
-        <w:t xml:space="preserve">) and pruning them destroys recall. This is a</w:t>
-      </w:r>
-      <w:r>
-        <w:t xml:space="preserve"> </w:t>
-      </w:r>
-      <w:r>
-        <w:rPr>
-          <w:b/>
-          <w:bCs/>
-        </w:rPr>
-        <w:t xml:space="preserve">polysemy ceiling</w:t>
-      </w:r>
-      <w:r>
-        <w:t xml:space="preserve">, not a curation failure.</w:t>
+        <w:t xml:space="preserve">), and pruning them destroys recall. This is a polysemy ceiling, not a curation failure.</w:t>
       </w:r>
     </w:p>
     <w:p>
@@ -3347,39 +2715,7 @@
         <w:t xml:space="preserve"> </w:t>
       </w:r>
       <w:r>
-        <w:t xml:space="preserve">Three independent model families (Gemini 3.1 Pro, ChatGPT 5.5, DeepSeek), each given the same four-class definition with the majority label taken, attain</w:t>
-      </w:r>
-      <w:r>
-        <w:t xml:space="preserve"> </w:t>
-      </w:r>
-      <w:r>
-        <w:rPr>
-          <w:b/>
-          <w:bCs/>
-        </w:rPr>
-        <w:t xml:space="preserve">0.84 accuracy</w:t>
-      </w:r>
-      <w:r>
-        <w:t xml:space="preserve"> </w:t>
-      </w:r>
-      <w:r>
-        <w:t xml:space="preserve">against the human gold standard with</w:t>
-      </w:r>
-      <w:r>
-        <w:t xml:space="preserve"> </w:t>
-      </w:r>
-      <w:r>
-        <w:rPr>
-          <w:b/>
-          <w:bCs/>
-        </w:rPr>
-        <w:t xml:space="preserve">inter-model Fleiss κ = 0.835</w:t>
-      </w:r>
-      <w:r>
-        <w:t xml:space="preserve"> </w:t>
-      </w:r>
-      <w:r>
-        <w:t xml:space="preserve">— the recommended route where high passage precision is required, consistent with recent evidence that LLMs match or surpass human and crowd annotation of political text [5, 20, 21] (the transparency cost is discussed in §5).</w:t>
+        <w:t xml:space="preserve">Three independent model families (Gemini 3.1 Pro, ChatGPT 5.5, DeepSeek), each given the same four-class definition with the majority label taken, attain 0.84 accuracy against the human gold standard with inter-model Fleiss κ = 0.835. This is the recommended route where high passage precision is required, consistent with recent evidence that LLMs match or surpass human and crowd annotation of political text [5, 20, 21] (the transparency cost is discussed in §5).</w:t>
       </w:r>
     </w:p>
     <w:p>
@@ -3387,7 +2723,7 @@
         <w:pStyle w:val="FirstParagraph"/>
       </w:pPr>
       <w:r>
-        <w:t xml:space="preserve">The implication for VAI is twofold: the appearance-word naive measure should not be used; the concrete VAI is a usable aggregate index (its errors attenuate in the count ratio), and for passage-critical work an LLM classifier is the high-precision alternative.</w:t>
+        <w:t xml:space="preserve">The implication for VAI is twofold. The appearance-word naive measure should not be used. The concrete VAI is a usable aggregate index (its errors attenuate in the count ratio), and for passage-critical work an LLM classifier is the high-precision alternative.</w:t>
       </w:r>
     </w:p>
     <w:bookmarkEnd w:id="26"/>
@@ -3415,20 +2751,7 @@
         <w:pStyle w:val="FirstParagraph"/>
       </w:pPr>
       <w:r>
-        <w:t xml:space="preserve">A second concrete lexicon, curated independently from a separate reading of 150 GWRs, yields VAI correlated with the primary at r = 0.93. We report this as</w:t>
-      </w:r>
-      <w:r>
-        <w:t xml:space="preserve"> </w:t>
-      </w:r>
-      <w:r>
-        <w:rPr>
-          <w:b/>
-          <w:bCs/>
-        </w:rPr>
-        <w:t xml:space="preserve">internal reliability</w:t>
-      </w:r>
-      <w:r>
-        <w:t xml:space="preserve">, not independent construct validity: both lexicons are drawn from the same governance genre, so overlap is expected.</w:t>
+        <w:t xml:space="preserve">A second concrete lexicon, curated independently from a separate reading of 150 GWRs, yields VAI correlated with the primary at r = 0.93. We report this as internal reliability rather than independent construct validity: both lexicons are drawn from the same governance genre, so overlap is expected.</w:t>
       </w:r>
     </w:p>
     <w:bookmarkEnd w:id="27"/>
@@ -3558,7 +2881,7 @@
         <w:t xml:space="preserve"> </w:t>
       </w:r>
       <w:r>
-        <w:t xml:space="preserve">within-document pattern that, as §4.2.2 notes, may partly reflect genre rather than behavior — no longer the lead validity evidence.</w:t>
+        <w:t xml:space="preserve">within-document pattern that, as §4.2.2 notes, may partly reflect genre rather than behavior, and it is no longer the lead validity evidence.</w:t>
       </w:r>
     </w:p>
     <w:bookmarkEnd w:id="28"/>
@@ -3586,7 +2909,7 @@
         <w:pStyle w:val="FirstParagraph"/>
       </w:pPr>
       <w:r>
-        <w:t xml:space="preserve">Random half-lexicon partitions correlate only weakly (mean r = 0.18): any half is an unstable estimator, so the</w:t>
+        <w:t xml:space="preserve">Random half-lexicon partitions correlate only weakly (mean r = 0.18). Any half is an unstable estimator, so the</w:t>
       </w:r>
       <w:r>
         <w:t xml:space="preserve"> </w:t>
@@ -3630,7 +2953,7 @@
         <w:pStyle w:val="FirstParagraph"/>
       </w:pPr>
       <w:r>
-        <w:t xml:space="preserve">VAI correlates with the MOHURD yearbook-derived Cosmetic Investment Ratio (CIR) at r = 0.24 (p &lt; 10⁻³⁰) over the 2005–2015 overlap — independent evidence from accounting rather than text, modest in magnitude.</w:t>
+        <w:t xml:space="preserve">VAI correlates with the MOHURD yearbook-derived Cosmetic Investment Ratio (CIR) at r = 0.24 (p &lt; 10⁻³⁰) over the 2005–2015 overlap. This is independent evidence from accounting rather than text, modest in magnitude.</w:t>
       </w:r>
     </w:p>
     <w:bookmarkEnd w:id="30"/>
@@ -3658,23 +2981,7 @@
         <w:pStyle w:val="FirstParagraph"/>
       </w:pPr>
       <w:r>
-        <w:t xml:space="preserve">A parallel VAI from Chinese Wikipedia city descriptions does</w:t>
-      </w:r>
-      <w:r>
-        <w:t xml:space="preserve"> </w:t>
-      </w:r>
-      <w:r>
-        <w:rPr>
-          <w:b/>
-          <w:bCs/>
-        </w:rPr>
-        <w:t xml:space="preserve">not</w:t>
-      </w:r>
-      <w:r>
-        <w:t xml:space="preserve"> </w:t>
-      </w:r>
-      <w:r>
-        <w:t xml:space="preserve">correlate with the primary (r = −0.15, 95% CI [−0.31, +0.02]); the pre-registered band was [0.3, 0.7]. We report the failure plainly (deviation D-E-2): the most likely cause is a genre mismatch (Wikipedia city articles yield a median of 6 lexicon hits vs 50+ for a GWR), which in hindsight made Wikipedia-zh a poorly-chosen third-party source. It bounds the instrument’s domain to governance rhetoric.</w:t>
+        <w:t xml:space="preserve">A parallel VAI from Chinese Wikipedia city descriptions does not correlate with the primary (r = −0.15, 95% CI [−0.31, +0.02]); the pre-registered band was [0.3, 0.7]. We report the failure plainly (deviation D-E-2). The most likely cause is a genre mismatch (Wikipedia city articles yield a median of 6 lexicon hits vs 50+ for a GWR), which in hindsight made Wikipedia-zh a poorly-chosen third-party source. It bounds the instrument’s domain to governance rhetoric.</w:t>
       </w:r>
     </w:p>
     <w:bookmarkEnd w:id="31"/>
@@ -4061,7 +3368,7 @@
         <w:pStyle w:val="FirstParagraph"/>
       </w:pPr>
       <w:r>
-        <w:t xml:space="preserve">Passage precision is not the question a skeptical reader most wants answered: even a precise text measure might capture only</w:t>
+        <w:t xml:space="preserve">Passage precision is not the question a skeptical reader most wants answered. Even a precise text measure might capture only</w:t>
       </w:r>
       <w:r>
         <w:t xml:space="preserve"> </w:t>
@@ -4093,23 +3400,7 @@
         <w:t xml:space="preserve"> </w:t>
       </w:r>
       <w:r>
-        <w:t xml:space="preserve">that moves real resources. We therefore add the criterion-validity test the original draft lacked. Using plausibly exogenous,</w:t>
-      </w:r>
-      <w:r>
-        <w:t xml:space="preserve"> </w:t>
-      </w:r>
-      <w:r>
-        <w:rPr>
-          <w:b/>
-          <w:bCs/>
-        </w:rPr>
-        <w:t xml:space="preserve">retirement-driven turnover</w:t>
-      </w:r>
-      <w:r>
-        <w:t xml:space="preserve"> </w:t>
-      </w:r>
-      <w:r>
-        <w:t xml:space="preserve">of municipal party secretaries (departure at/above the mandatory-retirement age threshold) as an incentive shock, we ask whether the text measure co-moves with</w:t>
+        <w:t xml:space="preserve">that moves real resources. We therefore add the criterion-validity test the original draft lacked. Using plausibly exogenous, retirement-driven turnover of municipal party secretaries (departure at/above the mandatory-retirement age threshold) as an incentive shock, we ask whether the text measure co-moves with</w:t>
       </w:r>
       <w:r>
         <w:t xml:space="preserve"> </w:t>
@@ -4405,33 +3696,7 @@
         <w:pStyle w:val="BodyText"/>
       </w:pPr>
       <w:r>
-        <w:t xml:space="preserve">The pattern is exactly what criterion validity requires. In the year after turnover, real cosmetic investment rises and the</w:t>
-      </w:r>
-      <w:r>
-        <w:t xml:space="preserve"> </w:t>
-      </w:r>
-      <w:r>
-        <w:rPr>
-          <w:b/>
-          <w:bCs/>
-        </w:rPr>
-        <w:t xml:space="preserve">concrete VAI rises in lockstep</w:t>
-      </w:r>
-      <w:r>
-        <w:t xml:space="preserve">, both with clean pre-trends (the future-turnover placebo is null); the</w:t>
-      </w:r>
-      <w:r>
-        <w:t xml:space="preserve"> </w:t>
-      </w:r>
-      <w:r>
-        <w:rPr>
-          <w:b/>
-          <w:bCs/>
-        </w:rPr>
-        <w:t xml:space="preserve">naive VAI does not respond at all</w:t>
-      </w:r>
-      <w:r>
-        <w:t xml:space="preserve">. A genre or template artifact would not co-move with money under an exogenous shock; a strategic-attention measure does. This behavioral co-movement — not passage precision — is the strongest evidence that the construct is real and that the</w:t>
+        <w:t xml:space="preserve">The pattern is exactly what criterion validity requires. In the year after turnover, real cosmetic investment rises and the concrete VAI rises in lockstep, both with clean pre-trends (the future-turnover placebo is null), while the naive VAI does not respond at all. A genre or template artifact would not co-move with money under an exogenous shock; a strategic-attention measure does. This behavioral co-movement, rather than passage precision, is the strongest evidence that the construct is real and that the</w:t>
       </w:r>
       <w:r>
         <w:t xml:space="preserve"> </w:t>
@@ -4447,7 +3712,7 @@
         <w:t xml:space="preserve"> </w:t>
       </w:r>
       <w:r>
-        <w:t xml:space="preserve">(concrete) measure captures it, and it is what licenses the term</w:t>
+        <w:t xml:space="preserve">(concrete) measure captures it. It is also what licenses the term</w:t>
       </w:r>
       <w:r>
         <w:t xml:space="preserve"> </w:t>
@@ -4466,6 +3731,43 @@
       </w:r>
       <w:r>
         <w:t xml:space="preserve">“visible-infrastructure rhetoric.”</w:t>
+      </w:r>
+    </w:p>
+    <w:p>
+      <w:pPr>
+        <w:pStyle w:val="BodyText"/>
+      </w:pPr>
+      <w:r>
+        <w:t xml:space="preserve">The 2005–2015 window is the coverage of the yearbook’s municipal fixed-asset</w:t>
+      </w:r>
+      <w:r>
+        <w:t xml:space="preserve"> </w:t>
+      </w:r>
+      <w:r>
+        <w:rPr>
+          <w:i/>
+          <w:iCs/>
+        </w:rPr>
+        <w:t xml:space="preserve">investment</w:t>
+      </w:r>
+      <w:r>
+        <w:t xml:space="preserve">-by-category table (the CIR source), not a window chosen after the fact. As a check, we re-ran the same turnover test on a longer-span</w:t>
+      </w:r>
+      <w:r>
+        <w:t xml:space="preserve"> </w:t>
+      </w:r>
+      <w:r>
+        <w:rPr>
+          <w:i/>
+          <w:iCs/>
+        </w:rPr>
+        <w:t xml:space="preserve">physical-stock</w:t>
+      </w:r>
+      <w:r>
+        <w:t xml:space="preserve"> </w:t>
+      </w:r>
+      <w:r>
+        <w:t xml:space="preserve">cosmetic measure available for 2002–2024, the annual increment in built-up green-space coverage, and find a co-movement that is directionally consistent but not statistically significant (+0.20, p = 0.12). The behavioral signal is therefore carried by investment composition, which officials can re-direct within a budget year, rather than by slow-moving physical stocks. A cross-sectional physical-stock measure likewise shows no within-city signal.</w:t>
       </w:r>
     </w:p>
     <w:bookmarkEnd w:id="33"/>
@@ -4484,7 +3786,7 @@
         <w:pStyle w:val="FirstParagraph"/>
       </w:pPr>
       <w:r>
-        <w:t xml:space="preserve">The text corpus (§3.1) is combined with: the</w:t>
+        <w:t xml:space="preserve">The text corpus (§3.1) is combined with five further sources. The</w:t>
       </w:r>
       <w:r>
         <w:t xml:space="preserve"> </w:t>
@@ -4497,71 +3799,10 @@
         <w:t xml:space="preserve">China Urban Construction Statistical Yearbook (Ministry of Construction / MOHURD, 2005–2015)</w:t>
       </w:r>
       <w:r>
-        <w:t xml:space="preserve">, source of the accounting CIR (cosmetic categories ÷ total urban-construction investment) and of the cosmetic/functional split the concrete lexicon mirrors; a</w:t>
-      </w:r>
-      <w:r>
-        <w:t xml:space="preserve"> </w:t>
-      </w:r>
-      <w:r>
-        <w:rPr>
-          <w:b/>
-          <w:bCs/>
-        </w:rPr>
-        <w:t xml:space="preserve">city-year control panel</w:t>
-      </w:r>
-      <w:r>
-        <w:t xml:space="preserve"> </w:t>
-      </w:r>
-      <w:r>
-        <w:t xml:space="preserve">(282 cities × 2002–2024); a</w:t>
-      </w:r>
-      <w:r>
-        <w:t xml:space="preserve"> </w:t>
-      </w:r>
-      <w:r>
-        <w:rPr>
-          <w:b/>
-          <w:bCs/>
-        </w:rPr>
-        <w:t xml:space="preserve">municipal-leader panel</w:t>
-      </w:r>
-      <w:r>
-        <w:t xml:space="preserve"> </w:t>
-      </w:r>
-      <w:r>
-        <w:t xml:space="preserve">giving party-secretary turnover, tenure, and age (the basis for the retirement-driven shock in §3.2.7); the</w:t>
-      </w:r>
-      <w:r>
-        <w:t xml:space="preserve"> </w:t>
-      </w:r>
-      <w:r>
-        <w:rPr>
-          <w:b/>
-          <w:bCs/>
-        </w:rPr>
-        <w:t xml:space="preserve">China Family Panel Studies</w:t>
-      </w:r>
-      <w:r>
-        <w:t xml:space="preserve"> </w:t>
-      </w:r>
-      <w:r>
-        <w:t xml:space="preserve">(CFPS, 2010–2022) for the bounded individual-level null (§4.4); and</w:t>
-      </w:r>
-      <w:r>
-        <w:t xml:space="preserve"> </w:t>
-      </w:r>
-      <w:r>
-        <w:rPr>
-          <w:b/>
-          <w:bCs/>
-        </w:rPr>
-        <w:t xml:space="preserve">Zhejiang public-procurement records</w:t>
-      </w:r>
-      <w:r>
-        <w:t xml:space="preserve"> </w:t>
-      </w:r>
-      <w:r>
-        <w:t xml:space="preserve">(≈2,957,789 announcements, predominantly 2019–2026, national</w:t>
+        <w:t xml:space="preserve"> </w:t>
+      </w:r>
+      <w:r>
+        <w:t xml:space="preserve">is the source of the accounting CIR (cosmetic categories ÷ total urban-construction investment) and of the cosmetic/functional split the concrete lexicon mirrors. A city-year control panel covers 282 cities × 2002–2024. A municipal-leader panel gives party-secretary turnover, tenure, and age (the basis for the retirement-driven shock in §3.2.7). The China Family Panel Studies (CFPS, 2010–2022) supplies the bounded individual-level null (§4.4). Zhejiang public-procurement records (≈2,957,789 announcements, predominantly 2019–2026, national</w:t>
       </w:r>
       <w:r>
         <w:t xml:space="preserve"> </w:t>
@@ -4576,7 +3817,7 @@
         <w:t xml:space="preserve"> </w:t>
       </w:r>
       <w:r>
-        <w:t xml:space="preserve">platform) for the independent procurement corroboration (§4.3). The criterion-validity panel (</w:t>
+        <w:t xml:space="preserve">platform) provide the independent procurement corroboration (§4.3). The criterion-validity panel (</w:t>
       </w:r>
       <w:r>
         <w:rPr>
@@ -4604,7 +3845,7 @@
         <w:pStyle w:val="FirstParagraph"/>
       </w:pPr>
       <w:r>
-        <w:t xml:space="preserve">Section 3 established that the concrete VAI is a validated measure of the visible-versus-functional composition of Chinese municipal governance rhetoric — passage-validated against human coding (§3.2.0) and, decisively, behaviorally anchored to real cosmetic investment under an exogenous incentive shock (§3.2.7). This section presents what the validated instrument</w:t>
+        <w:t xml:space="preserve">Section 3 established that the concrete VAI is a validated measure of the visible-versus-functional composition of Chinese municipal governance rhetoric. It was passage-validated against human coding (§3.2.0) and behaviorally anchored to real cosmetic investment under an exogenous incentive shock (§3.2.7). This section presents what the validated instrument</w:t>
       </w:r>
       <w:r>
         <w:t xml:space="preserve"> </w:t>
@@ -4636,7 +3877,7 @@
         <w:t xml:space="preserve"> </w:t>
       </w:r>
       <w:r>
-        <w:t xml:space="preserve">visibility bias; the criterion-validity evidence (§3.2.7) supports the measure, not a causal theory.</w:t>
+        <w:t xml:space="preserve">visibility bias; the criterion-validity evidence (§3.2.7) supports the measure rather than a causal theory.</w:t>
       </w:r>
     </w:p>
     <w:bookmarkStart w:id="37" w:name="X51673404ba14cbcc7c29233ee762782bef3c779"/>
@@ -4653,17 +3894,7 @@
         <w:pStyle w:val="FirstParagraph"/>
       </w:pPr>
       <w:r>
-        <w:rPr>
-          <w:b/>
-          <w:bCs/>
-        </w:rPr>
-        <w:t xml:space="preserve">Pre-registered H1:</w:t>
-      </w:r>
-      <w:r>
-        <w:t xml:space="preserve"> </w:t>
-      </w:r>
-      <w:r>
-        <w:t xml:space="preserve">within-city variation in VAI positively predicts the accounting-based Cosmetic Investment Ratio (CIR) while leaving total infrastructure investment unchanged. We estimate</w:t>
+        <w:t xml:space="preserve">Our pre-registered H1 holds that within-city variation in VAI positively predicts the accounting-based Cosmetic Investment Ratio (CIR) while leaving total infrastructure investment unchanged. We estimate</w:t>
       </w:r>
     </w:p>
     <w:p>
@@ -5425,23 +4656,7 @@
         <w:pStyle w:val="BodyText"/>
       </w:pPr>
       <w:r>
-        <w:t xml:space="preserve">All specifications give β &gt; 0 at conventional significance. The</w:t>
-      </w:r>
-      <w:r>
-        <w:t xml:space="preserve"> </w:t>
-      </w:r>
-      <w:r>
-        <w:rPr>
-          <w:b/>
-          <w:bCs/>
-        </w:rPr>
-        <w:t xml:space="preserve">null on total investment</w:t>
-      </w:r>
-      <w:r>
-        <w:t xml:space="preserve"> </w:t>
-      </w:r>
-      <w:r>
-        <w:t xml:space="preserve">(ln total urban-construction investment on VAI: β = −0.008, p = 0.71) is consistent with</w:t>
+        <w:t xml:space="preserve">All specifications give β &gt; 0 at conventional significance. The null on total investment (ln total urban-construction investment on VAI: β = −0.008, p = 0.71) is consistent with</w:t>
       </w:r>
       <w:r>
         <w:t xml:space="preserve"> </w:t>
@@ -5454,23 +4669,7 @@
         <w:t xml:space="preserve">composition, not expansion</w:t>
       </w:r>
       <w:r>
-        <w:t xml:space="preserve">. Horse races against GDP-growth, urbanization stage, and leader tenure leave β(VAI) essentially unchanged (Online Appendix C.2), and a pre-registered 24-permutation specification curve gives median β = +0.107 with 24/24 positive and 22/24 significant (Online Appendix B.1). We read this as a</w:t>
-      </w:r>
-      <w:r>
-        <w:t xml:space="preserve"> </w:t>
-      </w:r>
-      <w:r>
-        <w:rPr>
-          <w:b/>
-          <w:bCs/>
-        </w:rPr>
-        <w:t xml:space="preserve">descriptive</w:t>
-      </w:r>
-      <w:r>
-        <w:t xml:space="preserve"> </w:t>
-      </w:r>
-      <w:r>
-        <w:t xml:space="preserve">compositional-substitution association, conditional on the instrument’s validity — not a causal effect.</w:t>
+        <w:t xml:space="preserve">. Horse races against GDP-growth, urbanization stage, and leader tenure leave β(VAI) essentially unchanged (Online Appendix C.2). A pre-registered 24-permutation specification curve gives median β = +0.107 with 24/24 positive and 22/24 significant (Online Appendix B.1). We read this as a descriptive compositional-substitution association, conditional on the instrument’s validity, and stop short of a causal claim.</w:t>
       </w:r>
     </w:p>
     <w:bookmarkEnd w:id="37"/>
@@ -5684,20 +4883,7 @@
         <w:pStyle w:val="BodyText"/>
       </w:pPr>
       <w:r>
-        <w:t xml:space="preserve">The differential is positive and highly significant, and cannot arise from lexicon-selection (same lexicon), author-style (same author writes both sections), or report-length (VAI is a ratio). We nonetheless report it as</w:t>
-      </w:r>
-      <w:r>
-        <w:t xml:space="preserve"> </w:t>
-      </w:r>
-      <w:r>
-        <w:rPr>
-          <w:b/>
-          <w:bCs/>
-        </w:rPr>
-        <w:t xml:space="preserve">suggestive corroboration</w:t>
-      </w:r>
-      <w:r>
-        <w:t xml:space="preserve">, not a behavioral signature: as in R1, genre differences between retrospective and prospective sections could produce the same pattern (§4.2.1). With the criterion-validity test of §3.2.7 now carrying the behavioral argument, the within-document differential is a secondary, measurement-level fact about how reports are written.</w:t>
+        <w:t xml:space="preserve">The differential is positive and highly significant. It cannot arise from lexicon-selection (same lexicon), from author-style (the same author writes both sections), or from report-length (VAI is a ratio). We nonetheless report it as suggestive corroboration rather than a behavioral signature, since, as in R1, genre differences between retrospective and prospective sections could produce the same pattern (§4.2.1). With the criterion-validity test of §3.2.7 now carrying the behavioral argument, the within-document differential is a secondary, measurement-level fact about how reports are written.</w:t>
       </w:r>
     </w:p>
     <w:bookmarkStart w:id="38" w:name="what-this-does-and-does-not-tell-us"/>
@@ -5714,7 +4900,7 @@
         <w:pStyle w:val="FirstParagraph"/>
       </w:pPr>
       <w:r>
-        <w:t xml:space="preserve">The differential is compatible with the upward-signaling mechanism but is not a unique diagnostic: downstream-facing rhetoric, lexical-availability bias, and selection on what gets completed-versus-planned would also predict it. Robustness to alternative split markers and to long-document/single-tenure subsamples is in Online Appendix C.3.</w:t>
+        <w:t xml:space="preserve">The differential is compatible with the upward-signaling mechanism but is not a unique diagnostic. Downstream-facing rhetoric, lexical-availability bias, and selection on what gets completed-versus-planned would also predict it. Robustness to alternative split markers and to long-document/single-tenure subsamples is in Online Appendix C.3.</w:t>
       </w:r>
     </w:p>
     <w:bookmarkEnd w:id="38"/>
@@ -5733,17 +4919,7 @@
         <w:pStyle w:val="FirstParagraph"/>
       </w:pPr>
       <w:r>
-        <w:t xml:space="preserve">As an entirely separate, large-scale corroboration we classify the universe of Zhejiang public-procurement announcements (</w:t>
-      </w:r>
-      <w:r>
-        <w:rPr>
-          <w:b/>
-          <w:bCs/>
-        </w:rPr>
-        <w:t xml:space="preserve">≈2,957,789 records</w:t>
-      </w:r>
-      <w:r>
-        <w:t xml:space="preserve">, predominantly 2019–2026, national</w:t>
+        <w:t xml:space="preserve">As an entirely separate, large-scale corroboration we classify the universe of Zhejiang public-procurement announcements (≈2,957,789 records, predominantly 2019–2026, national</w:t>
       </w:r>
       <w:r>
         <w:t xml:space="preserve"> </w:t>
@@ -5758,87 +4934,7 @@
         <w:t xml:space="preserve"> </w:t>
       </w:r>
       <w:r>
-        <w:t xml:space="preserve">platform) by the same visible-versus-functional construction distinction.</w:t>
-      </w:r>
-      <w:r>
-        <w:t xml:space="preserve"> </w:t>
-      </w:r>
-      <w:r>
-        <w:rPr>
-          <w:b/>
-          <w:bCs/>
-        </w:rPr>
-        <w:t xml:space="preserve">Visible-type projects outnumber functional ones by roughly 2-to-1 overall</w:t>
-      </w:r>
-      <w:r>
-        <w:t xml:space="preserve"> </w:t>
-      </w:r>
-      <w:r>
-        <w:t xml:space="preserve">(2.1-to-1 among first-stage tender notices, the cleanest one-per-project proxy), and the tilt is pervasive rather than local: visible exceeds functional in</w:t>
-      </w:r>
-      <w:r>
-        <w:t xml:space="preserve"> </w:t>
-      </w:r>
-      <w:r>
-        <w:rPr>
-          <w:b/>
-          <w:bCs/>
-        </w:rPr>
-        <w:t xml:space="preserve">97 of 108</w:t>
-      </w:r>
-      <w:r>
-        <w:t xml:space="preserve"> </w:t>
-      </w:r>
-      <w:r>
-        <w:t xml:space="preserve">localities with sufficient volume (median city ratio 1.8; the exceptions are small county-level units; Online Appendix Figure ESM-6). Going beyond counts, we recover each project’s</w:t>
-      </w:r>
-      <w:r>
-        <w:t xml:space="preserve"> </w:t>
-      </w:r>
-      <w:r>
-        <w:rPr>
-          <w:b/>
-          <w:bCs/>
-        </w:rPr>
-        <w:t xml:space="preserve">investment amount</w:t>
-      </w:r>
-      <w:r>
-        <w:t xml:space="preserve"> </w:t>
-      </w:r>
-      <w:r>
-        <w:t xml:space="preserve">from the tender briefs (16,794 award-stage projects, 2023–2024): visible and functional projects are of broadly similar typical size (median ¥5.8M vs ¥4.7M), but the visible category owns the</w:t>
-      </w:r>
-      <w:r>
-        <w:t xml:space="preserve"> </w:t>
-      </w:r>
-      <w:r>
-        <w:rPr>
-          <w:b/>
-          <w:bCs/>
-        </w:rPr>
-        <w:t xml:space="preserve">high-value tail</w:t>
-      </w:r>
-      <w:r>
-        <w:t xml:space="preserve"> </w:t>
-      </w:r>
-      <w:r>
-        <w:t xml:space="preserve">— its 99th percentile (¥0.90B vs ¥0.20B) and maximum (¥11.5B, the Hangzhou Metro Line 7 contract, vs ¥1.07B) are several times larger, because the biggest construction outlays (metro/rail, arterial roads, landmark parks) are visible-salient while concealed-utility works top out an order of magnitude lower. Visible construction thus predominates on both frequency and the high-value tail. The visible/functional classification was refined by LLM-assisted adjudication with</w:t>
-      </w:r>
-      <w:r>
-        <w:t xml:space="preserve"> </w:t>
-      </w:r>
-      <w:r>
-        <w:rPr>
-          <w:b/>
-          <w:bCs/>
-        </w:rPr>
-        <w:t xml:space="preserve">domain-expert (urban- and rural-planning) sign-off</w:t>
-      </w:r>
-      <w:r>
-        <w:t xml:space="preserve"> </w:t>
-      </w:r>
-      <w:r>
-        <w:t xml:space="preserve">(Authors’ Contributions); the lexicon, re-pull and analysis code, per-city table, and amount distribution are deposited (</w:t>
+        <w:t xml:space="preserve">platform) by the same visible-versus-functional construction distinction. Visible-type projects outnumber functional ones by roughly 2-to-1 overall (2.1-to-1 among first-stage tender notices, the cleanest one-per-project proxy), and the tilt is pervasive rather than local: visible exceeds functional in 97 of 108 localities with sufficient volume (median city ratio 1.8; the exceptions are small county-level units; Online Appendix Figure ESM-6). Going beyond counts, we recover each project’s investment amount from the tender briefs (16,794 award-stage projects, 2023–2024). Visible and functional projects are of broadly similar typical size (median ¥5.8M vs ¥4.7M), but the visible category owns the high-value tail. Its 99th percentile (¥0.90B vs ¥0.20B) and maximum (¥11.5B, the Hangzhou Metro Line 7 contract, vs ¥1.07B) are several times larger, because the biggest construction outlays (metro/rail, arterial roads, landmark parks) are visible-salient while concealed-utility works top out an order of magnitude lower. Visible construction thus predominates on both frequency and the high-value tail. The visible/functional classification was refined by LLM-assisted adjudication with domain-expert (urban- and rural-planning) sign-off (Authors’ Contributions); the lexicon, re-pull and analysis code, per-city table, and amount distribution are deposited (</w:t>
       </w:r>
       <w:r>
         <w:rPr>
@@ -5847,7 +4943,7 @@
         <w:t xml:space="preserve">03-analysis/phase-L-bidding/</w:t>
       </w:r>
       <w:r>
-        <w:t xml:space="preserve">). One caveat: a</w:t>
+        <w:t xml:space="preserve">). One caveat is that a</w:t>
       </w:r>
       <w:r>
         <w:t xml:space="preserve"> </w:t>
@@ -5930,41 +5026,43 @@
         </m:r>
       </m:oMath>
       <w:r>
-        <w:t xml:space="preserve">, and an aggregate renewal-expenditure base, it produces figures on the order of single-digit ¥ billions per year.</w:t>
-      </w:r>
-      <w:r>
-        <w:t xml:space="preserve"> </w:t>
-      </w:r>
+        <w:t xml:space="preserve">, and an aggregate renewal-expenditure base, it produces figures on the order of single-digit ¥ billions per year. We deliberately do not headline this number. It depends on strong assumptions that we have not independently validated: the Cobb-Douglas welfare function, the social-optimum benchmark, and the text-to-spending mapping. The derivation and sensitivity table are in Online Appendix A and C.7, and we attach no policy weight to the magnitude.</w:t>
+      </w:r>
+    </w:p>
+    <w:bookmarkEnd w:id="41"/>
+    <w:bookmarkStart w:id="42" w:name="X6b6670866adc3b05377f51e2f8f6ecb41e2a6a9"/>
+    <w:p>
+      <w:pPr>
+        <w:pStyle w:val="Heading2"/>
+      </w:pPr>
+      <w:r>
+        <w:t xml:space="preserve">4.5 Demoted exercises: transparent reporting of failed/null tests</w:t>
+      </w:r>
+    </w:p>
+    <w:p>
+      <w:pPr>
+        <w:pStyle w:val="FirstParagraph"/>
+      </w:pPr>
+      <w:r>
+        <w:t xml:space="preserve">Two pre-registered tests are demoted from the main evidentiary structure (full detail in Appendix C.3 and Appendix D):</w:t>
+      </w:r>
+    </w:p>
+    <w:p>
+      <w:pPr>
+        <w:pStyle w:val="BodyText"/>
+      </w:pPr>
       <w:r>
         <w:rPr>
           <w:b/>
           <w:bCs/>
         </w:rPr>
-        <w:t xml:space="preserve">We deliberately do not headline this number.</w:t>
-      </w:r>
-      <w:r>
-        <w:t xml:space="preserve"> </w:t>
-      </w:r>
-      <w:r>
-        <w:t xml:space="preserve">It depends on strong, not-independently-validated assumptions (the Cobb-Douglas welfare function, the social-optimum benchmark, the text-to-spending mapping); the derivation and sensitivity table are in Online Appendix A and C.7, and we attach no policy weight to the magnitude.</w:t>
-      </w:r>
-    </w:p>
-    <w:bookmarkEnd w:id="41"/>
-    <w:bookmarkStart w:id="42" w:name="X6b6670866adc3b05377f51e2f8f6ecb41e2a6a9"/>
-    <w:p>
-      <w:pPr>
-        <w:pStyle w:val="Heading2"/>
-      </w:pPr>
-      <w:r>
-        <w:t xml:space="preserve">4.5 Demoted exercises: transparent reporting of failed/null tests</w:t>
-      </w:r>
-    </w:p>
-    <w:p>
-      <w:pPr>
-        <w:pStyle w:val="FirstParagraph"/>
-      </w:pPr>
-      <w:r>
-        <w:t xml:space="preserve">Two pre-registered tests are demoted from the main evidentiary structure (full detail in Appendix C.3 and Appendix D):</w:t>
+        <w:t xml:space="preserve">Null 1, central-inspection event study (H2): definitively null.</w:t>
+      </w:r>
+      <w:r>
+        <w:t xml:space="preserve"> </w:t>
+      </w:r>
+      <w:r>
+        <w:t xml:space="preserve">A narrow-window TWFE specification gave the predicted sign (β(k=0) = −0.065, p = 0.011), but a heterogeneity-robust Sun–Abraham estimator attenuates it to insignificance and, extending to Rounds 6–9 (2016–2017), reverses the sign (β = +0.016). The narrow-window result is a staggered-treatment-heterogeneity artifact [14, 15, 16] rather than a causal inspection effect (deviations D-B-1/2/3).</w:t>
       </w:r>
     </w:p>
     <w:p>
@@ -5976,47 +5074,13 @@
           <w:b/>
           <w:bCs/>
         </w:rPr>
-        <w:t xml:space="preserve">Null 1 — central-inspection event study (H2): definitively null.</w:t>
-      </w:r>
-      <w:r>
-        <w:t xml:space="preserve"> </w:t>
-      </w:r>
-      <w:r>
-        <w:t xml:space="preserve">A narrow-window TWFE specification gave the predicted sign (β(k=0) = −0.065, p = 0.011), but a heterogeneity-robust Sun–Abraham estimator attenuates it to insignificance and, extending to Rounds 6–9 (2016–2017),</w:t>
-      </w:r>
-      <w:r>
-        <w:t xml:space="preserve"> </w:t>
-      </w:r>
-      <w:r>
-        <w:rPr>
-          <w:b/>
-          <w:bCs/>
-        </w:rPr>
-        <w:t xml:space="preserve">reverses the sign</w:t>
-      </w:r>
-      <w:r>
-        <w:t xml:space="preserve"> </w:t>
-      </w:r>
-      <w:r>
-        <w:t xml:space="preserve">(β = +0.016). The narrow-window result is a staggered-treatment-heterogeneity artifact [14, 15, 16], not a causal inspection effect (deviations D-B-1/2/3).</w:t>
-      </w:r>
-    </w:p>
-    <w:p>
-      <w:pPr>
-        <w:pStyle w:val="BodyText"/>
-      </w:pPr>
-      <w:r>
-        <w:rPr>
-          <w:b/>
-          <w:bCs/>
-        </w:rPr>
-        <w:t xml:space="preserve">Null 2 — individual-level CFPS micro-foundation (H5): bounded null.</w:t>
-      </w:r>
-      <w:r>
-        <w:t xml:space="preserve"> </w:t>
-      </w:r>
-      <w:r>
-        <w:t xml:space="preserve">Amenity-category-specific satisfaction items are absent from the public CFPS panel; substituted general outcomes show no effect above |d| = 0.011 (TOST rejects |d| ≥ 0.10 at p &lt; 10⁻⁶). This bounds a citizen-popularity channel but does not test the pre-registered mechanism; reported as exploratory (deviation D-F-1).</w:t>
+        <w:t xml:space="preserve">Null 2, individual-level CFPS micro-foundation (H5): bounded null.</w:t>
+      </w:r>
+      <w:r>
+        <w:t xml:space="preserve"> </w:t>
+      </w:r>
+      <w:r>
+        <w:t xml:space="preserve">Amenity-category-specific satisfaction items are absent from the public CFPS panel; substituted general outcomes show no effect above |d| = 0.011 (TOST rejects |d| ≥ 0.10 at p &lt; 10⁻⁶). This bounds a citizen-popularity channel but does not test the pre-registered mechanism, and is reported as exploratory (deviation D-F-1).</w:t>
       </w:r>
     </w:p>
     <w:bookmarkEnd w:id="42"/>
@@ -6034,7 +5098,7 @@
         <w:pStyle w:val="FirstParagraph"/>
       </w:pPr>
       <w:r>
-        <w:t xml:space="preserve">The validated VAI tracks an external accounting measure of investment composition (P1, β = +0.111, with no effect on total investment); co-moves with real cosmetic investment under an exogenous turnover shock while the naive measure does not (§3.2.7); is corroborated, in an entirely independent procurement corpus, by a ≈2:1 visible-over-functional tilt across 97 of 108 localities and a visible-dominated spending tail (§4.3); and shows a suggestive within-document differential (§4.2). The inspection event study, the CFPS micro-foundation, and the welfare calibration are demoted and reported transparently — they limit, rather than support, the causal and welfare claims the instrument can carry.</w:t>
+        <w:t xml:space="preserve">The validated VAI tracks an external accounting measure of investment composition (P1, β = +0.111, with no effect on total investment). It co-moves with real cosmetic investment under an exogenous turnover shock while the naive measure does not (§3.2.7). In an entirely independent procurement corpus it is corroborated by a ≈2:1 visible-over-functional tilt across 97 of 108 localities and a visible-dominated spending tail (§4.3), and it shows a suggestive within-document differential (§4.2). The inspection event study, the CFPS micro-foundation, and the welfare calibration are demoted and reported transparently; they limit, rather than support, the causal and welfare claims the instrument can carry.</w:t>
       </w:r>
     </w:p>
     <w:bookmarkEnd w:id="43"/>
@@ -6062,7 +5126,7 @@
         <w:pStyle w:val="FirstParagraph"/>
       </w:pPr>
       <w:r>
-        <w:t xml:space="preserve">The paper’s contribution is the Visibility Attention Index — a pre-registered, replicable instrument for the visible-versus-functional composition of infrastructure language — now validated more rigorously than in the original draft and honestly bounded:</w:t>
+        <w:t xml:space="preserve">The paper’s contribution is the Visibility Attention Index, a pre-registered, replicable instrument for the visible-versus-functional composition of infrastructure language. It is now validated more rigorously than in the original draft, and honestly bounded:</w:t>
       </w:r>
     </w:p>
     <w:p>
@@ -6074,17 +5138,7 @@
         </w:numPr>
       </w:pPr>
       <w:r>
-        <w:rPr>
-          <w:b/>
-          <w:bCs/>
-        </w:rPr>
-        <w:t xml:space="preserve">Direct passage-level validation</w:t>
-      </w:r>
-      <w:r>
-        <w:t xml:space="preserve"> </w:t>
-      </w:r>
-      <w:r>
-        <w:t xml:space="preserve">(§3.2.0): the naive appearance-word dictionary fails (visible precision 0.10); the concrete, salience-based VAI reaches 0.50–0.60 but meets a polysemy ceiling near 0.60–0.64; an LLM ensemble clears it (0.84 accuracy, Fleiss κ = 0.835). Human intercoder agreement is Cohen κ = 0.70.</w:t>
+        <w:t xml:space="preserve">Direct passage-level validation (§3.2.0): the naive appearance-word dictionary fails (visible precision 0.10); the concrete, salience-based VAI reaches 0.50–0.60 but meets a polysemy ceiling near 0.60–0.64; an LLM ensemble clears it (0.84 accuracy, Fleiss κ = 0.835). Human intercoder agreement is Cohen κ = 0.70.</w:t>
       </w:r>
     </w:p>
     <w:p>
@@ -6096,17 +5150,7 @@
         </w:numPr>
       </w:pPr>
       <w:r>
-        <w:rPr>
-          <w:b/>
-          <w:bCs/>
-        </w:rPr>
-        <w:t xml:space="preserve">Behavioral criterion validity</w:t>
-      </w:r>
-      <w:r>
-        <w:t xml:space="preserve"> </w:t>
-      </w:r>
-      <w:r>
-        <w:t xml:space="preserve">(§3.2.7), the decisive test: under an exogenous, retirement-driven turnover shock the concrete VAI co-moves with real cosmetic investment (+0.010, p = 0.01; clean pre-trend) while the naive measure does not (+0.002, p = 0.54). The construct is real in behavior, and the right measure tracks it.</w:t>
+        <w:t xml:space="preserve">Behavioral criterion validity (§3.2.7) is the test that does the work. Under an exogenous, retirement-driven turnover shock the concrete VAI co-moves with real cosmetic investment (+0.010, p = 0.01; clean pre-trend), while the naive measure does not (+0.002, p = 0.54). The construct is real in behavior, and the right measure tracks it.</w:t>
       </w:r>
     </w:p>
     <w:p>
@@ -6118,49 +5162,7 @@
         </w:numPr>
       </w:pPr>
       <w:r>
-        <w:rPr>
-          <w:b/>
-          <w:bCs/>
-        </w:rPr>
-        <w:t xml:space="preserve">Cross-source accounting correlation</w:t>
-      </w:r>
-      <w:r>
-        <w:t xml:space="preserve"> </w:t>
-      </w:r>
-      <w:r>
-        <w:t xml:space="preserve">(E-D, r = 0.24) — independent external evidence, modest in magnitude;</w:t>
-      </w:r>
-      <w:r>
-        <w:t xml:space="preserve"> </w:t>
-      </w:r>
-      <w:r>
-        <w:rPr>
-          <w:b/>
-          <w:bCs/>
-        </w:rPr>
-        <w:t xml:space="preserve">independent-dictionary replication</w:t>
-      </w:r>
-      <w:r>
-        <w:t xml:space="preserve"> </w:t>
-      </w:r>
-      <w:r>
-        <w:t xml:space="preserve">(E-A, r = 0.93) — a reliability check, not validation; and an</w:t>
-      </w:r>
-      <w:r>
-        <w:t xml:space="preserve"> </w:t>
-      </w:r>
-      <w:r>
-        <w:rPr>
-          <w:b/>
-          <w:bCs/>
-        </w:rPr>
-        <w:t xml:space="preserve">independent procurement corroboration</w:t>
-      </w:r>
-      <w:r>
-        <w:t xml:space="preserve"> </w:t>
-      </w:r>
-      <w:r>
-        <w:t xml:space="preserve">(§4.3) — a ≈2:1 visible-over-functional tilt in 97 of 108 Zhejiang localities, with a visible-dominated spending tail.</w:t>
+        <w:t xml:space="preserve">A cross-source accounting correlation (E-D, r = 0.24) provides independent external evidence, modest in magnitude. An independent-dictionary replication (E-A, r = 0.93) is a reliability check rather than a validation. And an independent procurement corroboration (§4.3) shows a ≈2:1 visible-over-functional tilt in 97 of 108 Zhejiang localities, with a visible-dominated spending tail.</w:t>
       </w:r>
     </w:p>
     <w:p>
@@ -6168,23 +5170,7 @@
         <w:pStyle w:val="FirstParagraph"/>
       </w:pPr>
       <w:r>
-        <w:t xml:space="preserve">One pre-registered test — applying the lexicon to Chinese Wikipedia —</w:t>
-      </w:r>
-      <w:r>
-        <w:t xml:space="preserve"> </w:t>
-      </w:r>
-      <w:r>
-        <w:rPr>
-          <w:b/>
-          <w:bCs/>
-        </w:rPr>
-        <w:t xml:space="preserve">fails</w:t>
-      </w:r>
-      <w:r>
-        <w:t xml:space="preserve"> </w:t>
-      </w:r>
-      <w:r>
-        <w:t xml:space="preserve">(r = −0.15 against a [0.3, 0.7] criterion), reported plainly as a domain-mismatch that bounds the instrument to governance rhetoric.</w:t>
+        <w:t xml:space="preserve">One pre-registered test, applying the lexicon to Chinese Wikipedia, fails (r = −0.15 against a [0.3, 0.7] criterion). We report it plainly as a domain mismatch that bounds the instrument to governance rhetoric.</w:t>
       </w:r>
     </w:p>
     <w:bookmarkEnd w:id="45"/>
@@ -6202,7 +5188,7 @@
         <w:pStyle w:val="FirstParagraph"/>
       </w:pPr>
       <w:r>
-        <w:t xml:space="preserve">Within cities, VAI tracks the accounting-based Cosmetic Investment Ratio (P1, β = +0.111) with no accompanying change in total investment — a compositional, not expansionary, association — and, under the turnover shock, both rise together. We interpret these as evidence that the measure captures strategic compositional attention; we do not offer a headline welfare figure, the model-based calibration (§4.4) being too assumption-dependent to support one.</w:t>
+        <w:t xml:space="preserve">Within cities, VAI tracks the accounting-based Cosmetic Investment Ratio (P1, β = +0.111) with no accompanying change in total investment. The association is therefore compositional rather than expansionary, and under the turnover shock both rise together. We read these as evidence that the measure captures strategic compositional attention. We do not offer a headline welfare figure, because the model-based calibration (§4.4) is too assumption-dependent to support one.</w:t>
       </w:r>
     </w:p>
     <w:bookmarkEnd w:id="46"/>
@@ -6224,17 +5210,7 @@
         </w:numPr>
       </w:pPr>
       <w:r>
-        <w:rPr>
-          <w:b/>
-          <w:bCs/>
-        </w:rPr>
-        <w:t xml:space="preserve">Causal identification of drivers is not achieved.</w:t>
-      </w:r>
-      <w:r>
-        <w:t xml:space="preserve"> </w:t>
-      </w:r>
-      <w:r>
-        <w:t xml:space="preserve">The inspection event study fails under heterogeneity-robust estimation (§4.5); the retirement-turnover design supports</w:t>
+        <w:t xml:space="preserve">Causal identification of drivers is not achieved. The inspection event study fails under heterogeneity-robust estimation (§4.5); the retirement-turnover design supports</w:t>
       </w:r>
       <w:r>
         <w:t xml:space="preserve"> </w:t>
@@ -6262,17 +5238,7 @@
         </w:numPr>
       </w:pPr>
       <w:r>
-        <w:rPr>
-          <w:b/>
-          <w:bCs/>
-        </w:rPr>
-        <w:t xml:space="preserve">External (non-governance) validity is bounded.</w:t>
-      </w:r>
-      <w:r>
-        <w:t xml:space="preserve"> </w:t>
-      </w:r>
-      <w:r>
-        <w:t xml:space="preserve">The Wikipedia null scopes the measure to governance rhetoric; an appropriate policy-rhetoric third-party validation (e.g., Xinhua local-policy news, CNKI key-newspaper coverage) remains future work.</w:t>
+        <w:t xml:space="preserve">External (non-governance) validity is bounded. The Wikipedia null scopes the measure to governance rhetoric, and an appropriate policy-rhetoric third-party validation (e.g., Xinhua local-policy news, CNKI key-newspaper coverage) remains future work.</w:t>
       </w:r>
     </w:p>
     <w:p>
@@ -6284,17 +5250,7 @@
         </w:numPr>
       </w:pPr>
       <w:r>
-        <w:rPr>
-          <w:b/>
-          <w:bCs/>
-        </w:rPr>
-        <w:t xml:space="preserve">Intercoder agreement is substantial but not perfect.</w:t>
-      </w:r>
-      <w:r>
-        <w:t xml:space="preserve"> </w:t>
-      </w:r>
-      <w:r>
-        <w:t xml:space="preserve">Two human coders reach Cohen κ = 0.70 on the 120-sentence gold set; residual disagreement concentrates on the visible-versus-mixed boundary — itself a manifestation of the polysemy the paper documents — so passage-level precision/recall carry a few points of coder-judgment uncertainty.</w:t>
+        <w:t xml:space="preserve">Intercoder agreement is substantial but not perfect. Two human coders reach Cohen κ = 0.70 on the 120-sentence gold set. Residual disagreement concentrates on the visible-versus-mixed boundary, itself a manifestation of the polysemy the paper documents, so passage-level precision/recall carry a few points of coder-judgment uncertainty.</w:t>
       </w:r>
     </w:p>
     <w:p>
@@ -6306,17 +5262,7 @@
         </w:numPr>
       </w:pPr>
       <w:r>
-        <w:rPr>
-          <w:b/>
-          <w:bCs/>
-        </w:rPr>
-        <w:t xml:space="preserve">The procurement corroboration is provincial.</w:t>
-      </w:r>
-      <w:r>
-        <w:t xml:space="preserve"> </w:t>
-      </w:r>
-      <w:r>
-        <w:t xml:space="preserve">It covers Zhejiang; frequency and amount both corroborate the tilt, but a</w:t>
+        <w:t xml:space="preserve">The procurement corroboration is provincial. It covers Zhejiang, and although frequency and amount both corroborate the tilt, a</w:t>
       </w:r>
       <w:r>
         <w:t xml:space="preserve"> </w:t>
@@ -6340,17 +5286,7 @@
         </w:numPr>
       </w:pPr>
       <w:r>
-        <w:rPr>
-          <w:b/>
-          <w:bCs/>
-        </w:rPr>
-        <w:t xml:space="preserve">No welfare claim.</w:t>
-      </w:r>
-      <w:r>
-        <w:t xml:space="preserve"> </w:t>
-      </w:r>
-      <w:r>
-        <w:t xml:space="preserve">The structural welfare figure is assumption-dependent and demoted; we attach no policy magnitude to it.</w:t>
+        <w:t xml:space="preserve">No welfare claim. The structural welfare figure is assumption-dependent and demoted, and we attach no policy magnitude to it.</w:t>
       </w:r>
     </w:p>
     <w:bookmarkEnd w:id="47"/>
@@ -6368,7 +5304,7 @@
         <w:pStyle w:val="FirstParagraph"/>
       </w:pPr>
       <w:r>
-        <w:t xml:space="preserve">The construction-and-validation protocol — seed a dictionary, validate at the passage level,</w:t>
+        <w:t xml:space="preserve">The construction-and-validation protocol has a fixed shape: seed a dictionary, validate at the passage level,</w:t>
       </w:r>
       <w:r>
         <w:t xml:space="preserve"> </w:t>
@@ -6381,7 +5317,7 @@
         <w:t xml:space="preserve">report the ceiling</w:t>
       </w:r>
       <w:r>
-        <w:t xml:space="preserve">, escalate to LLM classification where needed, and anchor validity behaviorally against an accounting outcome under an exogenous shock — is in principle portable to other settings where bureaucratic agents produce structured, consequential annual documents (EU National Reform Programmes; Indian state budget speeches; Mexican municipal</w:t>
+        <w:t xml:space="preserve">, escalate to LLM classification where needed, and anchor validity behaviorally against an accounting outcome under an exogenous shock. In principle this protocol ports to other settings where bureaucratic agents produce structured, consequential annual documents (EU National Reform Programmes; Indian state budget speeches; Mexican municipal</w:t>
       </w:r>
       <w:r>
         <w:t xml:space="preserve"> </w:t>
@@ -6413,7 +5349,7 @@
         <w:t xml:space="preserve"> </w:t>
       </w:r>
       <w:r>
-        <w:t xml:space="preserve">portable is the specific lexicon and the institutional observability-asymmetry parameters, which require re-derivation in each context. The transferable contribution is the validation discipline, not the keyword list.</w:t>
+        <w:t xml:space="preserve">portable is the specific lexicon and the institutional observability-asymmetry parameters, which require re-derivation in each context. What transfers is the validation discipline, not the keyword list.</w:t>
       </w:r>
     </w:p>
     <w:bookmarkEnd w:id="48"/>
@@ -6431,55 +5367,7 @@
         <w:pStyle w:val="FirstParagraph"/>
       </w:pPr>
       <w:r>
-        <w:t xml:space="preserve">If the cadre-attention model is substantively correct — theoretically motivated and now behaviorally supported (§3.2.7) but not cleanly identified causally — three levers follow.</w:t>
-      </w:r>
-      <w:r>
-        <w:t xml:space="preserve"> </w:t>
-      </w:r>
-      <w:r>
-        <w:rPr>
-          <w:b/>
-          <w:bCs/>
-        </w:rPr>
-        <w:t xml:space="preserve">(1) Increase the observability of functional categories</w:t>
-      </w:r>
-      <w:r>
-        <w:t xml:space="preserve"> </w:t>
-      </w:r>
-      <w:r>
-        <w:t xml:space="preserve">(reduce the legibility asymmetry): real-time pipe-pressure telemetry, open waterworks dashboards, mandatory structural-safety reporting.</w:t>
-      </w:r>
-      <w:r>
-        <w:t xml:space="preserve"> </w:t>
-      </w:r>
-      <w:r>
-        <w:rPr>
-          <w:b/>
-          <w:bCs/>
-        </w:rPr>
-        <w:t xml:space="preserve">(2) Introduce functional output targets in cadre evaluation</w:t>
-      </w:r>
-      <w:r>
-        <w:t xml:space="preserve"> </w:t>
-      </w:r>
-      <w:r>
-        <w:t xml:space="preserve">(raise the social-motivation weight).</w:t>
-      </w:r>
-      <w:r>
-        <w:t xml:space="preserve"> </w:t>
-      </w:r>
-      <w:r>
-        <w:rPr>
-          <w:b/>
-          <w:bCs/>
-        </w:rPr>
-        <w:t xml:space="preserve">(3) Citizen-audit portals</w:t>
-      </w:r>
-      <w:r>
-        <w:t xml:space="preserve"> </w:t>
-      </w:r>
-      <w:r>
-        <w:t xml:space="preserve">as supplementary, informational pressure (given the §4.5 individual-level null). Because these follow from the model rather than from identified causal estimates, we offer them as model-implied possibilities, not forecasts, and attach no net-present-value figure.</w:t>
+        <w:t xml:space="preserve">Suppose the cadre-attention model is substantively correct. It is theoretically motivated and now behaviorally supported (§3.2.7), though not cleanly identified causally. Three levers then follow. (1) Increase the observability of functional categories, reducing the legibility asymmetry, through real-time pipe-pressure telemetry, open waterworks dashboards, and mandatory structural-safety reporting. (2) Introduce functional output targets in cadre evaluation, raising the social-motivation weight. (3) Build citizen-audit portals as supplementary, informational pressure, given the §4.5 individual-level null. Because these follow from the model rather than from identified causal estimates, we offer them as model-implied possibilities rather than forecasts, and attach no net-present-value figure.</w:t>
       </w:r>
     </w:p>
     <w:p>
@@ -6505,7 +5393,7 @@
         <w:pStyle w:val="FirstParagraph"/>
       </w:pPr>
       <w:r>
-        <w:t xml:space="preserve">We set out to measure visibility bias in Chinese municipal government work reports and to take seriously the question applied dictionary work usually skips: does the measure capture the construct? The Visibility Attention Index, built from 6,294 GWRs, is validated directly at the passage level — honestly, including the naive dictionary’s failure (precision 0.10), the concrete lexicon’s polysemy ceiling (~0.60), and an LLM ensemble that clears it (0.84) — and, decisively, behaviorally: under an exogenous retirement-turnover shock the valid measure co-moves with real cosmetic investment while the naive one does not. Descriptively, VAI tracks the accounting Cosmetic Investment Ratio and is corroborated by an independent procurement corpus (visible projects ≈2:1 over functional, owning the high-value tail). One pre-registered third-party test failed and is reported plainly; an inspection event study, a CFPS micro-foundation, and a welfare calibration are demoted as non-robust or assumption-dependent.</w:t>
+        <w:t xml:space="preserve">We set out to measure visibility bias in Chinese municipal government work reports and to take seriously the question applied dictionary work usually skips: does the measure capture the construct? The Visibility Attention Index, built from 6,294 GWRs, is validated directly at the passage level. We report that validation honestly, including the naive dictionary’s failure (precision 0.10), the concrete lexicon’s polysemy ceiling (~0.60), and an LLM ensemble that clears it (0.84). The behavioral test settles the question: under an exogenous retirement-turnover shock the valid measure co-moves with real cosmetic investment while the naive one does not. Descriptively, VAI tracks the accounting Cosmetic Investment Ratio and is corroborated by an independent procurement corpus, where visible projects run ≈2:1 over functional and own the high-value tail. One pre-registered third-party test failed and is reported plainly. An inspection event study, a CFPS micro-foundation, and a welfare calibration are demoted as non-robust or assumption-dependent.</w:t>
       </w:r>
     </w:p>
     <w:p>
@@ -6513,7 +5401,7 @@
         <w:pStyle w:val="BodyText"/>
       </w:pPr>
       <w:r>
-        <w:t xml:space="preserve">The contribution is methodological: a pre-registered, passage-validated, behaviorally-anchored instrument for measuring compositional infrastructure rhetoric, with an honest map of its limits and a high-precision LLM alternative where the dictionary stops. Two points may outlast this one-country case and invite testing elsewhere: that polysemy imposes a precision ceiling on dictionary measures of everyday-word constructs that curation cannot break and that should be reported, not hidden; and that for measures of strategic attention the decisive validity test is behavioral co-movement under an exogenous shock — not internal reliability, and not passage precision alone. We invite extension via a policy-rhetoric third-party corpus, additional exogenous shocks, and application to bureaucratic text in other institutional settings.</w:t>
+        <w:t xml:space="preserve">The contribution is methodological: a pre-registered, passage-validated, behaviorally-anchored instrument for measuring compositional infrastructure rhetoric, with an honest map of its limits and a high-precision LLM alternative where the dictionary stops. Two points may carry beyond this one-country case and invite testing elsewhere. First, polysemy imposes a precision ceiling on dictionary measures of everyday-word constructs that curation cannot break, and that ceiling should be reported rather than hidden. Second, for measures of strategic attention the validity test that decides the matter is behavioral co-movement under an exogenous shock, not internal reliability or passage precision alone. We invite extension via a policy-rhetoric third-party corpus, further exogenous shocks, and application to bureaucratic text in other institutional settings.</w:t>
       </w:r>
     </w:p>
     <w:p>
@@ -6971,7 +5859,7 @@
         <w:t xml:space="preserve">Reason</w:t>
       </w:r>
       <w:r>
-        <w:t xml:space="preserve">: After aggregation to the prefecture-year panel, only two distinct inspection-treatment years survive (2013 and 2014). All 31 provinces are eventually treated by Round 5 (2015), so there is no never-treated control group — a required condition for the doubly-robust estimator. The pre-registered specification is infeasible.</w:t>
+        <w:t xml:space="preserve">: After aggregation to the prefecture-year panel, only two distinct inspection-treatment years survive (2013 and 2014). All 31 provinces are eventually treated by Round 5 (2015), so there is no never-treated control group. Because the doubly-robust estimator requires such a group, the pre-registered specification is infeasible.</w:t>
       </w:r>
     </w:p>
     <w:p>
@@ -7041,7 +5929,7 @@
         <w:t xml:space="preserve">Result</w:t>
       </w:r>
       <w:r>
-        <w:t xml:space="preserve">: β(k=0) = −0.019, SE = 0.117, p = 0.87. Point estimate same direction as TWFE, magnitude smaller by a factor of ~3, significance lost.</w:t>
+        <w:t xml:space="preserve">: β(k=0) = −0.019, SE = 0.117, p = 0.87. The point estimate runs in the same direction as TWFE, but the magnitude is smaller by a factor of ~3 and significance is lost.</w:t>
       </w:r>
     </w:p>
     <w:p>
@@ -7167,7 +6055,7 @@
         <w:t xml:space="preserve">Interpretation</w:t>
       </w:r>
       <w:r>
-        <w:t xml:space="preserve">: All nine cohort-specific CATT(k=0) values under the expanded sample are positive (+0.011 to +0.083). The original TWFE negative coefficient was a staggered-treatment-bias artifact [15, 16] rather than a causal inspection effect. We report H2 as</w:t>
+        <w:t xml:space="preserve">: All nine cohort-specific CATT(k=0) values under the expanded sample are positive (+0.011 to +0.083). The original TWFE negative coefficient was a staggered-treatment-bias artifact [15, 16], not a causal inspection effect. We report H2 as</w:t>
       </w:r>
       <w:r>
         <w:t xml:space="preserve"> </w:t>
@@ -7195,7 +6083,7 @@
         <w:t xml:space="preserve"> </w:t>
       </w:r>
       <w:r>
-        <w:t xml:space="preserve">framing from earlier drafts is withdrawn. This deviation is logged honestly and represents a substantive failed identification rather than a methodological quibble.</w:t>
+        <w:t xml:space="preserve">framing from earlier drafts is withdrawn. We log this deviation honestly; it represents a substantive failed identification, not a methodological quibble.</w:t>
       </w:r>
     </w:p>
     <w:bookmarkEnd w:id="56"/>
@@ -7241,25 +6129,25 @@
         <w:t xml:space="preserve"> </w:t>
       </w:r>
       <w:r>
-        <w:t xml:space="preserve">- E-A: Expanded internal dictionary (78+70 terms, independently curated) — resulting r(VAI_orig, VAI_ext) = 0.93.</w:t>
-      </w:r>
-      <w:r>
-        <w:t xml:space="preserve"> </w:t>
-      </w:r>
-      <w:r>
-        <w:t xml:space="preserve">- E-B: Within-document retrospective-vs-prospective section split — Δ(review − plan) = +0.025, paired t = 8.4, p &lt; 10⁻¹⁶.</w:t>
-      </w:r>
-      <w:r>
-        <w:t xml:space="preserve"> </w:t>
-      </w:r>
-      <w:r>
-        <w:t xml:space="preserve">- E-C: Dictionary-bootstrap half-halves — mean r = 0.18 (reported as limitation).</w:t>
-      </w:r>
-      <w:r>
-        <w:t xml:space="preserve"> </w:t>
-      </w:r>
-      <w:r>
-        <w:t xml:space="preserve">- Additionally: E-A CIR replication with VAI_ext — β = +0.111, p = 0.011.</w:t>
+        <w:t xml:space="preserve">- E-A: Expanded internal dictionary (78+70 terms, independently curated), giving r(VAI_orig, VAI_ext) = 0.93.</w:t>
+      </w:r>
+      <w:r>
+        <w:t xml:space="preserve"> </w:t>
+      </w:r>
+      <w:r>
+        <w:t xml:space="preserve">- E-B: Within-document retrospective-vs-prospective section split, with Δ(review − plan) = +0.025, paired t = 8.4, p &lt; 10⁻¹⁶.</w:t>
+      </w:r>
+      <w:r>
+        <w:t xml:space="preserve"> </w:t>
+      </w:r>
+      <w:r>
+        <w:t xml:space="preserve">- E-C: Dictionary-bootstrap half-halves, mean r = 0.18 (reported as limitation).</w:t>
+      </w:r>
+      <w:r>
+        <w:t xml:space="preserve"> </w:t>
+      </w:r>
+      <w:r>
+        <w:t xml:space="preserve">- E-A CIR replication with VAI_ext, a further check, gave β = +0.111, p = 0.011.</w:t>
       </w:r>
     </w:p>
     <w:p>
@@ -7274,7 +6162,7 @@
         <w:t xml:space="preserve">Reason</w:t>
       </w:r>
       <w:r>
-        <w:t xml:space="preserve">: Internal tests are stronger than originally pre-registered because they directly probe the dictionary’s measurement stability and identify a novel within-document behavioral signature (E-B). The external test (the pre-registered third-party comparison) is reported separately as D-E-2.</w:t>
+        <w:t xml:space="preserve">: Internal tests are stronger than originally pre-registered because they directly probe the dictionary’s measurement stability and identify a novel within-document behavioral signature (E-B). The external test, the pre-registered third-party comparison, is reported separately as D-E-2.</w:t>
       </w:r>
     </w:p>
     <w:bookmarkEnd w:id="57"/>
@@ -7314,7 +6202,7 @@
         <w:t xml:space="preserve">Executed</w:t>
       </w:r>
       <w:r>
-        <w:t xml:space="preserve">: Substituted Chinese Wikipedia (zh.wikipedia.org) as publicly-accessible third-party source, using MediaWiki API. 282 of 286 target cities fetched (4 misses: Ji’an, Songyuan, Meizhou, Baishan). Mean article length 8,447 chars. Same V_ORIG + F_ORIG lexicon applied.</w:t>
+        <w:t xml:space="preserve">: Substituted Chinese Wikipedia (zh.wikipedia.org) as a publicly-accessible third-party source, fetched via the MediaWiki API. 282 of 286 target cities fetched (4 misses: Ji’an, Songyuan, Meizhou, Baishan). Mean article length 8,447 chars. Same V_ORIG + F_ORIG lexicon applied.</w:t>
       </w:r>
     </w:p>
     <w:p>
@@ -7397,7 +6285,7 @@
         <w:t xml:space="preserve">Reason for substitute source</w:t>
       </w:r>
       <w:r>
-        <w:t xml:space="preserve">: Xinhua news and CNKI key-newspaper archives require CARSI-authenticated institutional access not available in the α-full session. Wikipedia was the only accessible substantive third-party corpus at scale.</w:t>
+        <w:t xml:space="preserve">: Xinhua news and CNKI key-newspaper archives require CARSI-authenticated institutional access that was not available in the α-full session. Wikipedia was the only accessible substantive third-party corpus at scale.</w:t>
       </w:r>
     </w:p>
     <w:p>
@@ -7412,7 +6300,7 @@
         <w:t xml:space="preserve">Interpretation</w:t>
       </w:r>
       <w:r>
-        <w:t xml:space="preserve">: We interpret the null as evidence that encyclopedic descriptive text (Wikipedia) is a domain-mismatched source for a governance-rhetoric measurement instrument, rather than as evidence that the VAI itself is invalid. The appropriate third-party source is</w:t>
+        <w:t xml:space="preserve">: We read the null as evidence that encyclopedic descriptive text (Wikipedia) is a domain-mismatched source for a governance-rhetoric measurement instrument, rather than as evidence that the VAI itself is invalid. The appropriate third-party source is</w:t>
       </w:r>
       <w:r>
         <w:t xml:space="preserve"> </w:t>
@@ -7428,7 +6316,7 @@
         <w:t xml:space="preserve"> </w:t>
       </w:r>
       <w:r>
-        <w:t xml:space="preserve">text — Xinhua local-policy news or CNKI key-newspaper government reporting — whose construction is deferred to future work (see §5.3). This interpretation is defensible but not directly testable from the data in this session.</w:t>
+        <w:t xml:space="preserve">text (Xinhua local-policy news or CNKI key-newspaper government reporting), whose construction is deferred to future work (see §5.3). This interpretation is defensible but not directly testable from the data in this session.</w:t>
       </w:r>
     </w:p>
     <w:p>
@@ -7499,7 +6387,7 @@
         <w:t xml:space="preserve">Executed</w:t>
       </w:r>
       <w:r>
-        <w:t xml:space="preserve">: Three alternative CFPS outcomes — qn1101 (county government evaluation, 1–5), qn12012 (life satisfaction, 1–5), health (self-rated, 1–5). Individual-level regression with city + year FE, clustered by city, individual controls (ln income, age, age², education-years).</w:t>
+        <w:t xml:space="preserve">: Three alternative CFPS outcomes: qn1101 (county government evaluation, 1–5), qn12012 (life satisfaction, 1–5), health (self-rated, 1–5). Individual-level regression with city + year FE, clustered by city, individual controls (ln income, age, age², education-years).</w:t>
       </w:r>
     </w:p>
     <w:p>
@@ -8337,7 +7225,7 @@
         <w:t xml:space="preserve"> </w:t>
       </w:r>
       <w:r>
-        <w:t xml:space="preserve">We report all transparently. The revised paper’s spine is the behavioral criterion-validity co-movement (D-J-1): under an exogenous retirement-turnover shock the valid concrete measure co-moves with real cosmetic investment (+0.010, p = 0.01) while the naive measure does not (+0.002, p = 0.54). The measurement contributions are the passage-level validation with its reported polysemy ceiling and the LLM-ensemble high-precision alternative (both §3.2.0). The cross-sectional β(VAI → CIR) association and the structural welfare calibration are demoted to supporting/illustrative; the failed P2 inspection design (D-B-3) and the failed H4/H5 tests (D-E-2/D-F-1) are reported honestly and narrow the scope but do not bear on the criterion-validity spine.</w:t>
+        <w:t xml:space="preserve">We report all transparently. The revised paper’s spine is the behavioral criterion-validity co-movement (D-J-1): under an exogenous retirement-turnover shock the valid concrete measure co-moves with real cosmetic investment (+0.010, p = 0.01) while the naive measure does not (+0.002, p = 0.54). The measurement contributions are the passage-level validation with its reported polysemy ceiling and the LLM-ensemble high-precision alternative (both §3.2.0). The cross-sectional β(VAI → CIR) association and the structural welfare calibration are demoted to supporting/illustrative. The failed P2 inspection design (D-B-3) and the failed H4/H5 tests (D-E-2/D-F-1) are reported honestly. They narrow the scope but do not bear on the criterion-validity spine.</w:t>
       </w:r>
     </w:p>
     <w:p>
@@ -8446,7 +7334,7 @@
         <w:pStyle w:val="FirstParagraph"/>
       </w:pPr>
       <w:r>
-        <w:t xml:space="preserve">The main text (§2) gives an intuitive summary of the cadre-attention model. This appendix provides the full derivation.</w:t>
+        <w:t xml:space="preserve">The main text (§2) gives an intuitive summary of the cadre-attention model. The full derivation follows.</w:t>
       </w:r>
     </w:p>
     <w:bookmarkStart w:id="65" w:name="a.1-setup"/>
@@ -10216,7 +9104,7 @@
         <w:pStyle w:val="FirstParagraph"/>
       </w:pPr>
       <w:r>
-        <w:t xml:space="preserve">This quadratic form permits calibration from observed</w:t>
+        <w:t xml:space="preserve">This quadratic form allows calibration from observed</w:t>
       </w:r>
       <w:r>
         <w:t xml:space="preserve"> </w:t>
@@ -10247,7 +9135,7 @@
         <w:t xml:space="preserve"> </w:t>
       </w:r>
       <w:r>
-        <w:t xml:space="preserve">and a standard social-optimum benchmark</w:t>
+        <w:t xml:space="preserve">together with a standard social-optimum benchmark</w:t>
       </w:r>
       <w:r>
         <w:t xml:space="preserve"> </w:t>
@@ -10298,7 +9186,7 @@
           <w:i/>
           <w:iCs/>
         </w:rPr>
-        <w:t xml:space="preserve">This appendix supports the cross-sectional VAI→CIR association (§4.1), a modest external check (E-D, §3.2.4); it is not part of the main evidentiary spine (the behavioral criterion-validity co-movement of §3.2.7).</w:t>
+        <w:t xml:space="preserve">This appendix supports the cross-sectional VAI→CIR association (§4.1), a modest external check (E-D, §3.2.4). It is not part of the main evidentiary spine, which rests on the behavioral criterion-validity co-movement of §3.2.7.</w:t>
       </w:r>
     </w:p>
     <w:bookmarkStart w:id="69" w:name="b.1-24-permutation-specification-curve"/>
@@ -11145,7 +10033,7 @@
         <w:t xml:space="preserve">Accident-record visibility</w:t>
       </w:r>
       <w:r>
-        <w:t xml:space="preserve">: Ministry of Emergency Management major-accident reports by category. Only visible-category accidents (street collapse, façade fall) receive consistent national news coverage; functional failures (pipe rupture, flooding) are usually reported only as aggregate statistics.</w:t>
+        <w:t xml:space="preserve">: Ministry of Emergency Management major-accident reports by category. Only visible-category accidents (street collapse, façade fall) receive consistent national news coverage. Functional failures (pipe rupture, flooding) are usually reported only as aggregate statistics.</w:t>
       </w:r>
     </w:p>
     <w:p>
@@ -12220,7 +11108,7 @@
         </m:r>
       </m:oMath>
       <w:r>
-        <w:t xml:space="preserve">. The ¥55B BOE is a ceiling. (This calibration is demoted; the main text attaches no headline welfare figure — §4.4.)</w:t>
+        <w:t xml:space="preserve">. The ¥55B BOE is a ceiling. (This calibration is demoted; the main text attaches no headline welfare figure. See §4.4.)</w:t>
       </w:r>
     </w:p>
     <w:bookmarkEnd w:id="77"/>
@@ -13012,7 +11900,7 @@
         <w:t xml:space="preserve"> </w:t>
       </w:r>
       <w:r>
-        <w:t xml:space="preserve">alone accounts for ~70% of visible false positives — the single-cause failure motivating the move to a concrete, salience-based lexicon (§3.2.2). Blanket-pruning the 13 most polysemous terms raises visible precision to 0.59 but collapses recall to 0.47, so the fix is surgical.</w:t>
+        <w:t xml:space="preserve">alone accounts for ~70% of visible false positives. This single-cause failure motivated the move to a concrete, salience-based lexicon (§3.2.2). Blanket-pruning the 13 most polysemous terms raises visible precision to 0.59 but collapses recall to 0.47, so the fix is surgical.</w:t>
       </w:r>
     </w:p>
     <w:p>
@@ -13055,7 +11943,7 @@
         <w:t xml:space="preserve"> </w:t>
       </w:r>
       <w:r>
-        <w:t xml:space="preserve">(substantial; n = 120). Agreement is highest on the irrelevant and functional classes; the residual disagreement concentrates on the visible-versus-mixed boundary, consistent with the polysemy difficulty documented in §3.2.0 (and itself part of why high passage precision favors the LLM ensemble). Human↔ensemble agreement is Cohen κ = 0.66.</w:t>
+        <w:t xml:space="preserve">(substantial; n = 120). Agreement is highest on the irrelevant and functional classes. The residual disagreement concentrates on the visible-versus-mixed boundary, consistent with the polysemy difficulty documented in §3.2.0, which is itself part of why high passage precision favors the LLM ensemble. Human↔ensemble agreement is Cohen κ = 0.66.</w:t>
       </w:r>
     </w:p>
     <w:p>

</xml_diff>

<commit_message>
Fix stale §4.4→§4.5 cross-refs (inspection/CFPS demoted) in appendices
Co-Authored-By: Claude Opus 4.8 (1M context) <noreply@anthropic.com>
</commit_message>
<xml_diff>
--- a/05-manuscript/submission/manuscript_R2.docx
+++ b/05-manuscript/submission/manuscript_R2.docx
@@ -6071,7 +6071,7 @@
         <w:t xml:space="preserve"> </w:t>
       </w:r>
       <w:r>
-        <w:t xml:space="preserve">in §4.4. The pre-registered</w:t>
+        <w:t xml:space="preserve">in §4.5. The pre-registered</w:t>
       </w:r>
       <w:r>
         <w:t xml:space="preserve"> </w:t>
@@ -6460,7 +6460,7 @@
         <w:t xml:space="preserve"> </w:t>
       </w:r>
       <w:r>
-        <w:t xml:space="preserve">After S7 Red Team review identified this framing as post-hoc rationalization of a failed directional prediction, we revised §4.4 to report the results as</w:t>
+        <w:t xml:space="preserve">After S7 Red Team review identified this framing as post-hoc rationalization of a failed directional prediction, we revised §4.5 to report the results as</w:t>
       </w:r>
       <w:r>
         <w:t xml:space="preserve"> </w:t>
@@ -7233,7 +7233,7 @@
         <w:pStyle w:val="BodyText"/>
       </w:pPr>
       <w:r>
-        <w:t xml:space="preserve">The pre-registered archive (OSF ZMJY5) is unmodified. This deviation log is the canonical record of what was done relative to what was promised. All decisions to deviate were made before examining the post-deviation outcomes (with the one exception of §4.4’s re-framing of the CFPS null from confirmatory to exploratory, which was a post-hoc interpretation-level revision disclosed explicitly in D-F-1 and in §4.4’s opening paragraph).</w:t>
+        <w:t xml:space="preserve">The pre-registered archive (OSF ZMJY5) is unmodified. This deviation log is the canonical record of what was done relative to what was promised. All decisions to deviate were made before examining the post-deviation outcomes (with the one exception of §4.5’s re-framing of the CFPS null from confirmatory to exploratory, which was a post-hoc interpretation-level revision disclosed explicitly in D-F-1 and in §4.4’s opening paragraph).</w:t>
       </w:r>
     </w:p>
     <w:bookmarkEnd w:id="63"/>
@@ -9639,13 +9639,13 @@
       </w:tr>
     </w:tbl>
     <w:bookmarkEnd w:id="72"/>
-    <w:bookmarkStart w:id="73" w:name="c.3-p2-placebo-battery-main-text-4.4.1"/>
+    <w:bookmarkStart w:id="73" w:name="c.3-p2-placebo-battery-main-text-4.5"/>
     <w:p>
       <w:pPr>
         <w:pStyle w:val="Heading3"/>
       </w:pPr>
       <w:r>
-        <w:t xml:space="preserve">C.3 P2 placebo battery (main text §4.4.1)</w:t>
+        <w:t xml:space="preserve">C.3 P2 placebo battery (main text §4.5)</w:t>
       </w:r>
     </w:p>
     <w:p>

</xml_diff>

<commit_message>
Fix 3 citizen/CFPS bounded-null cross-refs §4.4→§4.5
</commit_message>
<xml_diff>
--- a/05-manuscript/submission/manuscript_R2.docx
+++ b/05-manuscript/submission/manuscript_R2.docx
@@ -981,7 +981,7 @@
         <w:t xml:space="preserve"> </w:t>
       </w:r>
       <w:r>
-        <w:t xml:space="preserve">principal; lateral citizen perception is a distinct channel, which our individual-level analysis treats as a bounded null rather than the mechanism (§4.4).</w:t>
+        <w:t xml:space="preserve">principal; lateral citizen perception is a distinct channel, which our individual-level analysis treats as a bounded null rather than the mechanism (§4.5).</w:t>
       </w:r>
     </w:p>
     <w:bookmarkEnd w:id="16"/>
@@ -1779,7 +1779,7 @@
         <w:t xml:space="preserve">superior</w:t>
       </w:r>
       <w:r>
-        <w:t xml:space="preserve">. The salience criterion is defined relative to this upward principal, which is the channel through which the observability asymmetry of §2.1 operates. The lateral citizen channel is reported as a bounded null (§4.4) rather than asserted as the mechanism.</w:t>
+        <w:t xml:space="preserve">. The salience criterion is defined relative to this upward principal, which is the channel through which the observability asymmetry of §2.1 operates. The lateral citizen channel is reported as a bounded null (§4.5) rather than asserted as the mechanism.</w:t>
       </w:r>
     </w:p>
     <w:bookmarkEnd w:id="21"/>
@@ -3802,7 +3802,7 @@
         <w:t xml:space="preserve"> </w:t>
       </w:r>
       <w:r>
-        <w:t xml:space="preserve">is the source of the accounting CIR (cosmetic categories ÷ total urban-construction investment) and of the cosmetic/functional split the concrete lexicon mirrors. A city-year control panel covers 282 cities × 2002–2024. A municipal-leader panel gives party-secretary turnover, tenure, and age (the basis for the retirement-driven shock in §3.2.7). The China Family Panel Studies (CFPS, 2010–2022) supplies the bounded individual-level null (§4.4). Zhejiang public-procurement records (≈2,957,789 announcements, predominantly 2019–2026, national</w:t>
+        <w:t xml:space="preserve">is the source of the accounting CIR (cosmetic categories ÷ total urban-construction investment) and of the cosmetic/functional split the concrete lexicon mirrors. A city-year control panel covers 282 cities × 2002–2024. A municipal-leader panel gives party-secretary turnover, tenure, and age (the basis for the retirement-driven shock in §3.2.7). The China Family Panel Studies (CFPS, 2010–2022) supplies the bounded individual-level null (§4.5). Zhejiang public-procurement records (≈2,957,789 announcements, predominantly 2019–2026, national</w:t>
       </w:r>
       <w:r>
         <w:t xml:space="preserve"> </w:t>

</xml_diff>

<commit_message>
Consistency: renumber figures/tables (Fig 1 ladder, Fig 2 co-movement; Tables 0-4), fix dangling Panel-A ref, sync title-page metadata to final manuscript; regenerate all 4 DOCX
Co-Authored-By: Claude Opus 4.8 (1M context) <noreply@anthropic.com>
</commit_message>
<xml_diff>
--- a/05-manuscript/submission/manuscript_R2.docx
+++ b/05-manuscript/submission/manuscript_R2.docx
@@ -2440,7 +2440,7 @@
         <w:pStyle w:val="FirstParagraph"/>
       </w:pPr>
       <w:r>
-        <w:t xml:space="preserve">We draw a stratified random sample of sentences (by dictionary hit-type, city tier, era) and have them independently coded as visible, functional, mixed, or irrelevant. A human gold standard of 120 sentences, independently double-coded by two coders (dictionary and model labels hidden), anchors the analysis (intercoder Cohen κ = 0.70, substantial; Online Appendix C.8). Against the human labels we report a full confusion matrix, per-class precision/recall, verbatim error exemplars, and an error taxonomy. The findings define a precision ladder (Table 1, Panel A):</w:t>
+        <w:t xml:space="preserve">We draw a stratified random sample of sentences (by dictionary hit-type, city tier, era) and have them independently coded as visible, functional, mixed, or irrelevant. A human gold standard of 120 sentences, independently double-coded by two coders (dictionary and model labels hidden), anchors the analysis (intercoder Cohen κ = 0.70, substantial; Online Appendix C.8). Against the human labels we report a full confusion matrix, per-class precision/recall, verbatim error exemplars, and an error taxonomy. The findings define a precision ladder (Figure 1):</w:t>
       </w:r>
     </w:p>
     <w:p>
@@ -3003,7 +3003,7 @@
           <w:b/>
           <w:bCs/>
         </w:rPr>
-        <w:t xml:space="preserve">Table 1, Panel B. Pre-registered construct-validity battery</w:t>
+        <w:t xml:space="preserve">Table 1. Pre-registered construct-validity battery</w:t>
       </w:r>
     </w:p>
     <w:tbl>
@@ -3425,7 +3425,7 @@
         <w:t xml:space="preserve">master_2002_2024.csv</w:t>
       </w:r>
       <w:r>
-        <w:t xml:space="preserve">) give (Table 1, Panel C):</w:t>
+        <w:t xml:space="preserve">) give (Table 2; the pattern is plotted in Figure 2):</w:t>
       </w:r>
     </w:p>
     <w:p>
@@ -3437,7 +3437,7 @@
           <w:b/>
           <w:bCs/>
         </w:rPr>
-        <w:t xml:space="preserve">Table 1, Panel C. Co-movement under secretary turnover (two-way FE; city-clustered)</w:t>
+        <w:t xml:space="preserve">Table 2. Co-movement under secretary turnover (two-way FE; city-clustered)</w:t>
       </w:r>
     </w:p>
     <w:tbl>
@@ -4195,7 +4195,7 @@
           <w:b/>
           <w:bCs/>
         </w:rPr>
-        <w:t xml:space="preserve">Table 2. P1 — Compositional substitution (CIR ~ VAI)</w:t>
+        <w:t xml:space="preserve">Table 3. P1 — Compositional substitution (CIR ~ VAI)</w:t>
       </w:r>
     </w:p>
     <w:tbl>
@@ -4699,7 +4699,7 @@
           <w:b/>
           <w:bCs/>
         </w:rPr>
-        <w:t xml:space="preserve">Table 3. Within-document retrospective-vs-prospective VAI differential</w:t>
+        <w:t xml:space="preserve">Table 4. Within-document retrospective-vs-prospective VAI differential</w:t>
       </w:r>
     </w:p>
     <w:tbl>

</xml_diff>